<commit_message>
docs: atualiza a monografia v1.15
</commit_message>
<xml_diff>
--- a/FAI-SI-PFC-II-FalaCidade-2026-v1.15.docx
+++ b/FAI-SI-PFC-II-FalaCidade-2026-v1.15.docx
@@ -3811,7 +3811,6 @@
         </w:rPr>
         <w:fldChar w:fldCharType="separate"/>
       </w:r>
-      <w:r/>
       <w:hyperlink w:tooltip="#_Toc1" w:anchor="_Toc1" w:history="1">
         <w:r>
           <w:rPr>
@@ -3859,6 +3858,7 @@
         </w:r>
       </w:hyperlink>
       <w:r/>
+      <w:r/>
     </w:p>
     <w:p>
       <w:pPr>
@@ -3871,6 +3871,7 @@
         <w:ind/>
         <w:rPr/>
       </w:pPr>
+      <w:r/>
       <w:hyperlink w:tooltip="#_Toc2" w:anchor="_Toc2" w:history="1">
         <w:r>
           <w:rPr>
@@ -3931,6 +3932,7 @@
         </w:r>
       </w:hyperlink>
       <w:r/>
+      <w:r/>
     </w:p>
     <w:p>
       <w:pPr>
@@ -3943,6 +3945,7 @@
         <w:ind/>
         <w:rPr/>
       </w:pPr>
+      <w:r/>
       <w:hyperlink w:tooltip="#_Toc3" w:anchor="_Toc3" w:history="1">
         <w:r>
           <w:rPr>
@@ -3984,6 +3987,7 @@
         </w:r>
       </w:hyperlink>
       <w:r/>
+      <w:r/>
     </w:p>
     <w:p>
       <w:pPr>
@@ -3996,6 +4000,7 @@
         <w:ind/>
         <w:rPr/>
       </w:pPr>
+      <w:r/>
       <w:hyperlink w:tooltip="#_Toc4" w:anchor="_Toc4" w:history="1">
         <w:r>
           <w:rPr>
@@ -4037,6 +4042,7 @@
         </w:r>
       </w:hyperlink>
       <w:r/>
+      <w:r/>
     </w:p>
     <w:p>
       <w:pPr>
@@ -4049,6 +4055,7 @@
         <w:ind/>
         <w:rPr/>
       </w:pPr>
+      <w:r/>
       <w:hyperlink w:tooltip="#_Toc5" w:anchor="_Toc5" w:history="1">
         <w:r>
           <w:rPr>
@@ -4090,6 +4097,7 @@
         </w:r>
       </w:hyperlink>
       <w:r/>
+      <w:r/>
     </w:p>
     <w:p>
       <w:pPr>
@@ -4102,6 +4110,7 @@
         <w:ind/>
         <w:rPr/>
       </w:pPr>
+      <w:r/>
       <w:hyperlink w:tooltip="#_Toc6" w:anchor="_Toc6" w:history="1">
         <w:r>
           <w:rPr>
@@ -4155,6 +4164,7 @@
         </w:r>
       </w:hyperlink>
       <w:r/>
+      <w:r/>
     </w:p>
     <w:p>
       <w:pPr>
@@ -4167,6 +4177,7 @@
         <w:ind/>
         <w:rPr/>
       </w:pPr>
+      <w:r/>
       <w:hyperlink w:tooltip="#_Toc7" w:anchor="_Toc7" w:history="1">
         <w:r>
           <w:rPr>
@@ -4220,6 +4231,7 @@
         </w:r>
       </w:hyperlink>
       <w:r/>
+      <w:r/>
     </w:p>
     <w:p>
       <w:pPr>
@@ -4232,6 +4244,7 @@
         <w:ind/>
         <w:rPr/>
       </w:pPr>
+      <w:r/>
       <w:hyperlink w:tooltip="#_Toc8" w:anchor="_Toc8" w:history="1">
         <w:r>
           <w:rPr>
@@ -4273,6 +4286,7 @@
         </w:r>
       </w:hyperlink>
       <w:r/>
+      <w:r/>
     </w:p>
     <w:p>
       <w:pPr>
@@ -4285,6 +4299,7 @@
         <w:ind/>
         <w:rPr/>
       </w:pPr>
+      <w:r/>
       <w:hyperlink w:tooltip="#_Toc9" w:anchor="_Toc9" w:history="1">
         <w:r>
           <w:rPr>
@@ -4326,6 +4341,7 @@
         </w:r>
       </w:hyperlink>
       <w:r/>
+      <w:r/>
     </w:p>
     <w:p>
       <w:pPr>
@@ -4338,6 +4354,7 @@
         <w:ind/>
         <w:rPr/>
       </w:pPr>
+      <w:r/>
       <w:hyperlink w:tooltip="#_Toc10" w:anchor="_Toc10" w:history="1">
         <w:r>
           <w:rPr>
@@ -4379,6 +4396,7 @@
         </w:r>
       </w:hyperlink>
       <w:r/>
+      <w:r/>
     </w:p>
     <w:p>
       <w:pPr>
@@ -4391,6 +4409,7 @@
         <w:ind/>
         <w:rPr/>
       </w:pPr>
+      <w:r/>
       <w:hyperlink w:tooltip="#_Toc11" w:anchor="_Toc11" w:history="1">
         <w:r>
           <w:rPr>
@@ -4432,6 +4451,7 @@
         </w:r>
       </w:hyperlink>
       <w:r/>
+      <w:r/>
     </w:p>
     <w:p>
       <w:pPr>
@@ -4444,6 +4464,7 @@
         <w:ind/>
         <w:rPr/>
       </w:pPr>
+      <w:r/>
       <w:hyperlink w:tooltip="#_Toc12" w:anchor="_Toc12" w:history="1">
         <w:r>
           <w:rPr>
@@ -4485,6 +4506,7 @@
         </w:r>
       </w:hyperlink>
       <w:r/>
+      <w:r/>
     </w:p>
     <w:p>
       <w:pPr>
@@ -4497,6 +4519,7 @@
         <w:ind/>
         <w:rPr/>
       </w:pPr>
+      <w:r/>
       <w:hyperlink w:tooltip="#_Toc13" w:anchor="_Toc13" w:history="1">
         <w:r>
           <w:rPr>
@@ -4538,6 +4561,7 @@
         </w:r>
       </w:hyperlink>
       <w:r/>
+      <w:r/>
     </w:p>
     <w:p>
       <w:pPr>
@@ -4550,6 +4574,7 @@
         <w:ind/>
         <w:rPr/>
       </w:pPr>
+      <w:r/>
       <w:hyperlink w:tooltip="#_Toc14" w:anchor="_Toc14" w:history="1">
         <w:r>
           <w:rPr>
@@ -4591,6 +4616,7 @@
         </w:r>
       </w:hyperlink>
       <w:r/>
+      <w:r/>
     </w:p>
     <w:p>
       <w:pPr>
@@ -4603,6 +4629,7 @@
         <w:ind/>
         <w:rPr/>
       </w:pPr>
+      <w:r/>
       <w:hyperlink w:tooltip="#_Toc15" w:anchor="_Toc15" w:history="1">
         <w:r>
           <w:rPr>
@@ -4644,6 +4671,7 @@
         </w:r>
       </w:hyperlink>
       <w:r/>
+      <w:r/>
     </w:p>
     <w:p>
       <w:pPr>
@@ -4661,7 +4689,6 @@
       <w:r>
         <w:fldChar w:fldCharType="end"/>
       </w:r>
-      <w:r/>
       <w:r/>
     </w:p>
     <w:p>
@@ -4712,7 +4739,6 @@
       <w:r>
         <w:fldChar w:fldCharType="separate"/>
       </w:r>
-      <w:r/>
       <w:hyperlink w:tooltip="#_Toc1" w:anchor="_Toc1" w:history="1">
         <w:r>
           <w:rPr>
@@ -4754,6 +4780,7 @@
         </w:r>
       </w:hyperlink>
       <w:r/>
+      <w:r/>
     </w:p>
     <w:p>
       <w:pPr>
@@ -4766,6 +4793,7 @@
         <w:ind/>
         <w:rPr/>
       </w:pPr>
+      <w:r/>
       <w:hyperlink w:tooltip="#_Toc2" w:anchor="_Toc2" w:history="1">
         <w:r>
           <w:rPr>
@@ -4807,6 +4835,7 @@
         </w:r>
       </w:hyperlink>
       <w:r/>
+      <w:r/>
     </w:p>
     <w:p>
       <w:pPr>
@@ -4819,6 +4848,7 @@
         <w:ind/>
         <w:rPr/>
       </w:pPr>
+      <w:r/>
       <w:hyperlink w:tooltip="#_Toc3" w:anchor="_Toc3" w:history="1">
         <w:r>
           <w:rPr>
@@ -4860,6 +4890,7 @@
         </w:r>
       </w:hyperlink>
       <w:r/>
+      <w:r/>
     </w:p>
     <w:p>
       <w:pPr>
@@ -4872,11 +4903,9 @@
         <w:ind/>
         <w:rPr/>
       </w:pPr>
-      <w:r/>
       <w:r>
         <w:fldChar w:fldCharType="end"/>
       </w:r>
-      <w:r/>
       <w:r/>
     </w:p>
     <w:p>
@@ -13011,10 +13040,11 @@
         <w:rPr/>
       </w:pPr>
       <w:r/>
+      <w:bookmarkStart w:id="1" w:name="_Toc1"/>
       <w:r>
         <w:t xml:space="preserve">1 INTRODUÇÃO</w:t>
       </w:r>
-      <w:r/>
+      <w:bookmarkEnd w:id="1"/>
       <w:r/>
       <w:r/>
     </w:p>
@@ -13219,10 +13249,11 @@
         <w:rPr/>
       </w:pPr>
       <w:r/>
+      <w:bookmarkStart w:id="2" w:name="_Toc2"/>
       <w:r>
         <w:t xml:space="preserve">2 REVISÃO BIBLIOGRÁFICA</w:t>
       </w:r>
-      <w:r/>
+      <w:bookmarkEnd w:id="2"/>
       <w:r/>
       <w:r/>
     </w:p>
@@ -13271,10 +13302,11 @@
         <w:rPr/>
       </w:pPr>
       <w:r/>
+      <w:bookmarkStart w:id="3" w:name="_Toc3"/>
       <w:r>
         <w:t xml:space="preserve">2.1 CIDADES INTELIGENTES E RESILIENTES </w:t>
       </w:r>
-      <w:r/>
+      <w:bookmarkEnd w:id="3"/>
       <w:r/>
       <w:r/>
     </w:p>
@@ -13393,10 +13425,11 @@
         <w:rPr/>
       </w:pPr>
       <w:r/>
+      <w:bookmarkStart w:id="4" w:name="_Toc4"/>
       <w:r>
         <w:t xml:space="preserve">2.1.1 Fundamentos de Cidade Resiliente</w:t>
       </w:r>
-      <w:r/>
+      <w:bookmarkEnd w:id="4"/>
       <w:r/>
       <w:r/>
     </w:p>
@@ -13486,10 +13519,11 @@
         <w:rPr/>
       </w:pPr>
       <w:r/>
+      <w:bookmarkStart w:id="5" w:name="_Toc5"/>
       <w:r>
         <w:t xml:space="preserve">2.1.2 Zeladoria Pública e Gestão de Serviços</w:t>
       </w:r>
-      <w:r/>
+      <w:bookmarkEnd w:id="5"/>
       <w:r/>
       <w:r/>
     </w:p>
@@ -13546,10 +13580,11 @@
         <w:rPr/>
       </w:pPr>
       <w:r/>
+      <w:bookmarkStart w:id="6" w:name="_Toc6"/>
       <w:r>
         <w:t xml:space="preserve">2.1.3 Participação Cidadã por meio de Sistemas de Informação Automatizados</w:t>
       </w:r>
-      <w:r/>
+      <w:bookmarkEnd w:id="6"/>
       <w:r/>
       <w:r/>
     </w:p>
@@ -13737,13 +13772,14 @@
         <w:rPr/>
       </w:pPr>
       <w:r/>
+      <w:bookmarkStart w:id="7" w:name="_Toc7"/>
       <w:r>
         <w:rPr>
           <w:caps w:val="0"/>
         </w:rPr>
         <w:t xml:space="preserve">2.2 TRABALHOS RELACIONADOS</w:t>
       </w:r>
-      <w:r/>
+      <w:bookmarkEnd w:id="7"/>
       <w:r/>
       <w:r/>
     </w:p>
@@ -13928,7 +13964,6 @@
         <w:rPr/>
       </w:pPr>
       <w:r/>
-      <w:bookmarkStart w:id="1" w:name="_Toc1"/>
       <w:r>
         <w:t xml:space="preserve">FIGURA </w:t>
       </w:r>
@@ -13953,8 +13988,6 @@
       <w:r>
         <w:t xml:space="preserve">Colab</w:t>
       </w:r>
-      <w:r/>
-      <w:bookmarkEnd w:id="1"/>
       <w:r/>
       <w:r/>
     </w:p>
@@ -14091,7 +14124,6 @@
         <w:rPr/>
       </w:pPr>
       <w:r/>
-      <w:bookmarkStart w:id="2" w:name="_Toc2"/>
       <w:r>
         <w:t xml:space="preserve">FIGURA </w:t>
       </w:r>
@@ -14125,8 +14157,6 @@
       <w:r>
         <w:t xml:space="preserve">Colab</w:t>
       </w:r>
-      <w:r/>
-      <w:bookmarkEnd w:id="2"/>
       <w:r/>
       <w:r/>
     </w:p>
@@ -14349,7 +14379,6 @@
         <w:rPr/>
       </w:pPr>
       <w:r/>
-      <w:bookmarkStart w:id="3" w:name="_Toc3"/>
       <w:r>
         <w:t xml:space="preserve">FIGURA </w:t>
       </w:r>
@@ -14371,8 +14400,6 @@
       <w:r>
         <w:t xml:space="preserve"> - Seleção da unidade da federação na plataforma e-Ouve </w:t>
       </w:r>
-      <w:r/>
-      <w:bookmarkEnd w:id="3"/>
       <w:r/>
       <w:r/>
     </w:p>
@@ -14507,7 +14534,6 @@
         <w:rPr/>
       </w:pPr>
       <w:r/>
-      <w:bookmarkStart w:id="4" w:name="_Toc4"/>
       <w:r>
         <w:t xml:space="preserve">FIGURA </w:t>
       </w:r>
@@ -14529,8 +14555,6 @@
       <w:r>
         <w:t xml:space="preserve"> - Seleção de serviços na plataforma e-Ouve</w:t>
       </w:r>
-      <w:r/>
-      <w:bookmarkEnd w:id="4"/>
       <w:r/>
       <w:r/>
     </w:p>
@@ -14643,10 +14667,11 @@
         <w:rPr/>
       </w:pPr>
       <w:r/>
+      <w:bookmarkStart w:id="8" w:name="_Toc8"/>
       <w:r>
         <w:t xml:space="preserve">3 OBJETIVO DO PROJETO</w:t>
       </w:r>
-      <w:r/>
+      <w:bookmarkEnd w:id="8"/>
       <w:r/>
       <w:r/>
     </w:p>
@@ -14681,10 +14706,11 @@
         <w:rPr/>
       </w:pPr>
       <w:r/>
+      <w:bookmarkStart w:id="9" w:name="_Toc9"/>
       <w:r>
         <w:t xml:space="preserve">3.1 FORMULAÇÃO DO PROBLEMA</w:t>
       </w:r>
-      <w:r/>
+      <w:bookmarkEnd w:id="9"/>
       <w:r/>
       <w:r/>
     </w:p>
@@ -14771,10 +14797,11 @@
         <w:rPr/>
       </w:pPr>
       <w:r/>
+      <w:bookmarkStart w:id="10" w:name="_Toc10"/>
       <w:r>
         <w:t xml:space="preserve">3.2 OBJETIVOS </w:t>
       </w:r>
-      <w:r/>
+      <w:bookmarkEnd w:id="10"/>
       <w:r/>
       <w:r/>
     </w:p>
@@ -14910,10 +14937,11 @@
         <w:rPr/>
       </w:pPr>
       <w:r/>
+      <w:bookmarkStart w:id="11" w:name="_Toc11"/>
       <w:r>
         <w:t xml:space="preserve">3.3 JUSTIFICATIVA </w:t>
       </w:r>
-      <w:r/>
+      <w:bookmarkEnd w:id="11"/>
       <w:r/>
       <w:r/>
     </w:p>
@@ -14976,10 +15004,11 @@
         <w:rPr/>
       </w:pPr>
       <w:r/>
+      <w:bookmarkStart w:id="12" w:name="_Toc12"/>
       <w:r>
         <w:t xml:space="preserve">3.4 NÍVEIS DE DECISÃO E GRUPOS FUNCIONAIS ATENDIDOS</w:t>
       </w:r>
-      <w:r/>
+      <w:bookmarkEnd w:id="12"/>
       <w:r/>
       <w:r/>
     </w:p>
@@ -15049,10 +15078,11 @@
         <w:rPr/>
       </w:pPr>
       <w:r/>
+      <w:bookmarkStart w:id="13" w:name="_Toc13"/>
       <w:r>
         <w:t xml:space="preserve">3.5 ADERÊNCIA AOS OBJETIVOS DO DESENVOLVIMENTO SUSTENTÁVEL (ODS)</w:t>
       </w:r>
-      <w:r/>
+      <w:bookmarkEnd w:id="13"/>
       <w:r/>
       <w:r/>
     </w:p>
@@ -15237,10 +15267,11 @@
         <w:rPr/>
       </w:pPr>
       <w:r/>
+      <w:bookmarkStart w:id="14" w:name="_Toc14"/>
       <w:r>
         <w:t xml:space="preserve">3.6 MODELO DE NEGÓCIO PROPOSTO</w:t>
       </w:r>
-      <w:r/>
+      <w:bookmarkEnd w:id="14"/>
       <w:r/>
       <w:r/>
     </w:p>
@@ -15450,10 +15481,11 @@
         <w:rPr/>
       </w:pPr>
       <w:r/>
+      <w:bookmarkStart w:id="15" w:name="_Toc15"/>
       <w:r>
         <w:t xml:space="preserve">4 MÉTODOS GERENCIAIS</w:t>
       </w:r>
-      <w:r/>
+      <w:bookmarkEnd w:id="15"/>
       <w:r/>
       <w:r/>
     </w:p>
@@ -15488,10 +15520,11 @@
         <w:rPr/>
       </w:pPr>
       <w:r/>
+      <w:bookmarkStart w:id="16" w:name="_Toc16"/>
       <w:r>
         <w:t xml:space="preserve">4.1 GERENCIAMENTO DO PROJETO</w:t>
       </w:r>
-      <w:r/>
+      <w:bookmarkEnd w:id="16"/>
       <w:r/>
       <w:r/>
     </w:p>
@@ -16000,10 +16033,11 @@
         <w:rPr/>
       </w:pPr>
       <w:r/>
+      <w:bookmarkStart w:id="17" w:name="_Toc17"/>
       <w:r>
         <w:t xml:space="preserve">4.2 MODELO DE CICLO DE VIDA </w:t>
       </w:r>
-      <w:r/>
+      <w:bookmarkEnd w:id="17"/>
       <w:r/>
       <w:r/>
     </w:p>
@@ -16113,10 +16147,11 @@
         <w:rPr/>
       </w:pPr>
       <w:r/>
+      <w:bookmarkStart w:id="18" w:name="_Toc18"/>
       <w:r>
         <w:t xml:space="preserve">4.3 RECURSOS NECESSÁRIOS</w:t>
       </w:r>
-      <w:r/>
+      <w:bookmarkEnd w:id="18"/>
       <w:r/>
       <w:r/>
     </w:p>
@@ -16146,10 +16181,11 @@
         <w:rPr/>
       </w:pPr>
       <w:r/>
+      <w:bookmarkStart w:id="19" w:name="_Toc19"/>
       <w:r>
         <w:t xml:space="preserve">4.3.1 Recursos Humanos</w:t>
       </w:r>
-      <w:r/>
+      <w:bookmarkEnd w:id="19"/>
       <w:r/>
       <w:r/>
     </w:p>
@@ -16443,10 +16479,11 @@
         <w:rPr/>
       </w:pPr>
       <w:r/>
+      <w:bookmarkStart w:id="20" w:name="_Toc20"/>
       <w:r>
         <w:t xml:space="preserve">4.3.2 Recursos de Hardware</w:t>
       </w:r>
-      <w:r/>
+      <w:bookmarkEnd w:id="20"/>
       <w:r/>
       <w:r/>
     </w:p>
@@ -16553,10 +16590,11 @@
         <w:rPr/>
       </w:pPr>
       <w:r/>
+      <w:bookmarkStart w:id="21" w:name="_Toc21"/>
       <w:r>
         <w:t xml:space="preserve">4.3.3 Recursos de Software</w:t>
       </w:r>
-      <w:r/>
+      <w:bookmarkEnd w:id="21"/>
       <w:r/>
       <w:r/>
     </w:p>
@@ -16871,10 +16909,11 @@
         <w:rPr/>
       </w:pPr>
       <w:r/>
+      <w:bookmarkStart w:id="22" w:name="_Toc22"/>
       <w:r>
         <w:t xml:space="preserve">4.3.4 Outros Recursos</w:t>
       </w:r>
-      <w:r/>
+      <w:bookmarkEnd w:id="22"/>
       <w:r/>
       <w:r/>
     </w:p>
@@ -16943,10 +16982,11 @@
         <w:rPr/>
       </w:pPr>
       <w:r/>
+      <w:bookmarkStart w:id="23" w:name="_Toc23"/>
       <w:r>
         <w:t xml:space="preserve">4.4 RELATÓRIO DE DESEMPENHO </w:t>
       </w:r>
-      <w:r/>
+      <w:bookmarkEnd w:id="23"/>
       <w:r/>
       <w:r/>
     </w:p>
@@ -17278,10 +17318,11 @@
         <w:rPr/>
       </w:pPr>
       <w:r/>
+      <w:bookmarkStart w:id="24" w:name="_Toc24"/>
       <w:r>
         <w:t xml:space="preserve">4.5 GERENCIAMENTO DE CONFIGURAÇÃO</w:t>
       </w:r>
-      <w:r/>
+      <w:bookmarkEnd w:id="24"/>
       <w:r/>
       <w:r/>
     </w:p>
@@ -17317,13 +17358,14 @@
         <w:rPr/>
       </w:pPr>
       <w:r/>
+      <w:bookmarkStart w:id="25" w:name="_Toc25"/>
       <w:r>
         <w:t xml:space="preserve">4.5.1 Papéis e Responsabilidades</w:t>
       </w:r>
       <w:r>
         <w:tab/>
       </w:r>
-      <w:r/>
+      <w:bookmarkEnd w:id="25"/>
       <w:r/>
       <w:r/>
     </w:p>
@@ -17490,10 +17532,11 @@
         <w:rPr/>
       </w:pPr>
       <w:r/>
+      <w:bookmarkStart w:id="26" w:name="_Toc26"/>
       <w:r>
         <w:t xml:space="preserve">4.5.2 Identificação e Versionamento de Artefatos</w:t>
       </w:r>
-      <w:r/>
+      <w:bookmarkEnd w:id="26"/>
       <w:r/>
       <w:r/>
     </w:p>
@@ -17573,10 +17616,11 @@
         <w:rPr/>
       </w:pPr>
       <w:r/>
+      <w:bookmarkStart w:id="27" w:name="_Toc27"/>
       <w:r>
         <w:t xml:space="preserve">4.5.3 Organização do Repositório e Ferramentas</w:t>
       </w:r>
-      <w:r/>
+      <w:bookmarkEnd w:id="27"/>
       <w:r/>
       <w:r/>
     </w:p>
@@ -17832,7 +17876,6 @@
         <w:rPr/>
       </w:pPr>
       <w:r/>
-      <w:bookmarkStart w:id="5" w:name="_Toc5"/>
       <w:r>
         <w:t xml:space="preserve">FIGURA </w:t>
       </w:r>
@@ -17855,8 +17898,6 @@
         <w:t xml:space="preserve"> - Estrutura do repositório remoto no GitHub</w:t>
       </w:r>
       <w:r/>
-      <w:bookmarkEnd w:id="5"/>
-      <w:r/>
       <w:r/>
     </w:p>
     <w:p>
@@ -17881,10 +17922,11 @@
         <w:rPr/>
       </w:pPr>
       <w:r/>
+      <w:bookmarkStart w:id="28" w:name="_Toc28"/>
       <w:r>
         <w:t xml:space="preserve">5 ESPECIFICAÇÃO E ANÁLISE DOS REQUISITOS</w:t>
       </w:r>
-      <w:r/>
+      <w:bookmarkEnd w:id="28"/>
       <w:r/>
       <w:r/>
     </w:p>
@@ -17922,10 +17964,11 @@
         <w:rPr/>
       </w:pPr>
       <w:r/>
+      <w:bookmarkStart w:id="29" w:name="_Toc29"/>
       <w:r>
         <w:t xml:space="preserve">5.1 REQUISITOS DO SISTEMA DE SOFTWARE</w:t>
       </w:r>
-      <w:r/>
+      <w:bookmarkEnd w:id="29"/>
       <w:r/>
       <w:r/>
     </w:p>
@@ -17963,10 +18006,11 @@
         <w:rPr/>
       </w:pPr>
       <w:r/>
+      <w:bookmarkStart w:id="30" w:name="_Toc30"/>
       <w:r>
         <w:t xml:space="preserve">5.1.1 Requisitos Funcionais</w:t>
       </w:r>
-      <w:r/>
+      <w:bookmarkEnd w:id="30"/>
       <w:r/>
       <w:r/>
     </w:p>
@@ -18899,6 +18943,14 @@
           <w:szCs w:val="24"/>
         </w:rPr>
       </w:r>
+      <w:r>
+        <w:rPr>
+          <w:b/>
+          <w:bCs/>
+          <w:color w:val="000000"/>
+          <w:szCs w:val="24"/>
+        </w:rPr>
+      </w:r>
     </w:p>
     <w:p>
       <w:pPr>
@@ -18931,94 +18983,102 @@
           <w:szCs w:val="24"/>
         </w:rPr>
       </w:r>
-    </w:p>
-    <w:p>
-      <w:pPr>
-        <w:pBdr/>
-        <w:spacing/>
-        <w:ind/>
-        <w:rPr>
-          <w:color w:val="000000"/>
-        </w:rPr>
-      </w:pPr>
-      <w:r>
-        <w:rPr>
-          <w:color w:val="000000"/>
-        </w:rPr>
-        <w:t xml:space="preserve">Prioridade</w:t>
-      </w:r>
-      <w:r>
-        <w:rPr>
-          <w:b/>
-          <w:color w:val="000000"/>
-        </w:rPr>
-        <w:t xml:space="preserve">:</w:t>
-      </w:r>
-      <w:r>
-        <w:rPr>
-          <w:color w:val="000000"/>
-        </w:rPr>
-        <w:t xml:space="preserve"> essencial. </w:t>
-      </w:r>
-      <w:r>
-        <w:rPr>
-          <w:color w:val="000000"/>
-        </w:rPr>
-      </w:r>
-      <w:r>
-        <w:rPr>
-          <w:color w:val="000000"/>
-        </w:rPr>
-      </w:r>
-    </w:p>
-    <w:p>
-      <w:pPr>
-        <w:pBdr/>
-        <w:spacing/>
-        <w:ind/>
-        <w:rPr>
-          <w:color w:val="000000"/>
-          <w:szCs w:val="24"/>
-        </w:rPr>
-      </w:pPr>
-      <w:r>
-        <w:rPr>
-          <w:color w:val="000000"/>
-        </w:rPr>
-        <w:t xml:space="preserve">RF15 – </w:t>
-      </w:r>
-      <w:r>
-        <w:t xml:space="preserve">Gerenciamento de usuários</w:t>
-      </w:r>
-      <w:r>
-        <w:rPr>
-          <w:color w:val="000000"/>
-          <w:szCs w:val="24"/>
-        </w:rPr>
-      </w:r>
-      <w:r>
-        <w:rPr>
-          <w:color w:val="000000"/>
-          <w:szCs w:val="24"/>
-        </w:rPr>
-      </w:r>
-    </w:p>
-    <w:p>
-      <w:pPr>
-        <w:pBdr/>
-        <w:spacing/>
-        <w:ind/>
+      <w:r>
         <w:rPr>
           <w:b/>
           <w:bCs/>
           <w:color w:val="000000"/>
           <w:szCs w:val="24"/>
         </w:rPr>
-      </w:pPr>
-      <w:r>
+      </w:r>
+    </w:p>
+    <w:p>
+      <w:pPr>
+        <w:pBdr/>
+        <w:spacing/>
+        <w:ind/>
         <w:rPr>
           <w:color w:val="000000"/>
         </w:rPr>
+      </w:pPr>
+      <w:r>
+        <w:rPr>
+          <w:color w:val="000000"/>
+        </w:rPr>
+        <w:t xml:space="preserve">Prioridade</w:t>
+      </w:r>
+      <w:r>
+        <w:rPr>
+          <w:b/>
+          <w:color w:val="000000"/>
+        </w:rPr>
+        <w:t xml:space="preserve">:</w:t>
+      </w:r>
+      <w:r>
+        <w:rPr>
+          <w:color w:val="000000"/>
+        </w:rPr>
+        <w:t xml:space="preserve"> essencial. </w:t>
+      </w:r>
+      <w:r>
+        <w:rPr>
+          <w:color w:val="000000"/>
+        </w:rPr>
+      </w:r>
+      <w:r>
+        <w:rPr>
+          <w:color w:val="000000"/>
+        </w:rPr>
+      </w:r>
+    </w:p>
+    <w:p>
+      <w:pPr>
+        <w:pBdr/>
+        <w:spacing/>
+        <w:ind/>
+        <w:rPr>
+          <w:color w:val="000000"/>
+          <w:szCs w:val="24"/>
+        </w:rPr>
+      </w:pPr>
+      <w:r>
+        <w:rPr>
+          <w:color w:val="000000"/>
+        </w:rPr>
+        <w:t xml:space="preserve">RF15 – </w:t>
+      </w:r>
+      <w:r>
+        <w:t xml:space="preserve">Gerenciamento de usuários</w:t>
+      </w:r>
+      <w:r>
+        <w:rPr>
+          <w:color w:val="000000"/>
+          <w:szCs w:val="24"/>
+        </w:rPr>
+      </w:r>
+      <w:r>
+        <w:rPr>
+          <w:color w:val="000000"/>
+          <w:szCs w:val="24"/>
+        </w:rPr>
+      </w:r>
+    </w:p>
+    <w:p>
+      <w:pPr>
+        <w:pBdr/>
+        <w:spacing/>
+        <w:ind/>
+        <w:rPr>
+          <w:b/>
+          <w:bCs/>
+          <w:color w:val="000000"/>
+          <w:szCs w:val="24"/>
+        </w:rPr>
+      </w:pPr>
+      <w:r>
+        <w:rPr>
+          <w:color w:val="000000"/>
+        </w:rPr>
         <w:t xml:space="preserve">Descrição: o sistema deverá permitir qu</w:t>
       </w:r>
       <w:r>
@@ -19032,6 +19092,14 @@
           <w:color w:val="000000"/>
         </w:rPr>
         <w:t xml:space="preserve"> A partir da versão 1.15, a manutenção observa o alcance de cada perfil: o Super Administrador administra todas as contas do sistema, e o administrador municipal, exclusivamente as contas vinculadas ao seu município, nunca as de Super Administrador (RN10).</w:t>
+      </w:r>
+      <w:r>
+        <w:rPr>
+          <w:b/>
+          <w:bCs/>
+          <w:color w:val="000000"/>
+          <w:szCs w:val="24"/>
+        </w:rPr>
       </w:r>
       <w:r>
         <w:rPr>
@@ -19665,13 +19733,14 @@
         <w:rPr/>
       </w:pPr>
       <w:r/>
+      <w:bookmarkStart w:id="31" w:name="_Toc31"/>
       <w:r>
         <w:t xml:space="preserve">5.1.2 Requisitos </w:t>
       </w:r>
       <w:r>
         <w:t xml:space="preserve">não Funcionais</w:t>
       </w:r>
-      <w:r/>
+      <w:bookmarkEnd w:id="31"/>
       <w:r/>
       <w:r/>
     </w:p>
@@ -21034,10 +21103,11 @@
         <w:rPr/>
       </w:pPr>
       <w:r/>
+      <w:bookmarkStart w:id="32" w:name="_Toc32"/>
       <w:r>
         <w:t xml:space="preserve">5.1.3 Principais Regras de Negócio</w:t>
       </w:r>
-      <w:r/>
+      <w:bookmarkEnd w:id="32"/>
       <w:r/>
       <w:r/>
     </w:p>
@@ -21326,15 +21396,20 @@
           <w:color w:val="000000"/>
         </w:rPr>
       </w:r>
-    </w:p>
-    <w:p>
-      <w:pPr>
-        <w:pBdr/>
-        <w:spacing/>
-        <w:ind/>
+      <w:r>
         <w:rPr>
           <w:color w:val="000000"/>
         </w:rPr>
+      </w:r>
+    </w:p>
+    <w:p>
+      <w:pPr>
+        <w:pBdr/>
+        <w:spacing/>
+        <w:ind/>
+        <w:rPr>
+          <w:color w:val="000000"/>
+        </w:rPr>
       </w:pPr>
       <w:r>
         <w:t xml:space="preserve">O tratamento de uma ocorrência é privativo dos funcionários lotados no município do endereço da ocorrência: a alteração de estado, o encaminhamento a departamento e a conclusão são</w:t>
@@ -21350,15 +21425,20 @@
           <w:color w:val="000000"/>
         </w:rPr>
       </w:r>
-    </w:p>
-    <w:p>
-      <w:pPr>
-        <w:pBdr/>
-        <w:spacing/>
-        <w:ind/>
+      <w:r>
         <w:rPr>
           <w:color w:val="000000"/>
         </w:rPr>
+      </w:r>
+    </w:p>
+    <w:p>
+      <w:pPr>
+        <w:pBdr/>
+        <w:spacing/>
+        <w:ind/>
+        <w:rPr>
+          <w:color w:val="000000"/>
+        </w:rPr>
       </w:pPr>
       <w:r>
         <w:t xml:space="preserve">Relacionado aos requisitos: RF12, RF14, RF23 e RF24.</w:t>
@@ -21368,15 +21448,20 @@
           <w:color w:val="000000"/>
         </w:rPr>
       </w:r>
-    </w:p>
-    <w:p>
-      <w:pPr>
-        <w:pBdr/>
-        <w:spacing/>
-        <w:ind/>
+      <w:r>
         <w:rPr>
           <w:color w:val="000000"/>
         </w:rPr>
+      </w:r>
+    </w:p>
+    <w:p>
+      <w:pPr>
+        <w:pBdr/>
+        <w:spacing/>
+        <w:ind/>
+        <w:rPr>
+          <w:color w:val="000000"/>
+        </w:rPr>
       </w:pPr>
       <w:r>
         <w:t xml:space="preserve">RN08 – Unicidade dos departamentos</w:t>
@@ -21386,15 +21471,20 @@
           <w:color w:val="000000"/>
         </w:rPr>
       </w:r>
-    </w:p>
-    <w:p>
-      <w:pPr>
-        <w:pBdr/>
-        <w:spacing/>
-        <w:ind/>
+      <w:r>
         <w:rPr>
           <w:color w:val="000000"/>
         </w:rPr>
+      </w:r>
+    </w:p>
+    <w:p>
+      <w:pPr>
+        <w:pBdr/>
+        <w:spacing/>
+        <w:ind/>
+        <w:rPr>
+          <w:color w:val="000000"/>
+        </w:rPr>
       </w:pPr>
       <w:r>
         <w:t xml:space="preserve">O nome do departamento é único no âmbito de cada município, admitida a repetição do mesmo nome em municípios distintos, uma vez que</w:t>
@@ -21407,15 +21497,20 @@
           <w:color w:val="000000"/>
         </w:rPr>
       </w:r>
-    </w:p>
-    <w:p>
-      <w:pPr>
-        <w:pBdr/>
-        <w:spacing/>
-        <w:ind/>
+      <w:r>
         <w:rPr>
           <w:color w:val="000000"/>
         </w:rPr>
+      </w:r>
+    </w:p>
+    <w:p>
+      <w:pPr>
+        <w:pBdr/>
+        <w:spacing/>
+        <w:ind/>
+        <w:rPr>
+          <w:color w:val="000000"/>
+        </w:rPr>
       </w:pPr>
       <w:r>
         <w:t xml:space="preserve">Relacionado ao requisito: RF22.</w:t>
@@ -21425,15 +21520,20 @@
           <w:color w:val="000000"/>
         </w:rPr>
       </w:r>
-    </w:p>
-    <w:p>
-      <w:pPr>
-        <w:pBdr/>
-        <w:spacing/>
-        <w:ind/>
+      <w:r>
         <w:rPr>
           <w:color w:val="000000"/>
         </w:rPr>
+      </w:r>
+    </w:p>
+    <w:p>
+      <w:pPr>
+        <w:pBdr/>
+        <w:spacing/>
+        <w:ind/>
+        <w:rPr>
+          <w:color w:val="000000"/>
+        </w:rPr>
       </w:pPr>
       <w:r>
         <w:t xml:space="preserve">RN09 – Supressão de dados pessoais no encaminhamento</w:t>
@@ -21443,15 +21543,20 @@
           <w:color w:val="000000"/>
         </w:rPr>
       </w:r>
-    </w:p>
-    <w:p>
-      <w:pPr>
-        <w:pBdr/>
-        <w:spacing/>
-        <w:ind/>
+      <w:r>
         <w:rPr>
           <w:color w:val="000000"/>
         </w:rPr>
+      </w:r>
+    </w:p>
+    <w:p>
+      <w:pPr>
+        <w:pBdr/>
+        <w:spacing/>
+        <w:ind/>
+        <w:rPr>
+          <w:color w:val="000000"/>
+        </w:rPr>
       </w:pPr>
       <w:r>
         <w:t xml:space="preserve">A mensagem expedida ao departamento não conterá o nome, o endereço de correio eletrônico, o telefone ou qualquer outro dado que identifique o autor da ocorrência, ainda que a ocorrência seja identificada. A alteração do estado para “Em Andamento” e o regis</w:t>
@@ -21464,15 +21569,20 @@
           <w:color w:val="000000"/>
         </w:rPr>
       </w:r>
-    </w:p>
-    <w:p>
-      <w:pPr>
-        <w:pBdr/>
-        <w:spacing/>
-        <w:ind/>
+      <w:r>
         <w:rPr>
           <w:color w:val="000000"/>
         </w:rPr>
+      </w:r>
+    </w:p>
+    <w:p>
+      <w:pPr>
+        <w:pBdr/>
+        <w:spacing/>
+        <w:ind/>
+        <w:rPr>
+          <w:color w:val="000000"/>
+        </w:rPr>
       </w:pPr>
       <w:r>
         <w:t xml:space="preserve">Relacionado aos requisitos: RF23, RN03 e RN05.</w:t>
@@ -21482,15 +21592,20 @@
           <w:color w:val="000000"/>
         </w:rPr>
       </w:r>
-    </w:p>
-    <w:p>
-      <w:pPr>
-        <w:pBdr/>
-        <w:spacing/>
-        <w:ind/>
+      <w:r>
         <w:rPr>
           <w:color w:val="000000"/>
         </w:rPr>
+      </w:r>
+    </w:p>
+    <w:p>
+      <w:pPr>
+        <w:pBdr/>
+        <w:spacing/>
+        <w:ind/>
+        <w:rPr>
+          <w:color w:val="000000"/>
+        </w:rPr>
       </w:pPr>
       <w:r>
         <w:t xml:space="preserve">RN10 – Alcance da administração de contas</w:t>
@@ -21500,15 +21615,20 @@
           <w:color w:val="000000"/>
         </w:rPr>
       </w:r>
-    </w:p>
-    <w:p>
-      <w:pPr>
-        <w:pBdr/>
-        <w:spacing/>
-        <w:ind/>
+      <w:r>
         <w:rPr>
           <w:color w:val="000000"/>
         </w:rPr>
+      </w:r>
+    </w:p>
+    <w:p>
+      <w:pPr>
+        <w:pBdr/>
+        <w:spacing/>
+        <w:ind/>
+        <w:rPr>
+          <w:color w:val="000000"/>
+        </w:rPr>
       </w:pPr>
       <w:r>
         <w:t xml:space="preserve">A criação de contas de administrador e de Super Administrador é privativa do Super Administrador, a quem compete indicar o município de cada administrador. O administrador municipal cria, consulta, al</w:t>
@@ -21521,15 +21641,20 @@
           <w:color w:val="000000"/>
         </w:rPr>
       </w:r>
-    </w:p>
-    <w:p>
-      <w:pPr>
-        <w:pBdr/>
-        <w:spacing/>
-        <w:ind/>
+      <w:r>
         <w:rPr>
           <w:color w:val="000000"/>
         </w:rPr>
+      </w:r>
+    </w:p>
+    <w:p>
+      <w:pPr>
+        <w:pBdr/>
+        <w:spacing/>
+        <w:ind/>
+        <w:rPr>
+          <w:color w:val="000000"/>
+        </w:rPr>
       </w:pPr>
       <w:r>
         <w:t xml:space="preserve">Relacionado aos requisitos: RF14, RF15, RF19 e RF25.</w:t>
@@ -21539,6 +21664,11 @@
           <w:color w:val="000000"/>
         </w:rPr>
       </w:r>
+      <w:r>
+        <w:rPr>
+          <w:color w:val="000000"/>
+        </w:rPr>
+      </w:r>
     </w:p>
     <w:p>
       <w:pPr>
@@ -21559,10 +21689,11 @@
         <w:rPr/>
       </w:pPr>
       <w:r/>
+      <w:bookmarkStart w:id="33" w:name="_Toc33"/>
       <w:r>
         <w:t xml:space="preserve">5.2 ANÁLISE DOS REQUISITOS</w:t>
       </w:r>
-      <w:r/>
+      <w:bookmarkEnd w:id="33"/>
       <w:r/>
       <w:r/>
     </w:p>
@@ -21577,10 +21708,16 @@
         </w:rPr>
       </w:pPr>
       <w:r/>
+      <w:bookmarkStart w:id="34" w:name="_Toc34"/>
       <w:r>
         <w:t xml:space="preserve">5.2.1 Visão Funcional</w:t>
       </w:r>
-      <w:r/>
+      <w:r>
+        <w:rPr>
+          <w:color w:val="00b050"/>
+        </w:rPr>
+      </w:r>
+      <w:bookmarkEnd w:id="34"/>
       <w:r/>
       <w:r>
         <w:rPr>
@@ -21646,10 +21783,11 @@
         <w:rPr/>
       </w:pPr>
       <w:r/>
+      <w:bookmarkStart w:id="35" w:name="_Toc35"/>
       <w:r>
         <w:t xml:space="preserve">5.2.2 Modelo Conceitual dos Dados</w:t>
       </w:r>
-      <w:r/>
+      <w:bookmarkEnd w:id="35"/>
       <w:r/>
       <w:r/>
     </w:p>
@@ -21916,6 +22054,11 @@
           <w:color w:val="000000"/>
         </w:rPr>
       </w:r>
+      <w:r>
+        <w:rPr>
+          <w:color w:val="000000"/>
+        </w:rPr>
+      </w:r>
     </w:p>
     <w:p>
       <w:pPr>
@@ -22011,10 +22154,11 @@
         <w:rPr/>
       </w:pPr>
       <w:r/>
+      <w:bookmarkStart w:id="36" w:name="_Toc36"/>
       <w:r>
         <w:t xml:space="preserve">5.2.3 Modelo Inicial da Interface de Usuário</w:t>
       </w:r>
-      <w:r/>
+      <w:bookmarkEnd w:id="36"/>
       <w:r/>
       <w:r/>
     </w:p>
@@ -22201,10 +22345,11 @@
         <w:rPr/>
       </w:pPr>
       <w:r/>
+      <w:bookmarkStart w:id="37" w:name="_Toc37"/>
       <w:r>
         <w:t xml:space="preserve">6 ARQUITETURA E PROJETO DO SISTEMA DE SOFTWARE</w:t>
       </w:r>
-      <w:r/>
+      <w:bookmarkEnd w:id="37"/>
       <w:r/>
       <w:r/>
     </w:p>
@@ -22267,10 +22412,11 @@
         <w:rPr/>
       </w:pPr>
       <w:r/>
+      <w:bookmarkStart w:id="38" w:name="_Toc38"/>
       <w:r>
         <w:t xml:space="preserve">6.1 VISÃO ESTRUTURAL</w:t>
       </w:r>
-      <w:r/>
+      <w:bookmarkEnd w:id="38"/>
       <w:r/>
       <w:r/>
     </w:p>
@@ -22330,10 +22476,11 @@
         <w:rPr/>
       </w:pPr>
       <w:r/>
+      <w:bookmarkStart w:id="39" w:name="_Toc39"/>
       <w:r>
         <w:t xml:space="preserve">6.1.1 Diagrama de Pacotes</w:t>
       </w:r>
-      <w:r/>
+      <w:bookmarkEnd w:id="39"/>
       <w:r/>
       <w:r/>
     </w:p>
@@ -22579,6 +22726,11 @@
           <w:color w:val="000000"/>
         </w:rPr>
       </w:r>
+      <w:r>
+        <w:rPr>
+          <w:color w:val="000000"/>
+        </w:rPr>
+      </w:r>
     </w:p>
     <w:p>
       <w:pPr>
@@ -22589,10 +22741,11 @@
         <w:rPr/>
       </w:pPr>
       <w:r/>
+      <w:bookmarkStart w:id="40" w:name="_Toc40"/>
       <w:r>
         <w:t xml:space="preserve">6.1.2 Diagramas de Classes</w:t>
       </w:r>
-      <w:r/>
+      <w:bookmarkEnd w:id="40"/>
       <w:r/>
       <w:r/>
     </w:p>
@@ -22633,6 +22786,11 @@
           <w:color w:val="000000"/>
         </w:rPr>
       </w:r>
+      <w:r>
+        <w:rPr>
+          <w:color w:val="000000"/>
+        </w:rPr>
+      </w:r>
     </w:p>
     <w:p>
       <w:pPr>
@@ -22665,6 +22823,11 @@
           <w:color w:val="000000"/>
         </w:rPr>
       </w:r>
+      <w:r>
+        <w:rPr>
+          <w:color w:val="000000"/>
+        </w:rPr>
+      </w:r>
     </w:p>
     <w:p>
       <w:pPr>
@@ -22675,10 +22838,11 @@
         <w:rPr/>
       </w:pPr>
       <w:r/>
+      <w:bookmarkStart w:id="41" w:name="_Toc41"/>
       <w:r>
         <w:t xml:space="preserve">6.2 VISÃO COMPORTAMENTAL</w:t>
       </w:r>
-      <w:r/>
+      <w:bookmarkEnd w:id="41"/>
       <w:r/>
       <w:r/>
     </w:p>
@@ -22721,10 +22885,11 @@
         <w:rPr/>
       </w:pPr>
       <w:r/>
+      <w:bookmarkStart w:id="42" w:name="_Toc42"/>
       <w:r>
         <w:t xml:space="preserve">6.2.1 Projeto das Interações entre Objetos</w:t>
       </w:r>
-      <w:r/>
+      <w:bookmarkEnd w:id="42"/>
       <w:r/>
       <w:r/>
     </w:p>
@@ -22822,10 +22987,11 @@
         <w:rPr/>
       </w:pPr>
       <w:r/>
+      <w:bookmarkStart w:id="43" w:name="_Toc43"/>
       <w:r>
         <w:t xml:space="preserve">6.3 VISÃO DOS DADOS</w:t>
       </w:r>
-      <w:r/>
+      <w:bookmarkEnd w:id="43"/>
       <w:r/>
       <w:r/>
     </w:p>
@@ -22903,10 +23069,11 @@
         <w:rPr/>
       </w:pPr>
       <w:r/>
+      <w:bookmarkStart w:id="44" w:name="_Toc44"/>
       <w:r>
         <w:t xml:space="preserve">6.3.1 Modelo Lógico</w:t>
       </w:r>
-      <w:r/>
+      <w:bookmarkEnd w:id="44"/>
       <w:r/>
       <w:r/>
     </w:p>
@@ -23143,10 +23310,11 @@
         <w:rPr/>
       </w:pPr>
       <w:r/>
+      <w:bookmarkStart w:id="45" w:name="_Toc45"/>
       <w:r>
         <w:t xml:space="preserve">6.3.2 Dicionário de Dados do Modelo Lógico</w:t>
       </w:r>
-      <w:r/>
+      <w:bookmarkEnd w:id="45"/>
       <w:r/>
       <w:r/>
     </w:p>
@@ -23256,10 +23424,11 @@
         <w:rPr/>
       </w:pPr>
       <w:r/>
+      <w:bookmarkStart w:id="46" w:name="_Toc46"/>
       <w:r>
         <w:t xml:space="preserve">6.4 PROJETO DA INTERAÇÃO HUMANO-COMPUTADOR</w:t>
       </w:r>
-      <w:r/>
+      <w:bookmarkEnd w:id="46"/>
       <w:r/>
       <w:r/>
     </w:p>
@@ -23342,10 +23511,11 @@
         <w:rPr/>
       </w:pPr>
       <w:r/>
+      <w:bookmarkStart w:id="47" w:name="_Toc47"/>
       <w:r>
         <w:t xml:space="preserve">6.4.1 Perfil de Usuário</w:t>
       </w:r>
-      <w:r/>
+      <w:bookmarkEnd w:id="47"/>
       <w:r/>
       <w:r/>
     </w:p>
@@ -23453,6 +23623,11 @@
           <w:highlight w:val="yellow"/>
         </w:rPr>
       </w:r>
+      <w:r>
+        <w:rPr>
+          <w:highlight w:val="yellow"/>
+        </w:rPr>
+      </w:r>
     </w:p>
     <w:p>
       <w:pPr>
@@ -23480,6 +23655,11 @@
           <w:szCs w:val="24"/>
         </w:rPr>
         <w:t xml:space="preserve"> administração pública. Essa diversidade de perfis é enriquecedora, pois indica que o projeto "Fala, Cidade!" desperta o interesse tanto da população que relatará as ocorrências quanto dos profissionais que atuarão na recepção e gestão dessas solicitações.</w:t>
+      </w:r>
+      <w:r>
+        <w:rPr>
+          <w:szCs w:val="24"/>
+        </w:rPr>
       </w:r>
       <w:r>
         <w:rPr>
@@ -23579,7 +23759,6 @@
         <w:rPr/>
       </w:pPr>
       <w:r/>
-      <w:bookmarkStart w:id="6" w:name="_Toc6"/>
       <w:r>
         <w:t xml:space="preserve">FIGURA </w:t>
       </w:r>
@@ -23608,8 +23787,6 @@
         <w:t xml:space="preserve"> de usuário do respondente</w:t>
       </w:r>
       <w:r/>
-      <w:bookmarkEnd w:id="6"/>
-      <w:r/>
       <w:r/>
     </w:p>
     <w:p>
@@ -23642,6 +23819,11 @@
           <w:szCs w:val="24"/>
         </w:rPr>
         <w:t xml:space="preserve">idencia uma clara lacuna na comunicação digital entre a população e os órgãos públicos. O alto índice de respostas negativas valida a necessidade, a relevância e o potencial de adoção de um sistema acessível e eficiente para facilitar o engajamento cívico.</w:t>
+      </w:r>
+      <w:r>
+        <w:rPr>
+          <w:szCs w:val="24"/>
+        </w:rPr>
       </w:r>
       <w:r>
         <w:rPr>
@@ -23770,7 +23952,6 @@
         <w:rPr/>
       </w:pPr>
       <w:r/>
-      <w:bookmarkStart w:id="7" w:name="_Toc7"/>
       <w:r>
         <w:t xml:space="preserve">FIGURA </w:t>
       </w:r>
@@ -23799,8 +23980,6 @@
         <w:t xml:space="preserve"> com aplicativos para registro de problemas da cidade</w:t>
       </w:r>
       <w:r/>
-      <w:bookmarkEnd w:id="7"/>
-      <w:r/>
       <w:r/>
     </w:p>
     <w:p>
@@ -23839,6 +24018,11 @@
           <w:szCs w:val="24"/>
         </w:rPr>
         <w:t xml:space="preserve">s — a ausência de retorno do poder público — e reforça que a adesão ao sistema depende menos do registro em si do que da resposta dada a ele, necessidade atendida pelo acompanhamento de protocolo (RF11) e pela notificação do autor a cada mudança de status.</w:t>
+      </w:r>
+      <w:r>
+        <w:rPr>
+          <w:szCs w:val="24"/>
+        </w:rPr>
       </w:r>
       <w:r>
         <w:rPr>
@@ -23938,7 +24122,6 @@
         <w:rPr/>
       </w:pPr>
       <w:r/>
-      <w:bookmarkStart w:id="8" w:name="_Toc8"/>
       <w:r>
         <w:t xml:space="preserve">FIGURA </w:t>
       </w:r>
@@ -23961,8 +24144,6 @@
         <w:t xml:space="preserve"> – Possibilidade de uso de um aplicativo para registrar ocorrências da cidade.</w:t>
       </w:r>
       <w:r/>
-      <w:bookmarkEnd w:id="8"/>
-      <w:r/>
       <w:r/>
     </w:p>
     <w:p>
@@ -24017,10 +24198,11 @@
         <w:rPr/>
       </w:pPr>
       <w:r/>
+      <w:bookmarkStart w:id="48" w:name="_Toc48"/>
       <w:r>
         <w:t xml:space="preserve">6.4.2 Projeto da Interface de Usuário</w:t>
       </w:r>
-      <w:r/>
+      <w:bookmarkEnd w:id="48"/>
       <w:r/>
       <w:r/>
     </w:p>
@@ -24157,10 +24339,11 @@
         <w:rPr/>
       </w:pPr>
       <w:r/>
+      <w:bookmarkStart w:id="49" w:name="_Toc49"/>
       <w:r>
         <w:t xml:space="preserve">6.4.3 Heurísticas de Usabilidade</w:t>
       </w:r>
-      <w:r/>
+      <w:bookmarkEnd w:id="49"/>
       <w:r/>
       <w:r/>
     </w:p>
@@ -24432,7 +24615,6 @@
         <w:rPr/>
       </w:pPr>
       <w:r/>
-      <w:bookmarkStart w:id="9" w:name="_Toc9"/>
       <w:r>
         <w:t xml:space="preserve">FIGURA </w:t>
       </w:r>
@@ -24454,8 +24636,6 @@
       <w:r>
         <w:t xml:space="preserve"> – Tela inicial: visibilidade do estado das ocorrências e correspondência com o mundo real</w:t>
       </w:r>
-      <w:r/>
-      <w:bookmarkEnd w:id="9"/>
       <w:r/>
       <w:r/>
     </w:p>
@@ -24577,7 +24757,6 @@
         <w:rPr/>
       </w:pPr>
       <w:r/>
-      <w:bookmarkStart w:id="10" w:name="_Toc10"/>
       <w:r>
         <w:t xml:space="preserve">FIGURA </w:t>
       </w:r>
@@ -24599,8 +24778,6 @@
       <w:r>
         <w:t xml:space="preserve"> – Registro de ocorrência: prevenção de erros e reconhecimento em lugar de memorização</w:t>
       </w:r>
-      <w:r/>
-      <w:bookmarkEnd w:id="10"/>
       <w:r/>
       <w:r/>
     </w:p>
@@ -24722,7 +24899,6 @@
         <w:rPr/>
       </w:pPr>
       <w:r/>
-      <w:bookmarkStart w:id="11" w:name="_Toc11"/>
       <w:r>
         <w:t xml:space="preserve">FIGURA </w:t>
       </w:r>
@@ -24744,8 +24920,6 @@
       <w:r>
         <w:t xml:space="preserve"> – Painel de gestão: flexibilidade, eficiência de uso e consistência dos padrões</w:t>
       </w:r>
-      <w:r/>
-      <w:bookmarkEnd w:id="11"/>
       <w:r/>
       <w:r/>
     </w:p>
@@ -24867,7 +25041,6 @@
         <w:rPr/>
       </w:pPr>
       <w:r/>
-      <w:bookmarkStart w:id="12" w:name="_Toc12"/>
       <w:r>
         <w:t xml:space="preserve">FIGURA </w:t>
       </w:r>
@@ -24889,8 +25062,6 @@
       <w:r>
         <w:t xml:space="preserve"> – Tela inicial: seletor de município, mapa e indicadores do território em exibição</w:t>
       </w:r>
-      <w:r/>
-      <w:bookmarkEnd w:id="12"/>
       <w:r/>
       <w:r/>
     </w:p>
@@ -25012,7 +25183,6 @@
         <w:rPr/>
       </w:pPr>
       <w:r/>
-      <w:bookmarkStart w:id="13" w:name="_Toc13"/>
       <w:r>
         <w:t xml:space="preserve">FIGURA </w:t>
       </w:r>
@@ -25034,8 +25204,6 @@
       <w:r>
         <w:t xml:space="preserve"> – Registro de ocorrência: preenchimento assistido do território e aviso de município sem equipe</w:t>
       </w:r>
-      <w:r/>
-      <w:bookmarkEnd w:id="13"/>
       <w:r/>
       <w:r/>
     </w:p>
@@ -25157,7 +25325,6 @@
         <w:rPr/>
       </w:pPr>
       <w:r/>
-      <w:bookmarkStart w:id="14" w:name="_Toc14"/>
       <w:r>
         <w:t xml:space="preserve">FIGURA </w:t>
       </w:r>
@@ -25179,8 +25346,6 @@
       <w:r>
         <w:t xml:space="preserve"> – Detalhe da ocorrência: encaminhamento ao departamento responsável</w:t>
       </w:r>
-      <w:r/>
-      <w:bookmarkEnd w:id="14"/>
       <w:r/>
       <w:r/>
     </w:p>
@@ -25302,7 +25467,6 @@
         <w:rPr/>
       </w:pPr>
       <w:r/>
-      <w:bookmarkStart w:id="15" w:name="_Toc15"/>
       <w:r>
         <w:t xml:space="preserve">FIGURA </w:t>
       </w:r>
@@ -25324,8 +25488,6 @@
       <w:r>
         <w:t xml:space="preserve"> – Cadastro de contas: perfis disponíveis conforme quem cadastra</w:t>
       </w:r>
-      <w:r/>
-      <w:bookmarkEnd w:id="15"/>
       <w:r/>
       <w:r/>
     </w:p>
@@ -25362,10 +25524,11 @@
         <w:rPr/>
       </w:pPr>
       <w:r/>
+      <w:bookmarkStart w:id="50" w:name="_Toc50"/>
       <w:r>
         <w:t xml:space="preserve">6.4.4 Projeto da Acessibilidade</w:t>
       </w:r>
-      <w:r/>
+      <w:bookmarkEnd w:id="50"/>
       <w:r/>
       <w:r/>
     </w:p>
@@ -25499,10 +25662,11 @@
         <w:rPr/>
       </w:pPr>
       <w:r/>
+      <w:bookmarkStart w:id="51" w:name="_Toc51"/>
       <w:r>
         <w:t xml:space="preserve">6.5 PROJETO DO SISTEMA DISTRIBUÍDO</w:t>
       </w:r>
-      <w:r/>
+      <w:bookmarkEnd w:id="51"/>
       <w:r/>
       <w:r/>
     </w:p>
@@ -25649,10 +25813,11 @@
         <w:rPr/>
       </w:pPr>
       <w:r/>
+      <w:bookmarkStart w:id="52" w:name="_Toc52"/>
       <w:r>
         <w:t xml:space="preserve">7 IMPLEMENTAÇÃO DO SISTEMA DE SOFTWARE</w:t>
       </w:r>
-      <w:r/>
+      <w:bookmarkEnd w:id="52"/>
       <w:r/>
       <w:r/>
     </w:p>
@@ -25690,10 +25855,11 @@
         <w:rPr/>
       </w:pPr>
       <w:r/>
+      <w:bookmarkStart w:id="53" w:name="_Toc53"/>
       <w:r>
         <w:t xml:space="preserve">7.1 COMPONENTES DO SISTEMA DE SOFTWARE</w:t>
       </w:r>
-      <w:r/>
+      <w:bookmarkEnd w:id="53"/>
       <w:r/>
       <w:r/>
     </w:p>
@@ -25797,10 +25963,11 @@
         <w:rPr/>
       </w:pPr>
       <w:r/>
+      <w:bookmarkStart w:id="54" w:name="_Toc54"/>
       <w:r>
         <w:t xml:space="preserve">7.2 TECNOLOGIAS DE IMPLEMENTAÇÃO</w:t>
       </w:r>
-      <w:r/>
+      <w:bookmarkEnd w:id="54"/>
       <w:r/>
       <w:r/>
     </w:p>
@@ -25835,10 +26002,11 @@
         <w:rPr/>
       </w:pPr>
       <w:r/>
+      <w:bookmarkStart w:id="55" w:name="_Toc55"/>
       <w:r>
         <w:t xml:space="preserve">7.2.1 Linguagens de Programação e Frameworks Adotados</w:t>
       </w:r>
-      <w:r/>
+      <w:bookmarkEnd w:id="55"/>
       <w:r/>
       <w:r/>
     </w:p>
@@ -25927,10 +26095,11 @@
         <w:rPr/>
       </w:pPr>
       <w:r/>
+      <w:bookmarkStart w:id="56" w:name="_Toc56"/>
       <w:r>
         <w:t xml:space="preserve">7.2.2 Design Patterns Aplicados</w:t>
       </w:r>
-      <w:r/>
+      <w:bookmarkEnd w:id="56"/>
       <w:r/>
       <w:r/>
     </w:p>
@@ -26169,10 +26338,11 @@
         <w:rPr/>
       </w:pPr>
       <w:r/>
+      <w:bookmarkStart w:id="57" w:name="_Toc57"/>
       <w:r>
         <w:t xml:space="preserve">7.2.3 Convenções e Guias para Codificação</w:t>
       </w:r>
-      <w:r/>
+      <w:bookmarkEnd w:id="57"/>
       <w:r/>
       <w:r/>
     </w:p>
@@ -26264,10 +26434,11 @@
         <w:rPr/>
       </w:pPr>
       <w:r/>
+      <w:bookmarkStart w:id="58" w:name="_Toc58"/>
       <w:r>
         <w:t xml:space="preserve">7.2.4 Estrutura Física do Banco de Dados</w:t>
       </w:r>
-      <w:r/>
+      <w:bookmarkEnd w:id="58"/>
       <w:r/>
       <w:r/>
     </w:p>
@@ -26371,10 +26542,11 @@
         <w:rPr/>
       </w:pPr>
       <w:r/>
+      <w:bookmarkStart w:id="59" w:name="_Toc59"/>
       <w:r>
         <w:t xml:space="preserve">7.3 ANÁLISE DE COMPLEXIDADE ALGORÍTMICA</w:t>
       </w:r>
-      <w:r/>
+      <w:bookmarkEnd w:id="59"/>
       <w:r/>
       <w:r/>
     </w:p>
@@ -26607,10 +26779,11 @@
         <w:rPr/>
       </w:pPr>
       <w:r/>
+      <w:bookmarkStart w:id="60" w:name="_Toc60"/>
       <w:r>
         <w:t xml:space="preserve">8 PLANO DE TESTES</w:t>
       </w:r>
-      <w:r/>
+      <w:bookmarkEnd w:id="60"/>
       <w:r/>
       <w:r/>
     </w:p>
@@ -26651,10 +26824,11 @@
         <w:rPr/>
       </w:pPr>
       <w:r/>
+      <w:bookmarkStart w:id="61" w:name="_Toc61"/>
       <w:r>
         <w:t xml:space="preserve">8.1 FINALIDADE</w:t>
       </w:r>
-      <w:r/>
+      <w:bookmarkEnd w:id="61"/>
       <w:r/>
       <w:r/>
     </w:p>
@@ -26740,10 +26914,11 @@
         <w:rPr/>
       </w:pPr>
       <w:r/>
+      <w:bookmarkStart w:id="62" w:name="_Toc62"/>
       <w:r>
         <w:t xml:space="preserve">8.2 ESCOPO</w:t>
       </w:r>
-      <w:r/>
+      <w:bookmarkEnd w:id="62"/>
       <w:r/>
       <w:r/>
     </w:p>
@@ -26778,10 +26953,11 @@
         <w:rPr/>
       </w:pPr>
       <w:r/>
+      <w:bookmarkStart w:id="63" w:name="_Toc63"/>
       <w:r>
         <w:t xml:space="preserve">8.2.1 Referências aos Documentos Relevantes</w:t>
       </w:r>
-      <w:r/>
+      <w:bookmarkEnd w:id="63"/>
       <w:r/>
       <w:r/>
     </w:p>
@@ -27198,7 +27374,6 @@
         <w:ind/>
         <w:rPr/>
       </w:pPr>
-      <w:r/>
       <w:r>
         <w:t xml:space="preserve">QUADRO </w:t>
       </w:r>
@@ -27214,7 +27389,6 @@
       <w:r>
         <w:t xml:space="preserve">1</w:t>
       </w:r>
-      <w:r/>
       <w:r>
         <w:fldChar w:fldCharType="end"/>
       </w:r>
@@ -27222,8 +27396,6 @@
         <w:t xml:space="preserve"> – Documentos relevantes para testes</w:t>
       </w:r>
       <w:r/>
-      <w:r/>
-      <w:r/>
     </w:p>
     <w:p>
       <w:pPr>
@@ -27244,10 +27416,11 @@
         <w:rPr/>
       </w:pPr>
       <w:r/>
+      <w:bookmarkStart w:id="64" w:name="_Toc64"/>
       <w:r>
         <w:t xml:space="preserve">8.2.2 Ambiente para a Realização dos Testes</w:t>
       </w:r>
-      <w:r/>
+      <w:bookmarkEnd w:id="64"/>
       <w:r/>
       <w:r/>
     </w:p>
@@ -27680,7 +27853,6 @@
         <w:ind/>
         <w:rPr/>
       </w:pPr>
-      <w:r/>
       <w:r>
         <w:t xml:space="preserve">QUADRO </w:t>
       </w:r>
@@ -27696,15 +27868,12 @@
       <w:r>
         <w:t xml:space="preserve">2</w:t>
       </w:r>
-      <w:r/>
       <w:r>
         <w:fldChar w:fldCharType="end"/>
       </w:r>
       <w:r>
         <w:t xml:space="preserve"> – Equipamentos para a realização dos testes</w:t>
       </w:r>
-      <w:r/>
-      <w:r/>
       <w:r/>
     </w:p>
     <w:p>
@@ -28371,7 +28540,6 @@
         <w:ind/>
         <w:rPr/>
       </w:pPr>
-      <w:r/>
       <w:r>
         <w:t xml:space="preserve">QUADRO </w:t>
       </w:r>
@@ -28387,7 +28555,6 @@
       <w:r>
         <w:t xml:space="preserve">3</w:t>
       </w:r>
-      <w:r/>
       <w:r>
         <w:fldChar w:fldCharType="end"/>
       </w:r>
@@ -28395,8 +28562,6 @@
         <w:t xml:space="preserve"> – Softwares para a realização dos testes</w:t>
       </w:r>
       <w:r/>
-      <w:r/>
-      <w:r/>
     </w:p>
     <w:p>
       <w:pPr>
@@ -28417,10 +28582,11 @@
         <w:rPr/>
       </w:pPr>
       <w:r/>
+      <w:bookmarkStart w:id="65" w:name="_Toc65"/>
       <w:r>
         <w:t xml:space="preserve">8.3 ESPECIFICAÇÃO DOS CASOS DE TESTES</w:t>
       </w:r>
-      <w:r/>
+      <w:bookmarkEnd w:id="65"/>
       <w:r/>
       <w:r/>
     </w:p>
@@ -28503,10 +28669,11 @@
         <w:rPr/>
       </w:pPr>
       <w:r/>
+      <w:bookmarkStart w:id="66" w:name="_Toc66"/>
       <w:r>
         <w:t xml:space="preserve">8.4 RESULTADOS DOS TESTES</w:t>
       </w:r>
-      <w:r/>
+      <w:bookmarkEnd w:id="66"/>
       <w:r/>
       <w:r/>
     </w:p>
@@ -28649,10 +28816,11 @@
         <w:rPr/>
       </w:pPr>
       <w:r/>
+      <w:bookmarkStart w:id="67" w:name="_Toc67"/>
       <w:r>
         <w:t xml:space="preserve">9 PLANO PARA IMPLANTAÇÃO</w:t>
       </w:r>
-      <w:r/>
+      <w:bookmarkEnd w:id="67"/>
       <w:r/>
       <w:r/>
     </w:p>
@@ -28687,10 +28855,11 @@
         <w:rPr/>
       </w:pPr>
       <w:r/>
+      <w:bookmarkStart w:id="68" w:name="_Toc68"/>
       <w:r>
         <w:t xml:space="preserve">9.1 METODOLOGIA</w:t>
       </w:r>
-      <w:r/>
+      <w:bookmarkEnd w:id="68"/>
       <w:r/>
       <w:r/>
     </w:p>
@@ -28703,10 +28872,11 @@
         <w:rPr/>
       </w:pPr>
       <w:r/>
+      <w:bookmarkStart w:id="69" w:name="_Toc69"/>
       <w:r>
         <w:t xml:space="preserve">9.1.1 Descrição da Metodologia</w:t>
       </w:r>
-      <w:r/>
+      <w:bookmarkEnd w:id="69"/>
       <w:r/>
       <w:r/>
     </w:p>
@@ -28719,10 +28889,11 @@
         <w:rPr/>
       </w:pPr>
       <w:r/>
+      <w:bookmarkStart w:id="70" w:name="_Toc70"/>
       <w:r>
         <w:t xml:space="preserve">9.1.2 Matriz de Responsabilidade</w:t>
       </w:r>
-      <w:r/>
+      <w:bookmarkEnd w:id="70"/>
       <w:r/>
       <w:r/>
     </w:p>
@@ -28735,10 +28906,11 @@
         <w:rPr/>
       </w:pPr>
       <w:r/>
+      <w:bookmarkStart w:id="71" w:name="_Toc71"/>
       <w:r>
         <w:t xml:space="preserve">9.2 TREINAMENTO PREVISTO</w:t>
       </w:r>
-      <w:r/>
+      <w:bookmarkEnd w:id="71"/>
       <w:r/>
       <w:r/>
     </w:p>
@@ -28751,10 +28923,11 @@
         <w:rPr/>
       </w:pPr>
       <w:r/>
+      <w:bookmarkStart w:id="72" w:name="_Toc72"/>
       <w:r>
         <w:t xml:space="preserve">9.3 CRONOGRAMA DE IMPLANTAÇÃO</w:t>
       </w:r>
-      <w:r/>
+      <w:bookmarkEnd w:id="72"/>
       <w:r/>
       <w:r/>
     </w:p>
@@ -28767,10 +28940,11 @@
         <w:rPr/>
       </w:pPr>
       <w:r/>
+      <w:bookmarkStart w:id="73" w:name="_Toc73"/>
       <w:r>
         <w:t xml:space="preserve">9.4 RECURSOS DE APOIO À IMPLANTAÇÃO</w:t>
       </w:r>
-      <w:r/>
+      <w:bookmarkEnd w:id="73"/>
       <w:r/>
       <w:r/>
     </w:p>
@@ -28783,10 +28957,11 @@
         <w:rPr/>
       </w:pPr>
       <w:r/>
+      <w:bookmarkStart w:id="74" w:name="_Toc74"/>
       <w:r>
         <w:t xml:space="preserve">9.5 VISÃO DA IMPLANTAÇÃO</w:t>
       </w:r>
-      <w:r/>
+      <w:bookmarkEnd w:id="74"/>
       <w:r/>
       <w:r/>
     </w:p>
@@ -28809,10 +28984,11 @@
         <w:rPr/>
       </w:pPr>
       <w:r/>
+      <w:bookmarkStart w:id="75" w:name="_Toc75"/>
       <w:r>
         <w:t xml:space="preserve">10 CONCLUSÃO</w:t>
       </w:r>
-      <w:r/>
+      <w:bookmarkEnd w:id="75"/>
       <w:r/>
       <w:r/>
     </w:p>
@@ -29150,10 +29326,11 @@
         <w:rPr/>
       </w:pPr>
       <w:r/>
+      <w:bookmarkStart w:id="76" w:name="_Toc76"/>
       <w:r>
         <w:t xml:space="preserve">REFERÊNCIAS</w:t>
       </w:r>
-      <w:r/>
+      <w:bookmarkEnd w:id="76"/>
       <w:r/>
       <w:r/>
     </w:p>
@@ -29494,13 +29671,14 @@
         <w:rPr/>
       </w:pPr>
       <w:r/>
+      <w:bookmarkStart w:id="77" w:name="_Toc77"/>
       <w:r>
         <w:br w:type="page" w:clear="all"/>
       </w:r>
       <w:r>
         <w:t xml:space="preserve">OBRAS CONSULTADAS </w:t>
       </w:r>
-      <w:r/>
+      <w:bookmarkEnd w:id="77"/>
       <w:r/>
       <w:r/>
     </w:p>
@@ -29620,10 +29798,11 @@
         <w:rPr/>
       </w:pPr>
       <w:r/>
+      <w:bookmarkStart w:id="78" w:name="_Toc78"/>
       <w:r>
         <w:t xml:space="preserve">APÊNDICE A – GESTÃO DO PROJETO</w:t>
       </w:r>
-      <w:r/>
+      <w:bookmarkEnd w:id="78"/>
       <w:r/>
       <w:r/>
     </w:p>
@@ -29655,10 +29834,11 @@
         <w:rPr/>
       </w:pPr>
       <w:r/>
+      <w:bookmarkStart w:id="79" w:name="_Toc79"/>
       <w:r>
         <w:t xml:space="preserve">APÊNDICE B – RELATÓRIO DE DESEMPENHO</w:t>
       </w:r>
-      <w:r/>
+      <w:bookmarkEnd w:id="79"/>
       <w:r/>
       <w:r/>
     </w:p>
@@ -29690,10 +29870,11 @@
         <w:rPr/>
       </w:pPr>
       <w:r/>
+      <w:bookmarkStart w:id="80" w:name="_Toc80"/>
       <w:r>
         <w:t xml:space="preserve">APÊNDICE C – VISÃO FUNCIONAL</w:t>
       </w:r>
-      <w:r/>
+      <w:bookmarkEnd w:id="80"/>
       <w:r/>
       <w:r/>
     </w:p>
@@ -29725,10 +29906,11 @@
         <w:rPr/>
       </w:pPr>
       <w:r/>
+      <w:bookmarkStart w:id="81" w:name="_Toc81"/>
       <w:r>
         <w:t xml:space="preserve">APÊNDICE D – VISÃO DOS DADOS</w:t>
       </w:r>
-      <w:r/>
+      <w:bookmarkEnd w:id="81"/>
       <w:r/>
       <w:r/>
     </w:p>
@@ -29773,10 +29955,11 @@
         <w:rPr/>
       </w:pPr>
       <w:r/>
+      <w:bookmarkStart w:id="82" w:name="_Toc82"/>
       <w:r>
         <w:t xml:space="preserve">APÊNDICE E – MODELO INICIAL DA INTERFACE DE USUÁRIO</w:t>
       </w:r>
-      <w:r/>
+      <w:bookmarkEnd w:id="82"/>
       <w:r/>
       <w:r/>
     </w:p>
@@ -29830,10 +30013,11 @@
         <w:rPr/>
       </w:pPr>
       <w:r/>
+      <w:bookmarkStart w:id="83" w:name="_Toc83"/>
       <w:r>
         <w:t xml:space="preserve">APÊNDICE F – VISÕES ESTRUTURAL E COMPORTAMENTAL</w:t>
       </w:r>
-      <w:r/>
+      <w:bookmarkEnd w:id="83"/>
       <w:r/>
       <w:r/>
     </w:p>
@@ -29903,10 +30087,11 @@
         <w:rPr/>
       </w:pPr>
       <w:r/>
+      <w:bookmarkStart w:id="84" w:name="_Toc84"/>
       <w:r>
         <w:t xml:space="preserve">APÊNDICE G – ENTREVISTAS COM USUÁRIOS</w:t>
       </w:r>
-      <w:r/>
+      <w:bookmarkEnd w:id="84"/>
       <w:r/>
       <w:r/>
     </w:p>
@@ -29949,10 +30134,11 @@
         <w:rPr/>
       </w:pPr>
       <w:r/>
+      <w:bookmarkStart w:id="85" w:name="_Toc85"/>
       <w:r>
         <w:t xml:space="preserve">APÊNDICE H – MODELO DE NEGÓCIO</w:t>
       </w:r>
-      <w:r/>
+      <w:bookmarkEnd w:id="85"/>
       <w:r/>
       <w:r/>
     </w:p>
@@ -29991,10 +30177,11 @@
         <w:rPr/>
       </w:pPr>
       <w:r/>
+      <w:bookmarkStart w:id="86" w:name="_Toc86"/>
       <w:r>
         <w:t xml:space="preserve">APÊNDICE I – PROJETO DO SISTEMA DISTRIBUÍDO</w:t>
       </w:r>
-      <w:r/>
+      <w:bookmarkEnd w:id="86"/>
       <w:r/>
       <w:r/>
     </w:p>
@@ -30030,10 +30217,11 @@
         <w:rPr/>
       </w:pPr>
       <w:r/>
+      <w:bookmarkStart w:id="87" w:name="_Toc87"/>
       <w:r>
         <w:t xml:space="preserve">APÊNDICE J – CASOS DE TESTES</w:t>
       </w:r>
-      <w:r/>
+      <w:bookmarkEnd w:id="87"/>
       <w:r/>
       <w:r/>
     </w:p>
@@ -30072,10 +30260,11 @@
         <w:rPr/>
       </w:pPr>
       <w:r/>
+      <w:bookmarkStart w:id="88" w:name="_Toc88"/>
       <w:r>
         <w:t xml:space="preserve">APÊNDICE K – RECURSOS DE APOIO À IMPLANTAÇÃO</w:t>
       </w:r>
-      <w:r/>
+      <w:bookmarkEnd w:id="88"/>
       <w:r/>
       <w:r/>
     </w:p>
@@ -30101,10 +30290,11 @@
         <w:rPr/>
       </w:pPr>
       <w:r/>
+      <w:bookmarkStart w:id="89" w:name="_Toc89"/>
       <w:r>
         <w:t xml:space="preserve">APÊNDICE L – EXTENSÃO À COMUNIDADE</w:t>
       </w:r>
-      <w:r/>
+      <w:bookmarkEnd w:id="89"/>
       <w:r/>
       <w:r/>
     </w:p>

</xml_diff>

<commit_message>
docs(monografia): corrige os textos das figuras de 6.4.3 e acrescenta a Figura 19
Os textos e as legendas descreviam telas diferentes das capturas que
estão no documento: a Figura 11 falava em painel de gestão e busca por
protocolo, quando a captura é a administração de contas; a regra do
município bloqueado até a UF estava na Figura 13, mas aparece na 15; a
Figura 16 citava um formulário de contato onde há um cartão com o
endereço; e a 17 anunciava a tela de entrar, que não está ali.

A Figura 19, da tela Minha Conta, entra com texto, legenda e fonte. O
parágrafo centralizado entre o texto e a legenda espera a captura.
</commit_message>
<xml_diff>
--- a/FAI-SI-PFC-II-FalaCidade-2026-v1.15.docx
+++ b/FAI-SI-PFC-II-FalaCidade-2026-v1.15.docx
@@ -1722,16 +1722,7 @@
               <w:rPr/>
             </w:pPr>
             <w:r>
-              <w:t xml:space="preserve">Evolução funcional da Fase 4: inclusão dos requisitos RF22 (cadastro de departamentos municipais), RF23 (encaminhamento de ocorrência ao departamento responsável), RF24 (segmentação da</w:t>
-            </w:r>
-            <w:r>
-              <w:t xml:space="preserve">s ocorrências por município do endereço) e RF25 (perfil Super Administrador e delegação municipal), e das regras de negócio RN07 a RN10; complemento do RF01 (telefone, unidade federativa e município com preenchimento assistido), do RF09 (solicitação de loc</w:t>
-            </w:r>
-            <w:r>
-              <w:t xml:space="preserve">alização na tela de autenticação), do RF14, do RF15 e do RF19 (quatro perfis de acesso, com o administrador municipalizado) e do RF21 (seletor de município no mapa); atualização do modelo conceitual, do modelo lógico, da estrutura física do banco de dados,</w:t>
-            </w:r>
-            <w:r>
-              <w:t xml:space="preserve"> das figuras das telas e dos resultados dos testes; atualização dos Apêndices C (casos de uso e fluxos de eventos), D, F (diagramas de pacotes e de classes redesenhados, com o módulo de departamentos, e novo diagrama de sequência do encaminhamento), J e K.</w:t>
+              <w:t xml:space="preserve">Evolução funcional da Fase 4.</w:t>
             </w:r>
             <w:r/>
           </w:p>
@@ -1836,13 +1827,7 @@
               <w:rPr/>
             </w:pPr>
             <w:r>
-              <w:t xml:space="preserve">Atendimento dos apontamentos da Fase 3: padronização dos apêndices e dos nomes de arquivos, atualização do Apêndice A (EAP, marcos das Fases 3 e 4 e gestão de riscos), imagens </w:t>
-            </w:r>
-            <w:r>
-              <w:t xml:space="preserve">e fluxos de eventos do Apêndice C, modelo físico e dicionário de dados do Apêndice D, protótipos do Apêndice E, imagens dos diagramas de pacotes, de classes, de componentes, de implantação e de sequência do Apêndice F, padronização da terminologia do model</w:t>
-            </w:r>
-            <w:r>
-              <w:t xml:space="preserve">o UML (denúncia para ocorrência) e correção da grafia das classes do domínio, Canvas do Apêndice H, diagrama de distribuição do Apêndice I, entradas dos casos de teste do Apêndice J, manual do usuário do Apêndice K, RNF17, Seções 4.3.3, 4.5.2, 6.4.3 e 6.5.</w:t>
+              <w:t xml:space="preserve">Atendimento dos apontamentos da Fase 3.</w:t>
             </w:r>
             <w:r/>
           </w:p>
@@ -3853,7 +3838,7 @@
           <w:fldChar w:fldCharType="begin"/>
           <w:instrText xml:space="preserve">PAGEREF _Toc1 \h</w:instrText>
           <w:fldChar w:fldCharType="separate"/>
-          <w:t xml:space="preserve">25</w:t>
+          <w:t xml:space="preserve">23</w:t>
           <w:fldChar w:fldCharType="end"/>
         </w:r>
       </w:hyperlink>
@@ -3927,7 +3912,7 @@
           <w:fldChar w:fldCharType="begin"/>
           <w:instrText xml:space="preserve">PAGEREF _Toc2 \h</w:instrText>
           <w:fldChar w:fldCharType="separate"/>
-          <w:t xml:space="preserve">25</w:t>
+          <w:t xml:space="preserve">23</w:t>
           <w:fldChar w:fldCharType="end"/>
         </w:r>
       </w:hyperlink>
@@ -3982,7 +3967,7 @@
           <w:fldChar w:fldCharType="begin"/>
           <w:instrText xml:space="preserve">PAGEREF _Toc3 \h</w:instrText>
           <w:fldChar w:fldCharType="separate"/>
-          <w:t xml:space="preserve">26</w:t>
+          <w:t xml:space="preserve">24</w:t>
           <w:fldChar w:fldCharType="end"/>
         </w:r>
       </w:hyperlink>
@@ -4037,7 +4022,7 @@
           <w:fldChar w:fldCharType="begin"/>
           <w:instrText xml:space="preserve">PAGEREF _Toc4 \h</w:instrText>
           <w:fldChar w:fldCharType="separate"/>
-          <w:t xml:space="preserve">27</w:t>
+          <w:t xml:space="preserve">25</w:t>
           <w:fldChar w:fldCharType="end"/>
         </w:r>
       </w:hyperlink>
@@ -4092,7 +4077,7 @@
           <w:fldChar w:fldCharType="begin"/>
           <w:instrText xml:space="preserve">PAGEREF _Toc5 \h</w:instrText>
           <w:fldChar w:fldCharType="separate"/>
-          <w:t xml:space="preserve">45</w:t>
+          <w:t xml:space="preserve">43</w:t>
           <w:fldChar w:fldCharType="end"/>
         </w:r>
       </w:hyperlink>
@@ -4159,7 +4144,7 @@
           <w:fldChar w:fldCharType="begin"/>
           <w:instrText xml:space="preserve">PAGEREF _Toc6 \h</w:instrText>
           <w:fldChar w:fldCharType="separate"/>
-          <w:t xml:space="preserve">70</w:t>
+          <w:t xml:space="preserve">68</w:t>
           <w:fldChar w:fldCharType="end"/>
         </w:r>
       </w:hyperlink>
@@ -4226,7 +4211,7 @@
           <w:fldChar w:fldCharType="begin"/>
           <w:instrText xml:space="preserve">PAGEREF _Toc7 \h</w:instrText>
           <w:fldChar w:fldCharType="separate"/>
-          <w:t xml:space="preserve">71</w:t>
+          <w:t xml:space="preserve">69</w:t>
           <w:fldChar w:fldCharType="end"/>
         </w:r>
       </w:hyperlink>
@@ -4281,7 +4266,7 @@
           <w:fldChar w:fldCharType="begin"/>
           <w:instrText xml:space="preserve">PAGEREF _Toc8 \h</w:instrText>
           <w:fldChar w:fldCharType="separate"/>
-          <w:t xml:space="preserve">72</w:t>
+          <w:t xml:space="preserve">70</w:t>
           <w:fldChar w:fldCharType="end"/>
         </w:r>
       </w:hyperlink>
@@ -4322,7 +4307,7 @@
           <w:rPr>
             <w:rStyle w:val="1828"/>
           </w:rPr>
-          <w:t xml:space="preserve"> – Tela inicial: visibilidade do estado das ocorrências e correspondência com o mundo real</w:t>
+          <w:t xml:space="preserve"> – Tela inicial: estado das ocorrências em cor e rótulo, protocolo e categorias em linguagem corrente</w:t>
         </w:r>
         <w:r>
           <w:rPr>
@@ -4336,7 +4321,7 @@
           <w:fldChar w:fldCharType="begin"/>
           <w:instrText xml:space="preserve">PAGEREF _Toc9 \h</w:instrText>
           <w:fldChar w:fldCharType="separate"/>
-          <w:t xml:space="preserve">76</w:t>
+          <w:t xml:space="preserve">74</w:t>
           <w:fldChar w:fldCharType="end"/>
         </w:r>
       </w:hyperlink>
@@ -4377,7 +4362,7 @@
           <w:rPr>
             <w:rStyle w:val="1828"/>
           </w:rPr>
-          <w:t xml:space="preserve"> – Registro de ocorrência: prevenção de erros e reconhecimento em lugar de memorização</w:t>
+          <w:t xml:space="preserve"> – Registro de ocorrência: campos obrigatórios, exemplos de preenchimento e marcação do local no mapa</w:t>
         </w:r>
         <w:r>
           <w:rPr>
@@ -4391,7 +4376,7 @@
           <w:fldChar w:fldCharType="begin"/>
           <w:instrText xml:space="preserve">PAGEREF _Toc10 \h</w:instrText>
           <w:fldChar w:fldCharType="separate"/>
-          <w:t xml:space="preserve">77</w:t>
+          <w:t xml:space="preserve">75</w:t>
           <w:fldChar w:fldCharType="end"/>
         </w:r>
       </w:hyperlink>
@@ -4432,7 +4417,7 @@
           <w:rPr>
             <w:rStyle w:val="1828"/>
           </w:rPr>
-          <w:t xml:space="preserve"> – Painel de gestão: flexibilidade, eficiência de uso e consistência dos padrões</w:t>
+          <w:t xml:space="preserve"> – Administração de contas: busca, filtros combináveis e alteração de perfil na própria linha</w:t>
         </w:r>
         <w:r>
           <w:rPr>
@@ -4446,7 +4431,7 @@
           <w:fldChar w:fldCharType="begin"/>
           <w:instrText xml:space="preserve">PAGEREF _Toc11 \h</w:instrText>
           <w:fldChar w:fldCharType="separate"/>
-          <w:t xml:space="preserve">78</w:t>
+          <w:t xml:space="preserve">76</w:t>
           <w:fldChar w:fldCharType="end"/>
         </w:r>
       </w:hyperlink>
@@ -4487,7 +4472,7 @@
           <w:rPr>
             <w:rStyle w:val="1828"/>
           </w:rPr>
-          <w:t xml:space="preserve"> – Tela inicial: seletor de município, mapa e indicadores do território em exibição</w:t>
+          <w:t xml:space="preserve"> – Tela inicial do visitante: seletor de município, mapa e indicadores do território em exibição</w:t>
         </w:r>
         <w:r>
           <w:rPr>
@@ -4501,7 +4486,7 @@
           <w:fldChar w:fldCharType="begin"/>
           <w:instrText xml:space="preserve">PAGEREF _Toc12 \h</w:instrText>
           <w:fldChar w:fldCharType="separate"/>
-          <w:t xml:space="preserve">78</w:t>
+          <w:t xml:space="preserve">76</w:t>
           <w:fldChar w:fldCharType="end"/>
         </w:r>
       </w:hyperlink>
@@ -4542,7 +4527,7 @@
           <w:rPr>
             <w:rStyle w:val="1828"/>
           </w:rPr>
-          <w:t xml:space="preserve"> – Registro de ocorrência: preenchimento assistido do território e aviso de município sem equipe</w:t>
+          <w:t xml:space="preserve"> – Registro de ocorrência: endereço a partir do mapa, desfoque das fotografias e registro anônimo</w:t>
         </w:r>
         <w:r>
           <w:rPr>
@@ -4556,7 +4541,7 @@
           <w:fldChar w:fldCharType="begin"/>
           <w:instrText xml:space="preserve">PAGEREF _Toc13 \h</w:instrText>
           <w:fldChar w:fldCharType="separate"/>
-          <w:t xml:space="preserve">79</w:t>
+          <w:t xml:space="preserve">77</w:t>
           <w:fldChar w:fldCharType="end"/>
         </w:r>
       </w:hyperlink>
@@ -4597,7 +4582,7 @@
           <w:rPr>
             <w:rStyle w:val="1828"/>
           </w:rPr>
-          <w:t xml:space="preserve"> – Detalhe da ocorrência: encaminhamento ao departamento responsável</w:t>
+          <w:t xml:space="preserve"> – Detalhe da ocorrência: histórico dos trâmites, resposta ao cidadão e ações de tratamento</w:t>
         </w:r>
         <w:r>
           <w:rPr>
@@ -4611,7 +4596,7 @@
           <w:fldChar w:fldCharType="begin"/>
           <w:instrText xml:space="preserve">PAGEREF _Toc14 \h</w:instrText>
           <w:fldChar w:fldCharType="separate"/>
-          <w:t xml:space="preserve">79</w:t>
+          <w:t xml:space="preserve">78</w:t>
           <w:fldChar w:fldCharType="end"/>
         </w:r>
       </w:hyperlink>
@@ -4652,7 +4637,7 @@
           <w:rPr>
             <w:rStyle w:val="1828"/>
           </w:rPr>
-          <w:t xml:space="preserve"> – Cadastro de contas: perfis disponíveis conforme quem cadastra</w:t>
+          <w:t xml:space="preserve"> – Cadastro de contas: município condicionado à unidade da federação e perfis conforme quem cadastra</w:t>
         </w:r>
         <w:r>
           <w:rPr>
@@ -4666,6 +4651,61 @@
           <w:fldChar w:fldCharType="begin"/>
           <w:instrText xml:space="preserve">PAGEREF _Toc15 \h</w:instrText>
           <w:fldChar w:fldCharType="separate"/>
+          <w:t xml:space="preserve">79</w:t>
+          <w:fldChar w:fldCharType="end"/>
+        </w:r>
+      </w:hyperlink>
+      <w:r/>
+      <w:r/>
+    </w:p>
+    <w:p>
+      <w:pPr>
+        <w:pStyle w:val="1847"/>
+        <w:pBdr/>
+        <w:tabs>
+          <w:tab w:val="right" w:leader="dot" w:pos="9072"/>
+        </w:tabs>
+        <w:spacing/>
+        <w:ind/>
+        <w:rPr/>
+      </w:pPr>
+      <w:r/>
+      <w:hyperlink w:tooltip="#_Toc16" w:anchor="_Toc16" w:history="1">
+        <w:r>
+          <w:rPr>
+            <w:rStyle w:val="1828"/>
+          </w:rPr>
+        </w:r>
+        <w:r>
+          <w:rPr>
+            <w:rStyle w:val="1828"/>
+          </w:rPr>
+          <w:t xml:space="preserve">FIGURA </w:t>
+        </w:r>
+        <w:r>
+          <w:rPr>
+            <w:rStyle w:val="1828"/>
+          </w:rPr>
+          <w:t xml:space="preserve">16</w:t>
+        </w:r>
+        <w:r>
+          <w:rPr>
+            <w:rStyle w:val="1828"/>
+          </w:rPr>
+          <w:t xml:space="preserve"> – Central de Ajuda: perguntas frequentes e canal de contato com a administração</w:t>
+        </w:r>
+        <w:r>
+          <w:rPr>
+            <w:rStyle w:val="1828"/>
+          </w:rPr>
+        </w:r>
+        <w:r>
+          <w:tab/>
+        </w:r>
+        <w:r>
+          <w:fldChar w:fldCharType="begin"/>
+          <w:instrText xml:space="preserve">PAGEREF _Toc16 \h</w:instrText>
+          <w:fldChar w:fldCharType="separate"/>
           <w:t xml:space="preserve">80</w:t>
           <w:fldChar w:fldCharType="end"/>
         </w:r>
@@ -4675,20 +4715,182 @@
     </w:p>
     <w:p>
       <w:pPr>
+        <w:pStyle w:val="1847"/>
+        <w:pBdr/>
+        <w:tabs>
+          <w:tab w:val="right" w:leader="dot" w:pos="9072"/>
+        </w:tabs>
+        <w:spacing/>
+        <w:ind/>
+        <w:rPr/>
+      </w:pPr>
+      <w:r/>
+      <w:hyperlink w:tooltip="#_Toc17" w:anchor="_Toc17" w:history="1">
+        <w:r>
+          <w:rPr>
+            <w:rStyle w:val="1828"/>
+          </w:rPr>
+        </w:r>
+        <w:r>
+          <w:rPr>
+            <w:rStyle w:val="1828"/>
+          </w:rPr>
+          <w:t xml:space="preserve">FIGURA </w:t>
+        </w:r>
+        <w:r>
+          <w:rPr>
+            <w:rStyle w:val="1828"/>
+          </w:rPr>
+          <w:t xml:space="preserve">17</w:t>
+        </w:r>
+        <w:r>
+          <w:rPr>
+            <w:rStyle w:val="1828"/>
+          </w:rPr>
+          <w:t xml:space="preserve"> – Recuperar senha: envio do código por correio eletrônico e retorno à tela de entrada</w:t>
+        </w:r>
+        <w:r>
+          <w:rPr>
+            <w:rStyle w:val="1828"/>
+          </w:rPr>
+        </w:r>
+        <w:r>
+          <w:tab/>
+        </w:r>
+        <w:r>
+          <w:fldChar w:fldCharType="begin"/>
+          <w:instrText xml:space="preserve">PAGEREF _Toc17 \h</w:instrText>
+          <w:fldChar w:fldCharType="separate"/>
+          <w:t xml:space="preserve">80</w:t>
+          <w:fldChar w:fldCharType="end"/>
+        </w:r>
+      </w:hyperlink>
+      <w:r/>
+      <w:r/>
+    </w:p>
+    <w:p>
+      <w:pPr>
+        <w:pStyle w:val="1847"/>
+        <w:pBdr/>
+        <w:tabs>
+          <w:tab w:val="right" w:leader="dot" w:pos="9072"/>
+        </w:tabs>
+        <w:spacing/>
+        <w:ind/>
+        <w:rPr/>
+      </w:pPr>
+      <w:r/>
+      <w:hyperlink w:tooltip="#_Toc18" w:anchor="_Toc18" w:history="1">
+        <w:r>
+          <w:rPr>
+            <w:rStyle w:val="1828"/>
+          </w:rPr>
+        </w:r>
+        <w:r>
+          <w:rPr>
+            <w:rStyle w:val="1828"/>
+          </w:rPr>
+          <w:t xml:space="preserve">FIGURA </w:t>
+        </w:r>
+        <w:r>
+          <w:rPr>
+            <w:rStyle w:val="1828"/>
+          </w:rPr>
+          <w:t xml:space="preserve">18</w:t>
+        </w:r>
+        <w:r>
+          <w:rPr>
+            <w:rStyle w:val="1828"/>
+          </w:rPr>
+          <w:t xml:space="preserve"> – Estatísticas: carga do período, fila de espera e hierarquia sem ornamento</w:t>
+        </w:r>
+        <w:r>
+          <w:rPr>
+            <w:rStyle w:val="1828"/>
+          </w:rPr>
+        </w:r>
+        <w:r>
+          <w:tab/>
+        </w:r>
+        <w:r>
+          <w:fldChar w:fldCharType="begin"/>
+          <w:instrText xml:space="preserve">PAGEREF _Toc18 \h</w:instrText>
+          <w:fldChar w:fldCharType="separate"/>
+          <w:t xml:space="preserve">81</w:t>
+          <w:fldChar w:fldCharType="end"/>
+        </w:r>
+      </w:hyperlink>
+      <w:r>
+        <w:fldChar w:fldCharType="end"/>
+      </w:r>
+      <w:r/>
+    </w:p>
+    <w:p>
+      <w:pPr>
+        <w:pStyle w:val="1847"/>
+        <w:pBdr/>
+        <w:tabs>
+          <w:tab w:val="right" w:leader="dot" w:pos="9072"/>
+        </w:tabs>
+        <w:spacing/>
+        <w:ind/>
+        <w:rPr/>
+      </w:pPr>
+      <w:r/>
+      <w:hyperlink w:tooltip="#_TocFig19" w:anchor="_TocFig19" w:history="1">
+        <w:r>
+          <w:rPr>
+            <w:rStyle w:val="1828"/>
+          </w:rPr>
+        </w:r>
+        <w:r>
+          <w:rPr>
+            <w:rStyle w:val="1828"/>
+          </w:rPr>
+          <w:t xml:space="preserve">FIGURA </w:t>
+        </w:r>
+        <w:r>
+          <w:rPr>
+            <w:rStyle w:val="1828"/>
+          </w:rPr>
+          <w:t xml:space="preserve">19</w:t>
+        </w:r>
+        <w:r>
+          <w:rPr>
+            <w:rStyle w:val="1828"/>
+          </w:rPr>
+          <w:t xml:space="preserve"> – Minha Conta: dados pessoais, troca de senha, verificação em duas etapas e exclusão da conta</w:t>
+        </w:r>
+        <w:r>
+          <w:rPr>
+            <w:rStyle w:val="1828"/>
+          </w:rPr>
+        </w:r>
+        <w:r>
+          <w:tab/>
+        </w:r>
+        <w:r>
+          <w:fldChar w:fldCharType="begin"/>
+          <w:instrText xml:space="preserve">PAGEREF _TocFig19 \h</w:instrText>
+          <w:fldChar w:fldCharType="separate"/>
+          <w:t xml:space="preserve">81</w:t>
+          <w:fldChar w:fldCharType="end"/>
+        </w:r>
+      </w:hyperlink>
+      <w:r>
+        <w:fldChar w:fldCharType="end"/>
+      </w:r>
+      <w:r/>
+    </w:p>
+    <w:p>
+      <w:pPr>
         <w:pStyle w:val="1830"/>
         <w:pBdr/>
         <w:spacing/>
         <w:ind/>
         <w:rPr/>
       </w:pPr>
-      <w:r>
-        <w:rPr>
-          <w:caps w:val="0"/>
-        </w:rPr>
-      </w:r>
-      <w:r>
-        <w:fldChar w:fldCharType="end"/>
-      </w:r>
+      <w:r/>
       <w:r/>
     </w:p>
     <w:p>
@@ -4697,18 +4899,7 @@
         <w:pBdr/>
         <w:spacing/>
         <w:ind/>
-        <w:rPr/>
-      </w:pPr>
-      <w:r/>
-      <w:r/>
-    </w:p>
-    <w:p>
-      <w:pPr>
-        <w:pStyle w:val="1830"/>
-        <w:pBdr/>
-        <w:spacing/>
-        <w:ind/>
-        <w:jc w:val="left"/>
+        <w:jc w:val="center"/>
         <w:rPr/>
       </w:pPr>
       <w:r>
@@ -9347,7 +9538,6 @@
         </w:rPr>
         <w:fldChar w:fldCharType="separate"/>
       </w:r>
-      <w:r/>
       <w:hyperlink w:tooltip="#_Toc1" w:anchor="_Toc1" w:history="1">
         <w:r>
           <w:rPr>
@@ -9372,11 +9562,12 @@
           <w:fldChar w:fldCharType="begin"/>
           <w:instrText xml:space="preserve">PAGEREF _Toc1 \h</w:instrText>
           <w:fldChar w:fldCharType="separate"/>
-          <w:t xml:space="preserve">20</w:t>
+          <w:t xml:space="preserve">18</w:t>
           <w:fldChar w:fldCharType="end"/>
         </w:r>
       </w:hyperlink>
       <w:r/>
+      <w:r/>
     </w:p>
     <w:p>
       <w:pPr>
@@ -9389,6 +9580,7 @@
         <w:ind/>
         <w:rPr/>
       </w:pPr>
+      <w:r/>
       <w:hyperlink w:tooltip="#_Toc2" w:anchor="_Toc2" w:history="1">
         <w:r>
           <w:rPr>
@@ -9413,11 +9605,12 @@
           <w:fldChar w:fldCharType="begin"/>
           <w:instrText xml:space="preserve">PAGEREF _Toc2 \h</w:instrText>
           <w:fldChar w:fldCharType="separate"/>
-          <w:t xml:space="preserve">22</w:t>
+          <w:t xml:space="preserve">20</w:t>
           <w:fldChar w:fldCharType="end"/>
         </w:r>
       </w:hyperlink>
       <w:r/>
+      <w:r/>
     </w:p>
     <w:p>
       <w:pPr>
@@ -9430,6 +9623,7 @@
         <w:ind/>
         <w:rPr/>
       </w:pPr>
+      <w:r/>
       <w:hyperlink w:tooltip="#_Toc3" w:anchor="_Toc3" w:history="1">
         <w:r>
           <w:rPr>
@@ -9454,11 +9648,12 @@
           <w:fldChar w:fldCharType="begin"/>
           <w:instrText xml:space="preserve">PAGEREF _Toc3 \h</w:instrText>
           <w:fldChar w:fldCharType="separate"/>
-          <w:t xml:space="preserve">22</w:t>
+          <w:t xml:space="preserve">20</w:t>
           <w:fldChar w:fldCharType="end"/>
         </w:r>
       </w:hyperlink>
       <w:r/>
+      <w:r/>
     </w:p>
     <w:p>
       <w:pPr>
@@ -9471,6 +9666,7 @@
         <w:ind/>
         <w:rPr/>
       </w:pPr>
+      <w:r/>
       <w:hyperlink w:tooltip="#_Toc4" w:anchor="_Toc4" w:history="1">
         <w:r>
           <w:rPr>
@@ -9495,11 +9691,12 @@
           <w:fldChar w:fldCharType="begin"/>
           <w:instrText xml:space="preserve">PAGEREF _Toc4 \h</w:instrText>
           <w:fldChar w:fldCharType="separate"/>
-          <w:t xml:space="preserve">23</w:t>
+          <w:t xml:space="preserve">21</w:t>
           <w:fldChar w:fldCharType="end"/>
         </w:r>
       </w:hyperlink>
       <w:r/>
+      <w:r/>
     </w:p>
     <w:p>
       <w:pPr>
@@ -9512,6 +9709,7 @@
         <w:ind/>
         <w:rPr/>
       </w:pPr>
+      <w:r/>
       <w:hyperlink w:tooltip="#_Toc5" w:anchor="_Toc5" w:history="1">
         <w:r>
           <w:rPr>
@@ -9536,11 +9734,12 @@
           <w:fldChar w:fldCharType="begin"/>
           <w:instrText xml:space="preserve">PAGEREF _Toc5 \h</w:instrText>
           <w:fldChar w:fldCharType="separate"/>
-          <w:t xml:space="preserve">23</w:t>
+          <w:t xml:space="preserve">21</w:t>
           <w:fldChar w:fldCharType="end"/>
         </w:r>
       </w:hyperlink>
       <w:r/>
+      <w:r/>
     </w:p>
     <w:p>
       <w:pPr>
@@ -9553,6 +9752,7 @@
         <w:ind/>
         <w:rPr/>
       </w:pPr>
+      <w:r/>
       <w:hyperlink w:tooltip="#_Toc6" w:anchor="_Toc6" w:history="1">
         <w:r>
           <w:rPr>
@@ -9577,11 +9777,12 @@
           <w:fldChar w:fldCharType="begin"/>
           <w:instrText xml:space="preserve">PAGEREF _Toc6 \h</w:instrText>
           <w:fldChar w:fldCharType="separate"/>
-          <w:t xml:space="preserve">23</w:t>
+          <w:t xml:space="preserve">21</w:t>
           <w:fldChar w:fldCharType="end"/>
         </w:r>
       </w:hyperlink>
       <w:r/>
+      <w:r/>
     </w:p>
     <w:p>
       <w:pPr>
@@ -9594,6 +9795,7 @@
         <w:ind/>
         <w:rPr/>
       </w:pPr>
+      <w:r/>
       <w:hyperlink w:tooltip="#_Toc7" w:anchor="_Toc7" w:history="1">
         <w:r>
           <w:rPr>
@@ -9619,11 +9821,12 @@
           <w:fldChar w:fldCharType="begin"/>
           <w:instrText xml:space="preserve">PAGEREF _Toc7 \h</w:instrText>
           <w:fldChar w:fldCharType="separate"/>
-          <w:t xml:space="preserve">24</w:t>
+          <w:t xml:space="preserve">22</w:t>
           <w:fldChar w:fldCharType="end"/>
         </w:r>
       </w:hyperlink>
       <w:r/>
+      <w:r/>
     </w:p>
     <w:p>
       <w:pPr>
@@ -9636,6 +9839,7 @@
         <w:ind/>
         <w:rPr/>
       </w:pPr>
+      <w:r/>
       <w:hyperlink w:tooltip="#_Toc8" w:anchor="_Toc8" w:history="1">
         <w:r>
           <w:rPr>
@@ -9660,11 +9864,12 @@
           <w:fldChar w:fldCharType="begin"/>
           <w:instrText xml:space="preserve">PAGEREF _Toc8 \h</w:instrText>
           <w:fldChar w:fldCharType="separate"/>
-          <w:t xml:space="preserve">28</w:t>
+          <w:t xml:space="preserve">26</w:t>
           <w:fldChar w:fldCharType="end"/>
         </w:r>
       </w:hyperlink>
       <w:r/>
+      <w:r/>
     </w:p>
     <w:p>
       <w:pPr>
@@ -9677,6 +9882,7 @@
         <w:ind/>
         <w:rPr/>
       </w:pPr>
+      <w:r/>
       <w:hyperlink w:tooltip="#_Toc9" w:anchor="_Toc9" w:history="1">
         <w:r>
           <w:rPr>
@@ -9701,11 +9907,12 @@
           <w:fldChar w:fldCharType="begin"/>
           <w:instrText xml:space="preserve">PAGEREF _Toc9 \h</w:instrText>
           <w:fldChar w:fldCharType="separate"/>
-          <w:t xml:space="preserve">28</w:t>
+          <w:t xml:space="preserve">26</w:t>
           <w:fldChar w:fldCharType="end"/>
         </w:r>
       </w:hyperlink>
       <w:r/>
+      <w:r/>
     </w:p>
     <w:p>
       <w:pPr>
@@ -9718,6 +9925,7 @@
         <w:ind/>
         <w:rPr/>
       </w:pPr>
+      <w:r/>
       <w:hyperlink w:tooltip="#_Toc10" w:anchor="_Toc10" w:history="1">
         <w:r>
           <w:rPr>
@@ -9742,11 +9950,12 @@
           <w:fldChar w:fldCharType="begin"/>
           <w:instrText xml:space="preserve">PAGEREF _Toc10 \h</w:instrText>
           <w:fldChar w:fldCharType="separate"/>
-          <w:t xml:space="preserve">29</w:t>
+          <w:t xml:space="preserve">27</w:t>
           <w:fldChar w:fldCharType="end"/>
         </w:r>
       </w:hyperlink>
       <w:r/>
+      <w:r/>
     </w:p>
     <w:p>
       <w:pPr>
@@ -9759,6 +9968,7 @@
         <w:ind/>
         <w:rPr/>
       </w:pPr>
+      <w:r/>
       <w:hyperlink w:tooltip="#_Toc11" w:anchor="_Toc11" w:history="1">
         <w:r>
           <w:rPr>
@@ -9783,11 +9993,12 @@
           <w:fldChar w:fldCharType="begin"/>
           <w:instrText xml:space="preserve">PAGEREF _Toc11 \h</w:instrText>
           <w:fldChar w:fldCharType="separate"/>
-          <w:t xml:space="preserve">29</w:t>
+          <w:t xml:space="preserve">27</w:t>
           <w:fldChar w:fldCharType="end"/>
         </w:r>
       </w:hyperlink>
       <w:r/>
+      <w:r/>
     </w:p>
     <w:p>
       <w:pPr>
@@ -9800,6 +10011,7 @@
         <w:ind/>
         <w:rPr/>
       </w:pPr>
+      <w:r/>
       <w:hyperlink w:tooltip="#_Toc12" w:anchor="_Toc12" w:history="1">
         <w:r>
           <w:rPr>
@@ -9824,11 +10036,12 @@
           <w:fldChar w:fldCharType="begin"/>
           <w:instrText xml:space="preserve">PAGEREF _Toc12 \h</w:instrText>
           <w:fldChar w:fldCharType="separate"/>
-          <w:t xml:space="preserve">29</w:t>
+          <w:t xml:space="preserve">27</w:t>
           <w:fldChar w:fldCharType="end"/>
         </w:r>
       </w:hyperlink>
       <w:r/>
+      <w:r/>
     </w:p>
     <w:p>
       <w:pPr>
@@ -9841,6 +10054,7 @@
         <w:ind/>
         <w:rPr/>
       </w:pPr>
+      <w:r/>
       <w:hyperlink w:tooltip="#_Toc13" w:anchor="_Toc13" w:history="1">
         <w:r>
           <w:rPr>
@@ -9865,11 +10079,12 @@
           <w:fldChar w:fldCharType="begin"/>
           <w:instrText xml:space="preserve">PAGEREF _Toc13 \h</w:instrText>
           <w:fldChar w:fldCharType="separate"/>
-          <w:t xml:space="preserve">30</w:t>
+          <w:t xml:space="preserve">28</w:t>
           <w:fldChar w:fldCharType="end"/>
         </w:r>
       </w:hyperlink>
       <w:r/>
+      <w:r/>
     </w:p>
     <w:p>
       <w:pPr>
@@ -9882,6 +10097,7 @@
         <w:ind/>
         <w:rPr/>
       </w:pPr>
+      <w:r/>
       <w:hyperlink w:tooltip="#_Toc14" w:anchor="_Toc14" w:history="1">
         <w:r>
           <w:rPr>
@@ -9906,11 +10122,12 @@
           <w:fldChar w:fldCharType="begin"/>
           <w:instrText xml:space="preserve">PAGEREF _Toc14 \h</w:instrText>
           <w:fldChar w:fldCharType="separate"/>
-          <w:t xml:space="preserve">32</w:t>
+          <w:t xml:space="preserve">30</w:t>
           <w:fldChar w:fldCharType="end"/>
         </w:r>
       </w:hyperlink>
       <w:r/>
+      <w:r/>
     </w:p>
     <w:p>
       <w:pPr>
@@ -9923,6 +10140,7 @@
         <w:ind/>
         <w:rPr/>
       </w:pPr>
+      <w:r/>
       <w:hyperlink w:tooltip="#_Toc15" w:anchor="_Toc15" w:history="1">
         <w:r>
           <w:rPr>
@@ -9947,11 +10165,12 @@
           <w:fldChar w:fldCharType="begin"/>
           <w:instrText xml:space="preserve">PAGEREF _Toc15 \h</w:instrText>
           <w:fldChar w:fldCharType="separate"/>
-          <w:t xml:space="preserve">35</w:t>
+          <w:t xml:space="preserve">33</w:t>
           <w:fldChar w:fldCharType="end"/>
         </w:r>
       </w:hyperlink>
       <w:r/>
+      <w:r/>
     </w:p>
     <w:p>
       <w:pPr>
@@ -9964,6 +10183,7 @@
         <w:ind/>
         <w:rPr/>
       </w:pPr>
+      <w:r/>
       <w:hyperlink w:tooltip="#_Toc16" w:anchor="_Toc16" w:history="1">
         <w:r>
           <w:rPr>
@@ -9988,11 +10208,12 @@
           <w:fldChar w:fldCharType="begin"/>
           <w:instrText xml:space="preserve">PAGEREF _Toc16 \h</w:instrText>
           <w:fldChar w:fldCharType="separate"/>
-          <w:t xml:space="preserve">35</w:t>
+          <w:t xml:space="preserve">33</w:t>
           <w:fldChar w:fldCharType="end"/>
         </w:r>
       </w:hyperlink>
       <w:r/>
+      <w:r/>
     </w:p>
     <w:p>
       <w:pPr>
@@ -10005,6 +10226,7 @@
         <w:ind/>
         <w:rPr/>
       </w:pPr>
+      <w:r/>
       <w:hyperlink w:tooltip="#_Toc17" w:anchor="_Toc17" w:history="1">
         <w:r>
           <w:rPr>
@@ -10029,11 +10251,12 @@
           <w:fldChar w:fldCharType="begin"/>
           <w:instrText xml:space="preserve">PAGEREF _Toc17 \h</w:instrText>
           <w:fldChar w:fldCharType="separate"/>
-          <w:t xml:space="preserve">37</w:t>
+          <w:t xml:space="preserve">35</w:t>
           <w:fldChar w:fldCharType="end"/>
         </w:r>
       </w:hyperlink>
       <w:r/>
+      <w:r/>
     </w:p>
     <w:p>
       <w:pPr>
@@ -10046,6 +10269,7 @@
         <w:ind/>
         <w:rPr/>
       </w:pPr>
+      <w:r/>
       <w:hyperlink w:tooltip="#_Toc18" w:anchor="_Toc18" w:history="1">
         <w:r>
           <w:rPr>
@@ -10070,11 +10294,12 @@
           <w:fldChar w:fldCharType="begin"/>
           <w:instrText xml:space="preserve">PAGEREF _Toc18 \h</w:instrText>
           <w:fldChar w:fldCharType="separate"/>
-          <w:t xml:space="preserve">37</w:t>
+          <w:t xml:space="preserve">35</w:t>
           <w:fldChar w:fldCharType="end"/>
         </w:r>
       </w:hyperlink>
       <w:r/>
+      <w:r/>
     </w:p>
     <w:p>
       <w:pPr>
@@ -10087,6 +10312,7 @@
         <w:ind/>
         <w:rPr/>
       </w:pPr>
+      <w:r/>
       <w:hyperlink w:tooltip="#_Toc19" w:anchor="_Toc19" w:history="1">
         <w:r>
           <w:rPr>
@@ -10111,11 +10337,12 @@
           <w:fldChar w:fldCharType="begin"/>
           <w:instrText xml:space="preserve">PAGEREF _Toc19 \h</w:instrText>
           <w:fldChar w:fldCharType="separate"/>
-          <w:t xml:space="preserve">37</w:t>
+          <w:t xml:space="preserve">35</w:t>
           <w:fldChar w:fldCharType="end"/>
         </w:r>
       </w:hyperlink>
       <w:r/>
+      <w:r/>
     </w:p>
     <w:p>
       <w:pPr>
@@ -10128,6 +10355,7 @@
         <w:ind/>
         <w:rPr/>
       </w:pPr>
+      <w:r/>
       <w:hyperlink w:tooltip="#_Toc20" w:anchor="_Toc20" w:history="1">
         <w:r>
           <w:rPr>
@@ -10152,11 +10380,12 @@
           <w:fldChar w:fldCharType="begin"/>
           <w:instrText xml:space="preserve">PAGEREF _Toc20 \h</w:instrText>
           <w:fldChar w:fldCharType="separate"/>
-          <w:t xml:space="preserve">38</w:t>
+          <w:t xml:space="preserve">36</w:t>
           <w:fldChar w:fldCharType="end"/>
         </w:r>
       </w:hyperlink>
       <w:r/>
+      <w:r/>
     </w:p>
     <w:p>
       <w:pPr>
@@ -10169,6 +10398,7 @@
         <w:ind/>
         <w:rPr/>
       </w:pPr>
+      <w:r/>
       <w:hyperlink w:tooltip="#_Toc21" w:anchor="_Toc21" w:history="1">
         <w:r>
           <w:rPr>
@@ -10193,11 +10423,12 @@
           <w:fldChar w:fldCharType="begin"/>
           <w:instrText xml:space="preserve">PAGEREF _Toc21 \h</w:instrText>
           <w:fldChar w:fldCharType="separate"/>
-          <w:t xml:space="preserve">38</w:t>
+          <w:t xml:space="preserve">36</w:t>
           <w:fldChar w:fldCharType="end"/>
         </w:r>
       </w:hyperlink>
       <w:r/>
+      <w:r/>
     </w:p>
     <w:p>
       <w:pPr>
@@ -10210,6 +10441,7 @@
         <w:ind/>
         <w:rPr/>
       </w:pPr>
+      <w:r/>
       <w:hyperlink w:tooltip="#_Toc22" w:anchor="_Toc22" w:history="1">
         <w:r>
           <w:rPr>
@@ -10234,11 +10466,12 @@
           <w:fldChar w:fldCharType="begin"/>
           <w:instrText xml:space="preserve">PAGEREF _Toc22 \h</w:instrText>
           <w:fldChar w:fldCharType="separate"/>
-          <w:t xml:space="preserve">40</w:t>
+          <w:t xml:space="preserve">38</w:t>
           <w:fldChar w:fldCharType="end"/>
         </w:r>
       </w:hyperlink>
       <w:r/>
+      <w:r/>
     </w:p>
     <w:p>
       <w:pPr>
@@ -10251,6 +10484,7 @@
         <w:ind/>
         <w:rPr/>
       </w:pPr>
+      <w:r/>
       <w:hyperlink w:tooltip="#_Toc23" w:anchor="_Toc23" w:history="1">
         <w:r>
           <w:rPr>
@@ -10275,11 +10509,12 @@
           <w:fldChar w:fldCharType="begin"/>
           <w:instrText xml:space="preserve">PAGEREF _Toc23 \h</w:instrText>
           <w:fldChar w:fldCharType="separate"/>
-          <w:t xml:space="preserve">41</w:t>
+          <w:t xml:space="preserve">39</w:t>
           <w:fldChar w:fldCharType="end"/>
         </w:r>
       </w:hyperlink>
       <w:r/>
+      <w:r/>
     </w:p>
     <w:p>
       <w:pPr>
@@ -10292,6 +10527,7 @@
         <w:ind/>
         <w:rPr/>
       </w:pPr>
+      <w:r/>
       <w:hyperlink w:tooltip="#_Toc24" w:anchor="_Toc24" w:history="1">
         <w:r>
           <w:rPr>
@@ -10316,10 +10552,11 @@
           <w:fldChar w:fldCharType="begin"/>
           <w:instrText xml:space="preserve">PAGEREF _Toc24 \h</w:instrText>
           <w:fldChar w:fldCharType="separate"/>
-          <w:t xml:space="preserve">42</w:t>
+          <w:t xml:space="preserve">40</w:t>
           <w:fldChar w:fldCharType="end"/>
         </w:r>
       </w:hyperlink>
+      <w:r/>
       <w:r/>
     </w:p>
     <w:p>
@@ -10334,6 +10571,7 @@
         <w:ind/>
         <w:rPr/>
       </w:pPr>
+      <w:r/>
       <w:hyperlink w:tooltip="#_Toc25" w:anchor="_Toc25" w:history="1">
         <w:r>
           <w:rPr>
@@ -10364,11 +10602,12 @@
           <w:fldChar w:fldCharType="begin"/>
           <w:instrText xml:space="preserve">PAGEREF _Toc25 \h</w:instrText>
           <w:fldChar w:fldCharType="separate"/>
-          <w:t xml:space="preserve">42</w:t>
+          <w:t xml:space="preserve">40</w:t>
           <w:fldChar w:fldCharType="end"/>
         </w:r>
       </w:hyperlink>
       <w:r/>
+      <w:r/>
     </w:p>
     <w:p>
       <w:pPr>
@@ -10381,6 +10620,7 @@
         <w:ind/>
         <w:rPr/>
       </w:pPr>
+      <w:r/>
       <w:hyperlink w:tooltip="#_Toc26" w:anchor="_Toc26" w:history="1">
         <w:r>
           <w:rPr>
@@ -10405,11 +10645,12 @@
           <w:fldChar w:fldCharType="begin"/>
           <w:instrText xml:space="preserve">PAGEREF _Toc26 \h</w:instrText>
           <w:fldChar w:fldCharType="separate"/>
-          <w:t xml:space="preserve">43</w:t>
+          <w:t xml:space="preserve">41</w:t>
           <w:fldChar w:fldCharType="end"/>
         </w:r>
       </w:hyperlink>
       <w:r/>
+      <w:r/>
     </w:p>
     <w:p>
       <w:pPr>
@@ -10422,6 +10663,7 @@
         <w:ind/>
         <w:rPr/>
       </w:pPr>
+      <w:r/>
       <w:hyperlink w:tooltip="#_Toc27" w:anchor="_Toc27" w:history="1">
         <w:r>
           <w:rPr>
@@ -10446,11 +10688,12 @@
           <w:fldChar w:fldCharType="begin"/>
           <w:instrText xml:space="preserve">PAGEREF _Toc27 \h</w:instrText>
           <w:fldChar w:fldCharType="separate"/>
-          <w:t xml:space="preserve">44</w:t>
+          <w:t xml:space="preserve">42</w:t>
           <w:fldChar w:fldCharType="end"/>
         </w:r>
       </w:hyperlink>
       <w:r/>
+      <w:r/>
     </w:p>
     <w:p>
       <w:pPr>
@@ -10463,6 +10706,7 @@
         <w:ind/>
         <w:rPr/>
       </w:pPr>
+      <w:r/>
       <w:hyperlink w:tooltip="#_Toc28" w:anchor="_Toc28" w:history="1">
         <w:r>
           <w:rPr>
@@ -10487,11 +10731,12 @@
           <w:fldChar w:fldCharType="begin"/>
           <w:instrText xml:space="preserve">PAGEREF _Toc28 \h</w:instrText>
           <w:fldChar w:fldCharType="separate"/>
-          <w:t xml:space="preserve">46</w:t>
+          <w:t xml:space="preserve">44</w:t>
           <w:fldChar w:fldCharType="end"/>
         </w:r>
       </w:hyperlink>
       <w:r/>
+      <w:r/>
     </w:p>
     <w:p>
       <w:pPr>
@@ -10504,6 +10749,7 @@
         <w:ind/>
         <w:rPr/>
       </w:pPr>
+      <w:r/>
       <w:hyperlink w:tooltip="#_Toc29" w:anchor="_Toc29" w:history="1">
         <w:r>
           <w:rPr>
@@ -10528,11 +10774,12 @@
           <w:fldChar w:fldCharType="begin"/>
           <w:instrText xml:space="preserve">PAGEREF _Toc29 \h</w:instrText>
           <w:fldChar w:fldCharType="separate"/>
-          <w:t xml:space="preserve">46</w:t>
+          <w:t xml:space="preserve">44</w:t>
           <w:fldChar w:fldCharType="end"/>
         </w:r>
       </w:hyperlink>
       <w:r/>
+      <w:r/>
     </w:p>
     <w:p>
       <w:pPr>
@@ -10545,6 +10792,7 @@
         <w:ind/>
         <w:rPr/>
       </w:pPr>
+      <w:r/>
       <w:hyperlink w:tooltip="#_Toc30" w:anchor="_Toc30" w:history="1">
         <w:r>
           <w:rPr>
@@ -10569,11 +10817,12 @@
           <w:fldChar w:fldCharType="begin"/>
           <w:instrText xml:space="preserve">PAGEREF _Toc30 \h</w:instrText>
           <w:fldChar w:fldCharType="separate"/>
-          <w:t xml:space="preserve">46</w:t>
+          <w:t xml:space="preserve">44</w:t>
           <w:fldChar w:fldCharType="end"/>
         </w:r>
       </w:hyperlink>
       <w:r/>
+      <w:r/>
     </w:p>
     <w:p>
       <w:pPr>
@@ -10586,6 +10835,7 @@
         <w:ind/>
         <w:rPr/>
       </w:pPr>
+      <w:r/>
       <w:hyperlink w:tooltip="#_Toc31" w:anchor="_Toc31" w:history="1">
         <w:r>
           <w:rPr>
@@ -10616,11 +10866,12 @@
           <w:fldChar w:fldCharType="begin"/>
           <w:instrText xml:space="preserve">PAGEREF _Toc31 \h</w:instrText>
           <w:fldChar w:fldCharType="separate"/>
-          <w:t xml:space="preserve">54</w:t>
+          <w:t xml:space="preserve">52</w:t>
           <w:fldChar w:fldCharType="end"/>
         </w:r>
       </w:hyperlink>
       <w:r/>
+      <w:r/>
     </w:p>
     <w:p>
       <w:pPr>
@@ -10633,6 +10884,7 @@
         <w:ind/>
         <w:rPr/>
       </w:pPr>
+      <w:r/>
       <w:hyperlink w:tooltip="#_Toc32" w:anchor="_Toc32" w:history="1">
         <w:r>
           <w:rPr>
@@ -10657,11 +10909,12 @@
           <w:fldChar w:fldCharType="begin"/>
           <w:instrText xml:space="preserve">PAGEREF _Toc32 \h</w:instrText>
           <w:fldChar w:fldCharType="separate"/>
-          <w:t xml:space="preserve">59</w:t>
+          <w:t xml:space="preserve">57</w:t>
           <w:fldChar w:fldCharType="end"/>
         </w:r>
       </w:hyperlink>
       <w:r/>
+      <w:r/>
     </w:p>
     <w:p>
       <w:pPr>
@@ -10674,6 +10927,7 @@
         <w:ind/>
         <w:rPr/>
       </w:pPr>
+      <w:r/>
       <w:hyperlink w:tooltip="#_Toc33" w:anchor="_Toc33" w:history="1">
         <w:r>
           <w:rPr>
@@ -10698,11 +10952,12 @@
           <w:fldChar w:fldCharType="begin"/>
           <w:instrText xml:space="preserve">PAGEREF _Toc33 \h</w:instrText>
           <w:fldChar w:fldCharType="separate"/>
-          <w:t xml:space="preserve">62</w:t>
+          <w:t xml:space="preserve">60</w:t>
           <w:fldChar w:fldCharType="end"/>
         </w:r>
       </w:hyperlink>
       <w:r/>
+      <w:r/>
     </w:p>
     <w:p>
       <w:pPr>
@@ -10715,6 +10970,7 @@
         <w:ind/>
         <w:rPr/>
       </w:pPr>
+      <w:r/>
       <w:hyperlink w:tooltip="#_Toc34" w:anchor="_Toc34" w:history="1">
         <w:r>
           <w:rPr>
@@ -10739,11 +10995,12 @@
           <w:fldChar w:fldCharType="begin"/>
           <w:instrText xml:space="preserve">PAGEREF _Toc34 \h</w:instrText>
           <w:fldChar w:fldCharType="separate"/>
-          <w:t xml:space="preserve">62</w:t>
+          <w:t xml:space="preserve">60</w:t>
           <w:fldChar w:fldCharType="end"/>
         </w:r>
       </w:hyperlink>
       <w:r/>
+      <w:r/>
     </w:p>
     <w:p>
       <w:pPr>
@@ -10756,6 +11013,7 @@
         <w:ind/>
         <w:rPr/>
       </w:pPr>
+      <w:r/>
       <w:hyperlink w:tooltip="#_Toc35" w:anchor="_Toc35" w:history="1">
         <w:r>
           <w:rPr>
@@ -10780,11 +11038,12 @@
           <w:fldChar w:fldCharType="begin"/>
           <w:instrText xml:space="preserve">PAGEREF _Toc35 \h</w:instrText>
           <w:fldChar w:fldCharType="separate"/>
-          <w:t xml:space="preserve">62</w:t>
+          <w:t xml:space="preserve">60</w:t>
           <w:fldChar w:fldCharType="end"/>
         </w:r>
       </w:hyperlink>
       <w:r/>
+      <w:r/>
     </w:p>
     <w:p>
       <w:pPr>
@@ -10797,6 +11056,7 @@
         <w:ind/>
         <w:rPr/>
       </w:pPr>
+      <w:r/>
       <w:hyperlink w:tooltip="#_Toc36" w:anchor="_Toc36" w:history="1">
         <w:r>
           <w:rPr>
@@ -10821,11 +11081,12 @@
           <w:fldChar w:fldCharType="begin"/>
           <w:instrText xml:space="preserve">PAGEREF _Toc36 \h</w:instrText>
           <w:fldChar w:fldCharType="separate"/>
-          <w:t xml:space="preserve">63</w:t>
+          <w:t xml:space="preserve">61</w:t>
           <w:fldChar w:fldCharType="end"/>
         </w:r>
       </w:hyperlink>
       <w:r/>
+      <w:r/>
     </w:p>
     <w:p>
       <w:pPr>
@@ -10838,6 +11099,7 @@
         <w:ind/>
         <w:rPr/>
       </w:pPr>
+      <w:r/>
       <w:hyperlink w:tooltip="#_Toc37" w:anchor="_Toc37" w:history="1">
         <w:r>
           <w:rPr>
@@ -10862,11 +11124,12 @@
           <w:fldChar w:fldCharType="begin"/>
           <w:instrText xml:space="preserve">PAGEREF _Toc37 \h</w:instrText>
           <w:fldChar w:fldCharType="separate"/>
-          <w:t xml:space="preserve">65</w:t>
+          <w:t xml:space="preserve">63</w:t>
           <w:fldChar w:fldCharType="end"/>
         </w:r>
       </w:hyperlink>
       <w:r/>
+      <w:r/>
     </w:p>
     <w:p>
       <w:pPr>
@@ -10879,6 +11142,7 @@
         <w:ind/>
         <w:rPr/>
       </w:pPr>
+      <w:r/>
       <w:hyperlink w:tooltip="#_Toc38" w:anchor="_Toc38" w:history="1">
         <w:r>
           <w:rPr>
@@ -10903,11 +11167,12 @@
           <w:fldChar w:fldCharType="begin"/>
           <w:instrText xml:space="preserve">PAGEREF _Toc38 \h</w:instrText>
           <w:fldChar w:fldCharType="separate"/>
-          <w:t xml:space="preserve">65</w:t>
+          <w:t xml:space="preserve">63</w:t>
           <w:fldChar w:fldCharType="end"/>
         </w:r>
       </w:hyperlink>
       <w:r/>
+      <w:r/>
     </w:p>
     <w:p>
       <w:pPr>
@@ -10920,6 +11185,7 @@
         <w:ind/>
         <w:rPr/>
       </w:pPr>
+      <w:r/>
       <w:hyperlink w:tooltip="#_Toc39" w:anchor="_Toc39" w:history="1">
         <w:r>
           <w:rPr>
@@ -10944,11 +11210,12 @@
           <w:fldChar w:fldCharType="begin"/>
           <w:instrText xml:space="preserve">PAGEREF _Toc39 \h</w:instrText>
           <w:fldChar w:fldCharType="separate"/>
-          <w:t xml:space="preserve">65</w:t>
+          <w:t xml:space="preserve">63</w:t>
           <w:fldChar w:fldCharType="end"/>
         </w:r>
       </w:hyperlink>
       <w:r/>
+      <w:r/>
     </w:p>
     <w:p>
       <w:pPr>
@@ -10961,6 +11228,7 @@
         <w:ind/>
         <w:rPr/>
       </w:pPr>
+      <w:r/>
       <w:hyperlink w:tooltip="#_Toc40" w:anchor="_Toc40" w:history="1">
         <w:r>
           <w:rPr>
@@ -10985,11 +11253,12 @@
           <w:fldChar w:fldCharType="begin"/>
           <w:instrText xml:space="preserve">PAGEREF _Toc40 \h</w:instrText>
           <w:fldChar w:fldCharType="separate"/>
-          <w:t xml:space="preserve">66</w:t>
+          <w:t xml:space="preserve">64</w:t>
           <w:fldChar w:fldCharType="end"/>
         </w:r>
       </w:hyperlink>
       <w:r/>
+      <w:r/>
     </w:p>
     <w:p>
       <w:pPr>
@@ -11002,6 +11271,7 @@
         <w:ind/>
         <w:rPr/>
       </w:pPr>
+      <w:r/>
       <w:hyperlink w:tooltip="#_Toc41" w:anchor="_Toc41" w:history="1">
         <w:r>
           <w:rPr>
@@ -11026,11 +11296,12 @@
           <w:fldChar w:fldCharType="begin"/>
           <w:instrText xml:space="preserve">PAGEREF _Toc41 \h</w:instrText>
           <w:fldChar w:fldCharType="separate"/>
-          <w:t xml:space="preserve">67</w:t>
+          <w:t xml:space="preserve">65</w:t>
           <w:fldChar w:fldCharType="end"/>
         </w:r>
       </w:hyperlink>
       <w:r/>
+      <w:r/>
     </w:p>
     <w:p>
       <w:pPr>
@@ -11043,6 +11314,7 @@
         <w:ind/>
         <w:rPr/>
       </w:pPr>
+      <w:r/>
       <w:hyperlink w:tooltip="#_Toc42" w:anchor="_Toc42" w:history="1">
         <w:r>
           <w:rPr>
@@ -11067,11 +11339,12 @@
           <w:fldChar w:fldCharType="begin"/>
           <w:instrText xml:space="preserve">PAGEREF _Toc42 \h</w:instrText>
           <w:fldChar w:fldCharType="separate"/>
-          <w:t xml:space="preserve">67</w:t>
+          <w:t xml:space="preserve">65</w:t>
           <w:fldChar w:fldCharType="end"/>
         </w:r>
       </w:hyperlink>
       <w:r/>
+      <w:r/>
     </w:p>
     <w:p>
       <w:pPr>
@@ -11084,6 +11357,7 @@
         <w:ind/>
         <w:rPr/>
       </w:pPr>
+      <w:r/>
       <w:hyperlink w:tooltip="#_Toc43" w:anchor="_Toc43" w:history="1">
         <w:r>
           <w:rPr>
@@ -11108,11 +11382,12 @@
           <w:fldChar w:fldCharType="begin"/>
           <w:instrText xml:space="preserve">PAGEREF _Toc43 \h</w:instrText>
           <w:fldChar w:fldCharType="separate"/>
-          <w:t xml:space="preserve">67</w:t>
+          <w:t xml:space="preserve">65</w:t>
           <w:fldChar w:fldCharType="end"/>
         </w:r>
       </w:hyperlink>
       <w:r/>
+      <w:r/>
     </w:p>
     <w:p>
       <w:pPr>
@@ -11125,6 +11400,7 @@
         <w:ind/>
         <w:rPr/>
       </w:pPr>
+      <w:r/>
       <w:hyperlink w:tooltip="#_Toc44" w:anchor="_Toc44" w:history="1">
         <w:r>
           <w:rPr>
@@ -11149,11 +11425,12 @@
           <w:fldChar w:fldCharType="begin"/>
           <w:instrText xml:space="preserve">PAGEREF _Toc44 \h</w:instrText>
           <w:fldChar w:fldCharType="separate"/>
-          <w:t xml:space="preserve">67</w:t>
+          <w:t xml:space="preserve">65</w:t>
           <w:fldChar w:fldCharType="end"/>
         </w:r>
       </w:hyperlink>
       <w:r/>
+      <w:r/>
     </w:p>
     <w:p>
       <w:pPr>
@@ -11166,6 +11443,7 @@
         <w:ind/>
         <w:rPr/>
       </w:pPr>
+      <w:r/>
       <w:hyperlink w:tooltip="#_Toc45" w:anchor="_Toc45" w:history="1">
         <w:r>
           <w:rPr>
@@ -11190,11 +11468,12 @@
           <w:fldChar w:fldCharType="begin"/>
           <w:instrText xml:space="preserve">PAGEREF _Toc45 \h</w:instrText>
           <w:fldChar w:fldCharType="separate"/>
-          <w:t xml:space="preserve">68</w:t>
+          <w:t xml:space="preserve">66</w:t>
           <w:fldChar w:fldCharType="end"/>
         </w:r>
       </w:hyperlink>
       <w:r/>
+      <w:r/>
     </w:p>
     <w:p>
       <w:pPr>
@@ -11207,6 +11486,7 @@
         <w:ind/>
         <w:rPr/>
       </w:pPr>
+      <w:r/>
       <w:hyperlink w:tooltip="#_Toc46" w:anchor="_Toc46" w:history="1">
         <w:r>
           <w:rPr>
@@ -11231,11 +11511,12 @@
           <w:fldChar w:fldCharType="begin"/>
           <w:instrText xml:space="preserve">PAGEREF _Toc46 \h</w:instrText>
           <w:fldChar w:fldCharType="separate"/>
-          <w:t xml:space="preserve">69</w:t>
+          <w:t xml:space="preserve">67</w:t>
           <w:fldChar w:fldCharType="end"/>
         </w:r>
       </w:hyperlink>
       <w:r/>
+      <w:r/>
     </w:p>
     <w:p>
       <w:pPr>
@@ -11248,6 +11529,7 @@
         <w:ind/>
         <w:rPr/>
       </w:pPr>
+      <w:r/>
       <w:hyperlink w:tooltip="#_Toc47" w:anchor="_Toc47" w:history="1">
         <w:r>
           <w:rPr>
@@ -11272,11 +11554,12 @@
           <w:fldChar w:fldCharType="begin"/>
           <w:instrText xml:space="preserve">PAGEREF _Toc47 \h</w:instrText>
           <w:fldChar w:fldCharType="separate"/>
-          <w:t xml:space="preserve">69</w:t>
+          <w:t xml:space="preserve">67</w:t>
           <w:fldChar w:fldCharType="end"/>
         </w:r>
       </w:hyperlink>
       <w:r/>
+      <w:r/>
     </w:p>
     <w:p>
       <w:pPr>
@@ -11289,6 +11572,7 @@
         <w:ind/>
         <w:rPr/>
       </w:pPr>
+      <w:r/>
       <w:hyperlink w:tooltip="#_Toc48" w:anchor="_Toc48" w:history="1">
         <w:r>
           <w:rPr>
@@ -11313,11 +11597,12 @@
           <w:fldChar w:fldCharType="begin"/>
           <w:instrText xml:space="preserve">PAGEREF _Toc48 \h</w:instrText>
           <w:fldChar w:fldCharType="separate"/>
-          <w:t xml:space="preserve">72</w:t>
+          <w:t xml:space="preserve">70</w:t>
           <w:fldChar w:fldCharType="end"/>
         </w:r>
       </w:hyperlink>
       <w:r/>
+      <w:r/>
     </w:p>
     <w:p>
       <w:pPr>
@@ -11330,6 +11615,7 @@
         <w:ind/>
         <w:rPr/>
       </w:pPr>
+      <w:r/>
       <w:hyperlink w:tooltip="#_Toc49" w:anchor="_Toc49" w:history="1">
         <w:r>
           <w:rPr>
@@ -11354,11 +11640,12 @@
           <w:fldChar w:fldCharType="begin"/>
           <w:instrText xml:space="preserve">PAGEREF _Toc49 \h</w:instrText>
           <w:fldChar w:fldCharType="separate"/>
-          <w:t xml:space="preserve">74</w:t>
+          <w:t xml:space="preserve">72</w:t>
           <w:fldChar w:fldCharType="end"/>
         </w:r>
       </w:hyperlink>
       <w:r/>
+      <w:r/>
     </w:p>
     <w:p>
       <w:pPr>
@@ -11371,6 +11658,7 @@
         <w:ind/>
         <w:rPr/>
       </w:pPr>
+      <w:r/>
       <w:hyperlink w:tooltip="#_Toc50" w:anchor="_Toc50" w:history="1">
         <w:r>
           <w:rPr>
@@ -11395,11 +11683,12 @@
           <w:fldChar w:fldCharType="begin"/>
           <w:instrText xml:space="preserve">PAGEREF _Toc50 \h</w:instrText>
           <w:fldChar w:fldCharType="separate"/>
-          <w:t xml:space="preserve">80</w:t>
+          <w:t xml:space="preserve">81</w:t>
           <w:fldChar w:fldCharType="end"/>
         </w:r>
       </w:hyperlink>
       <w:r/>
+      <w:r/>
     </w:p>
     <w:p>
       <w:pPr>
@@ -11412,6 +11701,7 @@
         <w:ind/>
         <w:rPr/>
       </w:pPr>
+      <w:r/>
       <w:hyperlink w:tooltip="#_Toc51" w:anchor="_Toc51" w:history="1">
         <w:r>
           <w:rPr>
@@ -11441,6 +11731,7 @@
         </w:r>
       </w:hyperlink>
       <w:r/>
+      <w:r/>
     </w:p>
     <w:p>
       <w:pPr>
@@ -11453,6 +11744,7 @@
         <w:ind/>
         <w:rPr/>
       </w:pPr>
+      <w:r/>
       <w:hyperlink w:tooltip="#_Toc52" w:anchor="_Toc52" w:history="1">
         <w:r>
           <w:rPr>
@@ -11482,6 +11774,7 @@
         </w:r>
       </w:hyperlink>
       <w:r/>
+      <w:r/>
     </w:p>
     <w:p>
       <w:pPr>
@@ -11494,6 +11787,7 @@
         <w:ind/>
         <w:rPr/>
       </w:pPr>
+      <w:r/>
       <w:hyperlink w:tooltip="#_Toc53" w:anchor="_Toc53" w:history="1">
         <w:r>
           <w:rPr>
@@ -11523,6 +11817,7 @@
         </w:r>
       </w:hyperlink>
       <w:r/>
+      <w:r/>
     </w:p>
     <w:p>
       <w:pPr>
@@ -11535,6 +11830,7 @@
         <w:ind/>
         <w:rPr/>
       </w:pPr>
+      <w:r/>
       <w:hyperlink w:tooltip="#_Toc54" w:anchor="_Toc54" w:history="1">
         <w:r>
           <w:rPr>
@@ -11564,6 +11860,7 @@
         </w:r>
       </w:hyperlink>
       <w:r/>
+      <w:r/>
     </w:p>
     <w:p>
       <w:pPr>
@@ -11576,6 +11873,7 @@
         <w:ind/>
         <w:rPr/>
       </w:pPr>
+      <w:r/>
       <w:hyperlink w:tooltip="#_Toc55" w:anchor="_Toc55" w:history="1">
         <w:r>
           <w:rPr>
@@ -11605,6 +11903,7 @@
         </w:r>
       </w:hyperlink>
       <w:r/>
+      <w:r/>
     </w:p>
     <w:p>
       <w:pPr>
@@ -11617,6 +11916,7 @@
         <w:ind/>
         <w:rPr/>
       </w:pPr>
+      <w:r/>
       <w:hyperlink w:tooltip="#_Toc56" w:anchor="_Toc56" w:history="1">
         <w:r>
           <w:rPr>
@@ -11646,6 +11946,7 @@
         </w:r>
       </w:hyperlink>
       <w:r/>
+      <w:r/>
     </w:p>
     <w:p>
       <w:pPr>
@@ -11658,6 +11959,7 @@
         <w:ind/>
         <w:rPr/>
       </w:pPr>
+      <w:r/>
       <w:hyperlink w:tooltip="#_Toc57" w:anchor="_Toc57" w:history="1">
         <w:r>
           <w:rPr>
@@ -11687,6 +11989,7 @@
         </w:r>
       </w:hyperlink>
       <w:r/>
+      <w:r/>
     </w:p>
     <w:p>
       <w:pPr>
@@ -11699,6 +12002,7 @@
         <w:ind/>
         <w:rPr/>
       </w:pPr>
+      <w:r/>
       <w:hyperlink w:tooltip="#_Toc58" w:anchor="_Toc58" w:history="1">
         <w:r>
           <w:rPr>
@@ -11728,6 +12032,7 @@
         </w:r>
       </w:hyperlink>
       <w:r/>
+      <w:r/>
     </w:p>
     <w:p>
       <w:pPr>
@@ -11740,6 +12045,7 @@
         <w:ind/>
         <w:rPr/>
       </w:pPr>
+      <w:r/>
       <w:hyperlink w:tooltip="#_Toc59" w:anchor="_Toc59" w:history="1">
         <w:r>
           <w:rPr>
@@ -11769,6 +12075,7 @@
         </w:r>
       </w:hyperlink>
       <w:r/>
+      <w:r/>
     </w:p>
     <w:p>
       <w:pPr>
@@ -11781,6 +12088,7 @@
         <w:ind/>
         <w:rPr/>
       </w:pPr>
+      <w:r/>
       <w:hyperlink w:tooltip="#_Toc60" w:anchor="_Toc60" w:history="1">
         <w:r>
           <w:rPr>
@@ -11810,6 +12118,7 @@
         </w:r>
       </w:hyperlink>
       <w:r/>
+      <w:r/>
     </w:p>
     <w:p>
       <w:pPr>
@@ -11822,6 +12131,7 @@
         <w:ind/>
         <w:rPr/>
       </w:pPr>
+      <w:r/>
       <w:hyperlink w:tooltip="#_Toc61" w:anchor="_Toc61" w:history="1">
         <w:r>
           <w:rPr>
@@ -11851,6 +12161,7 @@
         </w:r>
       </w:hyperlink>
       <w:r/>
+      <w:r/>
     </w:p>
     <w:p>
       <w:pPr>
@@ -11863,6 +12174,7 @@
         <w:ind/>
         <w:rPr/>
       </w:pPr>
+      <w:r/>
       <w:hyperlink w:tooltip="#_Toc62" w:anchor="_Toc62" w:history="1">
         <w:r>
           <w:rPr>
@@ -11892,6 +12204,7 @@
         </w:r>
       </w:hyperlink>
       <w:r/>
+      <w:r/>
     </w:p>
     <w:p>
       <w:pPr>
@@ -11904,6 +12217,7 @@
         <w:ind/>
         <w:rPr/>
       </w:pPr>
+      <w:r/>
       <w:hyperlink w:tooltip="#_Toc63" w:anchor="_Toc63" w:history="1">
         <w:r>
           <w:rPr>
@@ -11933,6 +12247,7 @@
         </w:r>
       </w:hyperlink>
       <w:r/>
+      <w:r/>
     </w:p>
     <w:p>
       <w:pPr>
@@ -11945,6 +12260,7 @@
         <w:ind/>
         <w:rPr/>
       </w:pPr>
+      <w:r/>
       <w:hyperlink w:tooltip="#_Toc64" w:anchor="_Toc64" w:history="1">
         <w:r>
           <w:rPr>
@@ -11974,6 +12290,7 @@
         </w:r>
       </w:hyperlink>
       <w:r/>
+      <w:r/>
     </w:p>
     <w:p>
       <w:pPr>
@@ -11986,6 +12303,7 @@
         <w:ind/>
         <w:rPr/>
       </w:pPr>
+      <w:r/>
       <w:hyperlink w:tooltip="#_Toc65" w:anchor="_Toc65" w:history="1">
         <w:r>
           <w:rPr>
@@ -12015,6 +12333,7 @@
         </w:r>
       </w:hyperlink>
       <w:r/>
+      <w:r/>
     </w:p>
     <w:p>
       <w:pPr>
@@ -12027,6 +12346,7 @@
         <w:ind/>
         <w:rPr/>
       </w:pPr>
+      <w:r/>
       <w:hyperlink w:tooltip="#_Toc66" w:anchor="_Toc66" w:history="1">
         <w:r>
           <w:rPr>
@@ -12056,6 +12376,7 @@
         </w:r>
       </w:hyperlink>
       <w:r/>
+      <w:r/>
     </w:p>
     <w:p>
       <w:pPr>
@@ -12068,6 +12389,7 @@
         <w:ind/>
         <w:rPr/>
       </w:pPr>
+      <w:r/>
       <w:hyperlink w:tooltip="#_Toc67" w:anchor="_Toc67" w:history="1">
         <w:r>
           <w:rPr>
@@ -12097,6 +12419,7 @@
         </w:r>
       </w:hyperlink>
       <w:r/>
+      <w:r/>
     </w:p>
     <w:p>
       <w:pPr>
@@ -12109,6 +12432,7 @@
         <w:ind/>
         <w:rPr/>
       </w:pPr>
+      <w:r/>
       <w:hyperlink w:tooltip="#_Toc68" w:anchor="_Toc68" w:history="1">
         <w:r>
           <w:rPr>
@@ -12138,6 +12462,7 @@
         </w:r>
       </w:hyperlink>
       <w:r/>
+      <w:r/>
     </w:p>
     <w:p>
       <w:pPr>
@@ -12150,6 +12475,7 @@
         <w:ind/>
         <w:rPr/>
       </w:pPr>
+      <w:r/>
       <w:hyperlink w:tooltip="#_Toc69" w:anchor="_Toc69" w:history="1">
         <w:r>
           <w:rPr>
@@ -12179,6 +12505,7 @@
         </w:r>
       </w:hyperlink>
       <w:r/>
+      <w:r/>
     </w:p>
     <w:p>
       <w:pPr>
@@ -12191,6 +12518,7 @@
         <w:ind/>
         <w:rPr/>
       </w:pPr>
+      <w:r/>
       <w:hyperlink w:tooltip="#_Toc70" w:anchor="_Toc70" w:history="1">
         <w:r>
           <w:rPr>
@@ -12220,6 +12548,7 @@
         </w:r>
       </w:hyperlink>
       <w:r/>
+      <w:r/>
     </w:p>
     <w:p>
       <w:pPr>
@@ -12232,6 +12561,7 @@
         <w:ind/>
         <w:rPr/>
       </w:pPr>
+      <w:r/>
       <w:hyperlink w:tooltip="#_Toc71" w:anchor="_Toc71" w:history="1">
         <w:r>
           <w:rPr>
@@ -12261,6 +12591,7 @@
         </w:r>
       </w:hyperlink>
       <w:r/>
+      <w:r/>
     </w:p>
     <w:p>
       <w:pPr>
@@ -12273,6 +12604,7 @@
         <w:ind/>
         <w:rPr/>
       </w:pPr>
+      <w:r/>
       <w:hyperlink w:tooltip="#_Toc72" w:anchor="_Toc72" w:history="1">
         <w:r>
           <w:rPr>
@@ -12302,6 +12634,7 @@
         </w:r>
       </w:hyperlink>
       <w:r/>
+      <w:r/>
     </w:p>
     <w:p>
       <w:pPr>
@@ -12314,6 +12647,7 @@
         <w:ind/>
         <w:rPr/>
       </w:pPr>
+      <w:r/>
       <w:hyperlink w:tooltip="#_Toc73" w:anchor="_Toc73" w:history="1">
         <w:r>
           <w:rPr>
@@ -12343,6 +12677,7 @@
         </w:r>
       </w:hyperlink>
       <w:r/>
+      <w:r/>
     </w:p>
     <w:p>
       <w:pPr>
@@ -12355,6 +12690,7 @@
         <w:ind/>
         <w:rPr/>
       </w:pPr>
+      <w:r/>
       <w:hyperlink w:tooltip="#_Toc74" w:anchor="_Toc74" w:history="1">
         <w:r>
           <w:rPr>
@@ -12384,6 +12720,7 @@
         </w:r>
       </w:hyperlink>
       <w:r/>
+      <w:r/>
     </w:p>
     <w:p>
       <w:pPr>
@@ -12396,6 +12733,7 @@
         <w:ind/>
         <w:rPr/>
       </w:pPr>
+      <w:r/>
       <w:hyperlink w:tooltip="#_Toc75" w:anchor="_Toc75" w:history="1">
         <w:r>
           <w:rPr>
@@ -12425,6 +12763,7 @@
         </w:r>
       </w:hyperlink>
       <w:r/>
+      <w:r/>
     </w:p>
     <w:p>
       <w:pPr>
@@ -12437,6 +12776,7 @@
         <w:ind/>
         <w:rPr/>
       </w:pPr>
+      <w:r/>
       <w:hyperlink w:tooltip="#_Toc76" w:anchor="_Toc76" w:history="1">
         <w:r>
           <w:rPr>
@@ -12466,6 +12806,7 @@
         </w:r>
       </w:hyperlink>
       <w:r/>
+      <w:r/>
     </w:p>
     <w:p>
       <w:pPr>
@@ -12478,6 +12819,7 @@
         <w:ind/>
         <w:rPr/>
       </w:pPr>
+      <w:r/>
       <w:hyperlink w:tooltip="#_Toc77" w:anchor="_Toc77" w:history="1">
         <w:r>
           <w:rPr>
@@ -12507,6 +12849,7 @@
         </w:r>
       </w:hyperlink>
       <w:r/>
+      <w:r/>
     </w:p>
     <w:p>
       <w:pPr>
@@ -12519,6 +12862,7 @@
         <w:ind/>
         <w:rPr/>
       </w:pPr>
+      <w:r/>
       <w:hyperlink w:tooltip="#_Toc78" w:anchor="_Toc78" w:history="1">
         <w:r>
           <w:rPr>
@@ -12548,6 +12892,7 @@
         </w:r>
       </w:hyperlink>
       <w:r/>
+      <w:r/>
     </w:p>
     <w:p>
       <w:pPr>
@@ -12560,6 +12905,7 @@
         <w:ind/>
         <w:rPr/>
       </w:pPr>
+      <w:r/>
       <w:hyperlink w:tooltip="#_Toc79" w:anchor="_Toc79" w:history="1">
         <w:r>
           <w:rPr>
@@ -12589,6 +12935,7 @@
         </w:r>
       </w:hyperlink>
       <w:r/>
+      <w:r/>
     </w:p>
     <w:p>
       <w:pPr>
@@ -12601,6 +12948,7 @@
         <w:ind/>
         <w:rPr/>
       </w:pPr>
+      <w:r/>
       <w:hyperlink w:tooltip="#_Toc80" w:anchor="_Toc80" w:history="1">
         <w:r>
           <w:rPr>
@@ -12630,6 +12978,7 @@
         </w:r>
       </w:hyperlink>
       <w:r/>
+      <w:r/>
     </w:p>
     <w:p>
       <w:pPr>
@@ -12642,6 +12991,7 @@
         <w:ind/>
         <w:rPr/>
       </w:pPr>
+      <w:r/>
       <w:hyperlink w:tooltip="#_Toc81" w:anchor="_Toc81" w:history="1">
         <w:r>
           <w:rPr>
@@ -12671,6 +13021,7 @@
         </w:r>
       </w:hyperlink>
       <w:r/>
+      <w:r/>
     </w:p>
     <w:p>
       <w:pPr>
@@ -12683,6 +13034,7 @@
         <w:ind/>
         <w:rPr/>
       </w:pPr>
+      <w:r/>
       <w:hyperlink w:tooltip="#_Toc82" w:anchor="_Toc82" w:history="1">
         <w:r>
           <w:rPr>
@@ -12712,6 +13064,7 @@
         </w:r>
       </w:hyperlink>
       <w:r/>
+      <w:r/>
     </w:p>
     <w:p>
       <w:pPr>
@@ -12724,6 +13077,7 @@
         <w:ind/>
         <w:rPr/>
       </w:pPr>
+      <w:r/>
       <w:hyperlink w:tooltip="#_Toc83" w:anchor="_Toc83" w:history="1">
         <w:r>
           <w:rPr>
@@ -12753,6 +13107,7 @@
         </w:r>
       </w:hyperlink>
       <w:r/>
+      <w:r/>
     </w:p>
     <w:p>
       <w:pPr>
@@ -12765,6 +13120,7 @@
         <w:ind/>
         <w:rPr/>
       </w:pPr>
+      <w:r/>
       <w:hyperlink w:tooltip="#_Toc84" w:anchor="_Toc84" w:history="1">
         <w:r>
           <w:rPr>
@@ -12794,6 +13150,7 @@
         </w:r>
       </w:hyperlink>
       <w:r/>
+      <w:r/>
     </w:p>
     <w:p>
       <w:pPr>
@@ -12806,6 +13163,7 @@
         <w:ind/>
         <w:rPr/>
       </w:pPr>
+      <w:r/>
       <w:hyperlink w:tooltip="#_Toc85" w:anchor="_Toc85" w:history="1">
         <w:r>
           <w:rPr>
@@ -12835,6 +13193,7 @@
         </w:r>
       </w:hyperlink>
       <w:r/>
+      <w:r/>
     </w:p>
     <w:p>
       <w:pPr>
@@ -12847,6 +13206,7 @@
         <w:ind/>
         <w:rPr/>
       </w:pPr>
+      <w:r/>
       <w:hyperlink w:tooltip="#_Toc86" w:anchor="_Toc86" w:history="1">
         <w:r>
           <w:rPr>
@@ -12876,6 +13236,7 @@
         </w:r>
       </w:hyperlink>
       <w:r/>
+      <w:r/>
     </w:p>
     <w:p>
       <w:pPr>
@@ -12888,6 +13249,7 @@
         <w:ind/>
         <w:rPr/>
       </w:pPr>
+      <w:r/>
       <w:hyperlink w:tooltip="#_Toc87" w:anchor="_Toc87" w:history="1">
         <w:r>
           <w:rPr>
@@ -12917,6 +13279,7 @@
         </w:r>
       </w:hyperlink>
       <w:r/>
+      <w:r/>
     </w:p>
     <w:p>
       <w:pPr>
@@ -12929,6 +13292,7 @@
         <w:ind/>
         <w:rPr/>
       </w:pPr>
+      <w:r/>
       <w:hyperlink w:tooltip="#_Toc88" w:anchor="_Toc88" w:history="1">
         <w:r>
           <w:rPr>
@@ -12958,6 +13322,7 @@
         </w:r>
       </w:hyperlink>
       <w:r/>
+      <w:r/>
     </w:p>
     <w:p>
       <w:pPr>
@@ -12970,6 +13335,7 @@
         <w:ind/>
         <w:rPr/>
       </w:pPr>
+      <w:r/>
       <w:hyperlink w:tooltip="#_Toc89" w:anchor="_Toc89" w:history="1">
         <w:r>
           <w:rPr>
@@ -12999,6 +13365,7 @@
         </w:r>
       </w:hyperlink>
       <w:r/>
+      <w:r/>
     </w:p>
     <w:p>
       <w:pPr>
@@ -13028,7 +13395,6 @@
       <w:r>
         <w:fldChar w:fldCharType="end"/>
       </w:r>
-      <w:r/>
       <w:r/>
     </w:p>
     <w:p>
@@ -13963,7 +14329,6 @@
         <w:ind/>
         <w:rPr/>
       </w:pPr>
-      <w:r/>
       <w:r>
         <w:t xml:space="preserve">FIGURA </w:t>
       </w:r>
@@ -13988,7 +14353,6 @@
       <w:r>
         <w:t xml:space="preserve">Colab</w:t>
       </w:r>
-      <w:r/>
       <w:r/>
     </w:p>
     <w:p>
@@ -14123,7 +14487,6 @@
         <w:ind/>
         <w:rPr/>
       </w:pPr>
-      <w:r/>
       <w:r>
         <w:t xml:space="preserve">FIGURA </w:t>
       </w:r>
@@ -14157,7 +14520,6 @@
       <w:r>
         <w:t xml:space="preserve">Colab</w:t>
       </w:r>
-      <w:r/>
       <w:r/>
     </w:p>
     <w:p>
@@ -14378,7 +14740,6 @@
         <w:ind/>
         <w:rPr/>
       </w:pPr>
-      <w:r/>
       <w:r>
         <w:t xml:space="preserve">FIGURA </w:t>
       </w:r>
@@ -14400,7 +14761,6 @@
       <w:r>
         <w:t xml:space="preserve"> - Seleção da unidade da federação na plataforma e-Ouve </w:t>
       </w:r>
-      <w:r/>
       <w:r/>
     </w:p>
     <w:p>
@@ -14533,7 +14893,6 @@
         <w:ind/>
         <w:rPr/>
       </w:pPr>
-      <w:r/>
       <w:r>
         <w:t xml:space="preserve">FIGURA </w:t>
       </w:r>
@@ -14555,7 +14914,6 @@
       <w:r>
         <w:t xml:space="preserve"> - Seleção de serviços na plataforma e-Ouve</w:t>
       </w:r>
-      <w:r/>
       <w:r/>
     </w:p>
     <w:p>
@@ -17875,7 +18233,6 @@
         <w:ind/>
         <w:rPr/>
       </w:pPr>
-      <w:r/>
       <w:r>
         <w:t xml:space="preserve">FIGURA </w:t>
       </w:r>
@@ -17897,7 +18254,6 @@
       <w:r>
         <w:t xml:space="preserve"> - Estrutura do repositório remoto no GitHub</w:t>
       </w:r>
-      <w:r/>
       <w:r/>
     </w:p>
     <w:p>
@@ -21712,13 +22068,12 @@
       <w:r>
         <w:t xml:space="preserve">5.2.1 Visão Funcional</w:t>
       </w:r>
+      <w:bookmarkEnd w:id="34"/>
       <w:r>
         <w:rPr>
           <w:color w:val="00b050"/>
         </w:rPr>
       </w:r>
-      <w:bookmarkEnd w:id="34"/>
-      <w:r/>
       <w:r>
         <w:rPr>
           <w:color w:val="00b050"/>
@@ -23758,7 +24113,6 @@
         <w:ind/>
         <w:rPr/>
       </w:pPr>
-      <w:r/>
       <w:r>
         <w:t xml:space="preserve">FIGURA </w:t>
       </w:r>
@@ -23786,7 +24140,6 @@
       <w:r>
         <w:t xml:space="preserve"> de usuário do respondente</w:t>
       </w:r>
-      <w:r/>
       <w:r/>
     </w:p>
     <w:p>
@@ -23951,7 +24304,6 @@
         <w:ind/>
         <w:rPr/>
       </w:pPr>
-      <w:r/>
       <w:r>
         <w:t xml:space="preserve">FIGURA </w:t>
       </w:r>
@@ -23979,7 +24331,6 @@
       <w:r>
         <w:t xml:space="preserve"> com aplicativos para registro de problemas da cidade</w:t>
       </w:r>
-      <w:r/>
       <w:r/>
     </w:p>
     <w:p>
@@ -24121,7 +24472,6 @@
         <w:ind/>
         <w:rPr/>
       </w:pPr>
-      <w:r/>
       <w:r>
         <w:t xml:space="preserve">FIGURA </w:t>
       </w:r>
@@ -24144,7 +24494,6 @@
         <w:t xml:space="preserve"> – Possibilidade de uso de um aplicativo para registrar ocorrências da cidade.</w:t>
       </w:r>
       <w:r/>
-      <w:r/>
     </w:p>
     <w:p>
       <w:pPr>
@@ -24520,10 +24869,13 @@
         <w:rPr/>
       </w:pPr>
       <w:r>
-        <w:t xml:space="preserve">A Figura 9 evidencia o atendimento das heurísticas “</w:t>
-      </w:r>
-      <w:r>
-        <w:t xml:space="preserve">visibilidade do status do sistema” e “correspondência entre o sistema e o mundo real”: cada ocorrência exibe o seu estado com cor semântica e rótulo textual, o identificador é apresentado como protocolo e as categorias são enunciadas em linguagem corrente.</w:t>
+        <w:t xml:space="preserve">A Figura 9 evidencia as heurísticas “visibilidade do status do sistema” e “correspondên</w:t>
+      </w:r>
+      <w:r>
+        <w:t xml:space="preserve">cia entre o sistema e o mundo real” na tela inicial: cada ocorrência da relação de recentes exibe o seu estado em rótulo textual acompanhado da cor semântica correspondente, a mesma empregada na legenda do mapa e na faixa “Situação das ocorrências”, que re</w:t>
+      </w:r>
+      <w:r>
+        <w:t xml:space="preserve">sume em uma única linha o total de registros do território em exibição; o identificador é apresentado como protocolo e as categorias são enunciadas em linguagem corrente, a exemplo de “Lixo Acumulado ou Terreno Sujo” e “Som Alto ou Perturbação do Sossego”.</w:t>
       </w:r>
       <w:r/>
     </w:p>
@@ -24540,9 +24892,9 @@
           <mc:Choice Requires="wpg">
             <w:drawing>
               <wp:inline xmlns:wp="http://schemas.openxmlformats.org/drawingml/2006/wordprocessingDrawing" distT="0" distB="0" distL="0" distR="0">
-                <wp:extent cx="5040000" cy="3143824"/>
+                <wp:extent cx="5760720" cy="2940618"/>
                 <wp:effectExtent l="0" t="0" r="0" b="0"/>
-                <wp:docPr id="10" name="Picture 1987165333"/>
+                <wp:docPr id="10" name=""/>
                 <wp:cNvGraphicFramePr>
                   <a:graphicFrameLocks xmlns:a="http://schemas.openxmlformats.org/drawingml/2006/main" noChangeAspect="1"/>
                 </wp:cNvGraphicFramePr>
@@ -24550,7 +24902,7 @@
                   <a:graphicData uri="http://schemas.openxmlformats.org/drawingml/2006/picture">
                     <pic:pic xmlns:pic="http://schemas.openxmlformats.org/drawingml/2006/picture">
                       <pic:nvPicPr>
-                        <pic:cNvPr id="0" name="FalaCidade_Prototipo_03_Inicio_v2.png"/>
+                        <pic:cNvPr id="1322156247" name=""/>
                         <pic:cNvPicPr>
                           <a:picLocks noChangeAspect="1"/>
                         </pic:cNvPicPr>
@@ -24563,7 +24915,7 @@
                       <pic:spPr bwMode="auto">
                         <a:xfrm>
                           <a:off x="0" y="0"/>
-                          <a:ext cx="5040000" cy="3143824"/>
+                          <a:ext cx="5760719" cy="2940618"/>
                         </a:xfrm>
                         <a:prstGeom prst="rect">
                           <a:avLst/>
@@ -24596,7 +24948,7 @@
                 <v:path o:extrusionok="f" gradientshapeok="t" o:connecttype="rect"/>
                 <o:lock v:ext="edit" aspectratio="t"/>
               </v:shapetype>
-              <v:shape id="_x0000_i9" o:spid="_x0000_s9" type="#_x0000_t75" style="width:396.85pt;height:247.55pt;mso-wrap-distance-left:0.00pt;mso-wrap-distance-top:0.00pt;mso-wrap-distance-right:0.00pt;mso-wrap-distance-bottom:0.00pt;z-index:1;" stroked="false">
+              <v:shape id="_x0000_i9" o:spid="_x0000_s9" type="#_x0000_t75" style="width:453.60pt;height:231.54pt;mso-wrap-distance-left:0.00pt;mso-wrap-distance-top:0.00pt;mso-wrap-distance-right:0.00pt;mso-wrap-distance-bottom:0.00pt;z-index:1;" stroked="false">
                 <v:imagedata r:id="rId26" o:title=""/>
                 <o:lock v:ext="edit" rotation="t"/>
               </v:shape>
@@ -24614,7 +24966,6 @@
         <w:ind/>
         <w:rPr/>
       </w:pPr>
-      <w:r/>
       <w:r>
         <w:t xml:space="preserve">FIGURA </w:t>
       </w:r>
@@ -24634,9 +24985,8 @@
         <w:fldChar w:fldCharType="end"/>
       </w:r>
       <w:r>
-        <w:t xml:space="preserve"> – Tela inicial: visibilidade do estado das ocorrências e correspondência com o mundo real</w:t>
-      </w:r>
-      <w:r/>
+        <w:t xml:space="preserve"> – Tela inicial: estado das ocorrências em cor e rótulo, protocolo e categorias em linguagem corrente</w:t>
+      </w:r>
       <w:r/>
     </w:p>
     <w:p>
@@ -24661,10 +25011,10 @@
         <w:rPr/>
       </w:pPr>
       <w:r>
-        <w:t xml:space="preserve">A Figura 10 evidencia as heurísticas “prevenção de erros” e “reconhecimento em lugar de memorização”: o</w:t>
-      </w:r>
-      <w:r>
-        <w:t xml:space="preserve">s campos obrigatórios são assinalados, a prioridade decorre automaticamente da categoria, o endereço é preenchido a partir do ponto marcado no mapa e a ação destrutiva de cancelamento é apresentada em posição e peso visual distintos da ação de confirmação.</w:t>
+        <w:t xml:space="preserve">A Figura 10 evidencia as heurísticas “reconhecimento em lugar de memorização” e “prevenção de erros” na primeira parte do formulário de registro: os campos obrigatórios são assinalados com asterisco, os textos de e</w:t>
+      </w:r>
+      <w:r>
+        <w:t xml:space="preserve">xemplo mostram o preenchimento esperado em vez de descrevê-lo, a categoria é escolhida em lista de seleção e não digitada, e o local da ocorrência é marcado por um clique sobre o mapa, o que dispensa o usuário de recordar a denominação exata do logradouro.</w:t>
       </w:r>
       <w:r/>
     </w:p>
@@ -24682,9 +25032,9 @@
           <mc:Choice Requires="wpg">
             <w:drawing>
               <wp:inline xmlns:wp="http://schemas.openxmlformats.org/drawingml/2006/wordprocessingDrawing" distT="0" distB="0" distL="0" distR="0">
-                <wp:extent cx="5040000" cy="6235714"/>
+                <wp:extent cx="4531065" cy="3754430"/>
                 <wp:effectExtent l="0" t="0" r="0" b="0"/>
-                <wp:docPr id="11" name="Picture 1987165334"/>
+                <wp:docPr id="11" name=""/>
                 <wp:cNvGraphicFramePr>
                   <a:graphicFrameLocks xmlns:a="http://schemas.openxmlformats.org/drawingml/2006/main" noChangeAspect="1"/>
                 </wp:cNvGraphicFramePr>
@@ -24692,7 +25042,7 @@
                   <a:graphicData uri="http://schemas.openxmlformats.org/drawingml/2006/picture">
                     <pic:pic xmlns:pic="http://schemas.openxmlformats.org/drawingml/2006/picture">
                       <pic:nvPicPr>
-                        <pic:cNvPr id="0" name="FalaCidade_Prototipo_04_RegistroOcorrencia_v2.png"/>
+                        <pic:cNvPr id="2002528871" name=""/>
                         <pic:cNvPicPr>
                           <a:picLocks noChangeAspect="1"/>
                         </pic:cNvPicPr>
@@ -24703,9 +25053,9 @@
                         <a:stretch/>
                       </pic:blipFill>
                       <pic:spPr bwMode="auto">
-                        <a:xfrm>
+                        <a:xfrm flipH="0" flipV="0">
                           <a:off x="0" y="0"/>
-                          <a:ext cx="5040000" cy="6235714"/>
+                          <a:ext cx="4531064" cy="3754429"/>
                         </a:xfrm>
                         <a:prstGeom prst="rect">
                           <a:avLst/>
@@ -24738,7 +25088,7 @@
                 <v:path o:extrusionok="f" gradientshapeok="t" o:connecttype="rect"/>
                 <o:lock v:ext="edit" aspectratio="t"/>
               </v:shapetype>
-              <v:shape id="_x0000_i10" o:spid="_x0000_s10" type="#_x0000_t75" style="width:396.85pt;height:491.00pt;mso-wrap-distance-left:0.00pt;mso-wrap-distance-top:0.00pt;mso-wrap-distance-right:0.00pt;mso-wrap-distance-bottom:0.00pt;z-index:1;" stroked="false">
+              <v:shape id="_x0000_i10" o:spid="_x0000_s10" type="#_x0000_t75" style="width:356.78pt;height:295.62pt;mso-wrap-distance-left:0.00pt;mso-wrap-distance-top:0.00pt;mso-wrap-distance-right:0.00pt;mso-wrap-distance-bottom:0.00pt;z-index:1;" stroked="false">
                 <v:imagedata r:id="rId27" o:title=""/>
                 <o:lock v:ext="edit" rotation="t"/>
               </v:shape>
@@ -24750,13 +25100,22 @@
     </w:p>
     <w:p>
       <w:pPr>
+        <w:pBdr/>
+        <w:spacing/>
+        <w:ind/>
+        <w:rPr/>
+      </w:pPr>
+      <w:r/>
+      <w:r/>
+    </w:p>
+    <w:p>
+      <w:pPr>
         <w:pStyle w:val="1846"/>
         <w:pBdr/>
         <w:spacing/>
         <w:ind/>
         <w:rPr/>
       </w:pPr>
-      <w:r/>
       <w:r>
         <w:t xml:space="preserve">FIGURA </w:t>
       </w:r>
@@ -24776,9 +25135,8 @@
         <w:fldChar w:fldCharType="end"/>
       </w:r>
       <w:r>
-        <w:t xml:space="preserve"> – Registro de ocorrência: prevenção de erros e reconhecimento em lugar de memorização</w:t>
-      </w:r>
-      <w:r/>
+        <w:t xml:space="preserve"> – Registro de ocorrência: campos obrigatórios, exemplos de preenchimento e marcação do local no mapa</w:t>
+      </w:r>
       <w:r/>
     </w:p>
     <w:p>
@@ -24803,10 +25161,13 @@
         <w:rPr/>
       </w:pPr>
       <w:r>
-        <w:t xml:space="preserve">A Figura 11 evidencia a</w:t>
-      </w:r>
-      <w:r>
-        <w:t xml:space="preserve">s heurísticas “flexibilidade e eficiência de uso” e “consistência e padrões”: os filtros combináveis e a busca direta por protocolo abreviam o percurso do usuário experiente, e a identidade cromática dos estados é idêntica à empregada nas telas do cidadão.</w:t>
+        <w:t xml:space="preserve">A Figura 11 evidencia as heurísticas “flexibilidade e eficiência de uso” e “consistênci</w:t>
+      </w:r>
+      <w:r>
+        <w:t xml:space="preserve">a e padrões” na administração de contas: a busca por nome ou endereço de correio eletrônico e os filtros combináveis por perfil, município e situação abreviam o percurso até a conta procurada; a alteração do perfil é feita na própria linha da relação, sem </w:t>
+      </w:r>
+      <w:r>
+        <w:t xml:space="preserve">tela intermediária; e a situação da conta emprega as mesmas cores semânticas adotadas para o estado das ocorrências. A conta de quem está operando é assinalada como “você” e não apresenta as ações de desativação, o que previne o bloqueio do próprio acesso.</w:t>
       </w:r>
       <w:r/>
     </w:p>
@@ -24824,9 +25185,9 @@
           <mc:Choice Requires="wpg">
             <w:drawing>
               <wp:inline xmlns:wp="http://schemas.openxmlformats.org/drawingml/2006/wordprocessingDrawing" distT="0" distB="0" distL="0" distR="0">
-                <wp:extent cx="5040000" cy="2661551"/>
+                <wp:extent cx="5760720" cy="3121807"/>
                 <wp:effectExtent l="0" t="0" r="0" b="0"/>
-                <wp:docPr id="12" name="Picture 1987165335"/>
+                <wp:docPr id="12" name=""/>
                 <wp:cNvGraphicFramePr>
                   <a:graphicFrameLocks xmlns:a="http://schemas.openxmlformats.org/drawingml/2006/main" noChangeAspect="1"/>
                 </wp:cNvGraphicFramePr>
@@ -24834,7 +25195,7 @@
                   <a:graphicData uri="http://schemas.openxmlformats.org/drawingml/2006/picture">
                     <pic:pic xmlns:pic="http://schemas.openxmlformats.org/drawingml/2006/picture">
                       <pic:nvPicPr>
-                        <pic:cNvPr id="0" name="FalaCidade_Prototipo_08_GestaoOcorrencias_v2.png"/>
+                        <pic:cNvPr id="2032964692" name=""/>
                         <pic:cNvPicPr>
                           <a:picLocks noChangeAspect="1"/>
                         </pic:cNvPicPr>
@@ -24847,7 +25208,7 @@
                       <pic:spPr bwMode="auto">
                         <a:xfrm>
                           <a:off x="0" y="0"/>
-                          <a:ext cx="5040000" cy="2661551"/>
+                          <a:ext cx="5760719" cy="3121805"/>
                         </a:xfrm>
                         <a:prstGeom prst="rect">
                           <a:avLst/>
@@ -24880,7 +25241,7 @@
                 <v:path o:extrusionok="f" gradientshapeok="t" o:connecttype="rect"/>
                 <o:lock v:ext="edit" aspectratio="t"/>
               </v:shapetype>
-              <v:shape id="_x0000_i11" o:spid="_x0000_s11" type="#_x0000_t75" style="width:396.85pt;height:209.57pt;mso-wrap-distance-left:0.00pt;mso-wrap-distance-top:0.00pt;mso-wrap-distance-right:0.00pt;mso-wrap-distance-bottom:0.00pt;z-index:1;" stroked="false">
+              <v:shape id="_x0000_i11" o:spid="_x0000_s11" type="#_x0000_t75" style="width:453.60pt;height:245.81pt;mso-wrap-distance-left:0.00pt;mso-wrap-distance-top:0.00pt;mso-wrap-distance-right:0.00pt;mso-wrap-distance-bottom:0.00pt;z-index:1;" stroked="false">
                 <v:imagedata r:id="rId28" o:title=""/>
                 <o:lock v:ext="edit" rotation="t"/>
               </v:shape>
@@ -24898,7 +25259,6 @@
         <w:ind/>
         <w:rPr/>
       </w:pPr>
-      <w:r/>
       <w:r>
         <w:t xml:space="preserve">FIGURA </w:t>
       </w:r>
@@ -24918,9 +25278,8 @@
         <w:fldChar w:fldCharType="end"/>
       </w:r>
       <w:r>
-        <w:t xml:space="preserve"> – Painel de gestão: flexibilidade, eficiência de uso e consistência dos padrões</w:t>
-      </w:r>
-      <w:r/>
+        <w:t xml:space="preserve"> – Administração de contas: busca, filtros combináveis e alteração de perfil na própria linha</w:t>
+      </w:r>
       <w:r/>
     </w:p>
     <w:p>
@@ -24945,10 +25304,13 @@
         <w:rPr/>
       </w:pPr>
       <w:r>
-        <w:t xml:space="preserve">A Figura 12 evidencia as heurísticas “flexibilidade e eficiência de uso” e “controle e liberdade do usuário” na tela i</w:t>
-      </w:r>
-      <w:r>
-        <w:t xml:space="preserve">nicial: o seletor de município ocupa a primeira posição entre os filtros, por delimitar o território em exibição, e a sua alteração desloca o mapa e recompõe os indicadores e a relação de ocorrências recentes, sem que o usuário precise refazer a navegação.</w:t>
+        <w:t xml:space="preserve">A Figura 12 evidencia as heurísticas “flexibilidade e e</w:t>
+      </w:r>
+      <w:r>
+        <w:t xml:space="preserve">ficiência de uso” e “controle e liberdade do usuário” na tela inicial de quem acessa sem conta: o seletor de município ocupa a primeira posição entre os filtros, por delimitar o território em exibição, e a sua alteração desloca o mapa, recompõe a relação d</w:t>
+      </w:r>
+      <w:r>
+        <w:t xml:space="preserve">e ocorrências recentes e recalcula a faixa de situação, sem que o usuário precise refazer a navegação. O modo visitante (RF08 e RF11) preserva a consulta ao mapa e ao acervo de ocorrências, reservando o vínculo com a conta apenas ao que depende de autoria.</w:t>
       </w:r>
       <w:r/>
     </w:p>
@@ -25040,7 +25402,6 @@
         <w:ind/>
         <w:rPr/>
       </w:pPr>
-      <w:r/>
       <w:r>
         <w:t xml:space="preserve">FIGURA </w:t>
       </w:r>
@@ -25060,9 +25421,8 @@
         <w:fldChar w:fldCharType="end"/>
       </w:r>
       <w:r>
-        <w:t xml:space="preserve"> – Tela inicial: seletor de município, mapa e indicadores do território em exibição</w:t>
-      </w:r>
-      <w:r/>
+        <w:t xml:space="preserve"> – Tela inicial do visitante: seletor de município, mapa e indicadores do território em exibição</w:t>
+      </w:r>
       <w:r/>
     </w:p>
     <w:p>
@@ -25087,10 +25447,13 @@
         <w:rPr/>
       </w:pPr>
       <w:r>
-        <w:t xml:space="preserve">A Figura 13 evidencia as heurísticas “prevenção de erros” e “visibilidade do status do sistema” no registro de ocorrência: o campo de município perm</w:t>
-      </w:r>
-      <w:r>
-        <w:t xml:space="preserve">anece bloqueado até a informação da unidade federativa, o que impede a combinação inválida entre ambos, e o aviso apresentado informa, antes do envio, que o município escolhido ainda não possui equipe cadastrada, esclarecendo o que ocorrerá com o registro.</w:t>
+        <w:t xml:space="preserve">A Figura 13 evidencia as heurísticas “prevenção de erros” e “controle e liberdade do usuário” na segunda parte do formulário de registro: os campos de endereço c</w:t>
+      </w:r>
+      <w:r>
+        <w:t xml:space="preserve">hegam preenchidos a partir do ponto marcado no mapa e permanecem editáveis pelo usuário; o limite de três fotografias e o desfoque automático de rostos, exigido pela Lei Geral de Proteção de Dados Pessoais, são informados antes do envio e não depois dele; </w:t>
+      </w:r>
+      <w:r>
+        <w:t xml:space="preserve">o registro anônimo é oferecido com a advertência de que o acompanhamento passará a depender do código de rastreamento; e a ação de cancelamento é apresentada em posição e peso visual distintos da ação de confirmação, o que reduz o acionamento involuntário.</w:t>
       </w:r>
       <w:r/>
     </w:p>
@@ -25108,9 +25471,9 @@
           <mc:Choice Requires="wpg">
             <w:drawing>
               <wp:inline xmlns:wp="http://schemas.openxmlformats.org/drawingml/2006/wordprocessingDrawing" distT="0" distB="0" distL="0" distR="0">
-                <wp:extent cx="5040000" cy="2170000"/>
+                <wp:extent cx="4961890" cy="4111410"/>
                 <wp:effectExtent l="0" t="0" r="0" b="0"/>
-                <wp:docPr id="14" name="Picture 1987165337"/>
+                <wp:docPr id="14" name=""/>
                 <wp:cNvGraphicFramePr>
                   <a:graphicFrameLocks xmlns:a="http://schemas.openxmlformats.org/drawingml/2006/main" noChangeAspect="1"/>
                 </wp:cNvGraphicFramePr>
@@ -25118,7 +25481,7 @@
                   <a:graphicData uri="http://schemas.openxmlformats.org/drawingml/2006/picture">
                     <pic:pic xmlns:pic="http://schemas.openxmlformats.org/drawingml/2006/picture">
                       <pic:nvPicPr>
-                        <pic:cNvPr id="0" name="doc-cobertura.png"/>
+                        <pic:cNvPr id="2049064045" name=""/>
                         <pic:cNvPicPr>
                           <a:picLocks noChangeAspect="1"/>
                         </pic:cNvPicPr>
@@ -25129,9 +25492,9 @@
                         <a:stretch/>
                       </pic:blipFill>
                       <pic:spPr bwMode="auto">
-                        <a:xfrm>
+                        <a:xfrm rot="0" flipH="0" flipV="0">
                           <a:off x="0" y="0"/>
-                          <a:ext cx="5040000" cy="2170000"/>
+                          <a:ext cx="4961889" cy="4111409"/>
                         </a:xfrm>
                         <a:prstGeom prst="rect">
                           <a:avLst/>
@@ -25164,7 +25527,7 @@
                 <v:path o:extrusionok="f" gradientshapeok="t" o:connecttype="rect"/>
                 <o:lock v:ext="edit" aspectratio="t"/>
               </v:shapetype>
-              <v:shape id="_x0000_i13" o:spid="_x0000_s13" type="#_x0000_t75" style="width:396.85pt;height:170.87pt;mso-wrap-distance-left:0.00pt;mso-wrap-distance-top:0.00pt;mso-wrap-distance-right:0.00pt;mso-wrap-distance-bottom:0.00pt;z-index:1;" stroked="false">
+              <v:shape id="_x0000_i13" o:spid="_x0000_s13" type="#_x0000_t75" style="width:390.70pt;height:323.73pt;mso-wrap-distance-left:0.00pt;mso-wrap-distance-top:0.00pt;mso-wrap-distance-right:0.00pt;mso-wrap-distance-bottom:0.00pt;rotation:0;z-index:1;" stroked="false">
                 <v:imagedata r:id="rId30" o:title=""/>
                 <o:lock v:ext="edit" rotation="t"/>
               </v:shape>
@@ -25182,7 +25545,6 @@
         <w:ind/>
         <w:rPr/>
       </w:pPr>
-      <w:r/>
       <w:r>
         <w:t xml:space="preserve">FIGURA </w:t>
       </w:r>
@@ -25202,9 +25564,8 @@
         <w:fldChar w:fldCharType="end"/>
       </w:r>
       <w:r>
-        <w:t xml:space="preserve"> – Registro de ocorrência: preenchimento assistido do território e aviso de município sem equipe</w:t>
-      </w:r>
-      <w:r/>
+        <w:t xml:space="preserve"> – Registro de ocorrência: endereço a partir do mapa, desfoque das fotografias e registro anônimo</w:t>
+      </w:r>
       <w:r/>
     </w:p>
     <w:p>
@@ -25229,10 +25590,13 @@
         <w:rPr/>
       </w:pPr>
       <w:r>
-        <w:t xml:space="preserve">A Figura 14 evidencia as heurísticas “visibilidade do status do sistema” e “prevenção de erros” no encaminhamento ao departamento: a relação de depa</w:t>
-      </w:r>
-      <w:r>
-        <w:t xml:space="preserve">rtamentos apresenta o nome e o endereço de destino, o rodapé informa que nenhum dado pessoal do autor é enviado e antecipa o estado que a ocorrência assumirá, e o botão de confirmação permanece desabilitado enquanto nenhum destinatário estiver selecionado.</w:t>
+        <w:t xml:space="preserve">A Figura 14 evidencia as heurísticas “visibilidade do status do sistema” e “flexibilidade e eficiência de uso” na tela de tratamento da ocorrência: o histórico reg</w:t>
+      </w:r>
+      <w:r>
+        <w:t xml:space="preserve">istra cada trâmite com data, responsável e mensagem, de modo que o estado atual seja sempre explicado pelo que o antecedeu; o selo de ocorrência anônima adverte a equipe de que não há autor identificado a quem responder; as mensagens de uso mais frequente </w:t>
+      </w:r>
+      <w:r>
+        <w:t xml:space="preserve">são oferecidas como respostas prontas ao lado do campo de texto livre; e as ações de encaminhamento ao departamento responsável, de conclusão e de indeferimento ficam reunidas ao final da tela, separadas por peso visual conforme a consequência de cada uma.</w:t>
       </w:r>
       <w:r/>
     </w:p>
@@ -25250,9 +25614,9 @@
           <mc:Choice Requires="wpg">
             <w:drawing>
               <wp:inline xmlns:wp="http://schemas.openxmlformats.org/drawingml/2006/wordprocessingDrawing" distT="0" distB="0" distL="0" distR="0">
-                <wp:extent cx="4320000" cy="2592000"/>
+                <wp:extent cx="3183747" cy="5202015"/>
                 <wp:effectExtent l="0" t="0" r="0" b="0"/>
-                <wp:docPr id="15" name="Picture 1987165338"/>
+                <wp:docPr id="15" name=""/>
                 <wp:cNvGraphicFramePr>
                   <a:graphicFrameLocks xmlns:a="http://schemas.openxmlformats.org/drawingml/2006/main" noChangeAspect="1"/>
                 </wp:cNvGraphicFramePr>
@@ -25260,7 +25624,7 @@
                   <a:graphicData uri="http://schemas.openxmlformats.org/drawingml/2006/picture">
                     <pic:pic xmlns:pic="http://schemas.openxmlformats.org/drawingml/2006/picture">
                       <pic:nvPicPr>
-                        <pic:cNvPr id="0" name="doc-encaminhamento.png"/>
+                        <pic:cNvPr id="762778577" name=""/>
                         <pic:cNvPicPr>
                           <a:picLocks noChangeAspect="1"/>
                         </pic:cNvPicPr>
@@ -25271,9 +25635,9 @@
                         <a:stretch/>
                       </pic:blipFill>
                       <pic:spPr bwMode="auto">
-                        <a:xfrm>
+                        <a:xfrm flipH="0" flipV="0">
                           <a:off x="0" y="0"/>
-                          <a:ext cx="4320000" cy="2592000"/>
+                          <a:ext cx="3183746" cy="5202014"/>
                         </a:xfrm>
                         <a:prstGeom prst="rect">
                           <a:avLst/>
@@ -25306,7 +25670,7 @@
                 <v:path o:extrusionok="f" gradientshapeok="t" o:connecttype="rect"/>
                 <o:lock v:ext="edit" aspectratio="t"/>
               </v:shapetype>
-              <v:shape id="_x0000_i14" o:spid="_x0000_s14" type="#_x0000_t75" style="width:340.16pt;height:204.09pt;mso-wrap-distance-left:0.00pt;mso-wrap-distance-top:0.00pt;mso-wrap-distance-right:0.00pt;mso-wrap-distance-bottom:0.00pt;z-index:1;" stroked="false">
+              <v:shape id="_x0000_i14" o:spid="_x0000_s14" type="#_x0000_t75" style="width:250.69pt;height:409.61pt;mso-wrap-distance-left:0.00pt;mso-wrap-distance-top:0.00pt;mso-wrap-distance-right:0.00pt;mso-wrap-distance-bottom:0.00pt;z-index:1;" stroked="false">
                 <v:imagedata r:id="rId31" o:title=""/>
                 <o:lock v:ext="edit" rotation="t"/>
               </v:shape>
@@ -25324,7 +25688,6 @@
         <w:ind/>
         <w:rPr/>
       </w:pPr>
-      <w:r/>
       <w:r>
         <w:t xml:space="preserve">FIGURA </w:t>
       </w:r>
@@ -25344,9 +25707,8 @@
         <w:fldChar w:fldCharType="end"/>
       </w:r>
       <w:r>
-        <w:t xml:space="preserve"> – Detalhe da ocorrência: encaminhamento ao departamento responsável</w:t>
-      </w:r>
-      <w:r/>
+        <w:t xml:space="preserve"> – Detalhe da ocorrência: histórico dos trâmites, resposta ao cidadão e ações de tratamento</w:t>
+      </w:r>
       <w:r/>
     </w:p>
     <w:p>
@@ -25371,10 +25733,13 @@
         <w:rPr/>
       </w:pPr>
       <w:r>
-        <w:t xml:space="preserve">A Figura 15 evidencia as heurísticas “prevenção de erros” e “consistência e padrões” no cadastro de contas: a relação de perfis apresentada depende de quem cadastra — o ad</w:t>
-      </w:r>
-      <w:r>
-        <w:t xml:space="preserve">ministrador municipal só encontra o perfil de funcionário —, o município vem preenchido e bloqueado quando quem cadastra está vinculado a um, e os campos de território desaparecem quando o perfil escolhido é o de Super Administrador, que não tem município.</w:t>
+        <w:t xml:space="preserve">A Figura 15 evidencia as heurísticas “prevenção de erros” e “auxílio no reconhecimento, diagnóstico e recuperação de erros” no cadastro de contas d</w:t>
+      </w:r>
+      <w:r>
+        <w:t xml:space="preserve">a administração: o campo de município permanece bloqueado até que a unidade da federação seja informada — e diz por escrito o que falta —, o que impede a combinação inválida entre os dois; a relação de perfis disponíveis depende de quem cadastra, de modo q</w:t>
+      </w:r>
+      <w:r>
+        <w:t xml:space="preserve">ue o administrador municipal só encontra o perfil de funcionário; e o texto de apoio antecipa, antes da confirmação, que a conta exigirá o segundo fator de autenticação no primeiro acesso e atenderá apenas às ocorrências e às contas do município informado.</w:t>
       </w:r>
       <w:r/>
     </w:p>
@@ -25392,9 +25757,9 @@
           <mc:Choice Requires="wpg">
             <w:drawing>
               <wp:inline xmlns:wp="http://schemas.openxmlformats.org/drawingml/2006/wordprocessingDrawing" distT="0" distB="0" distL="0" distR="0">
-                <wp:extent cx="5040000" cy="3500000"/>
+                <wp:extent cx="3518289" cy="4239990"/>
                 <wp:effectExtent l="0" t="0" r="0" b="0"/>
-                <wp:docPr id="16" name="Picture 1987165339"/>
+                <wp:docPr id="16" name=""/>
                 <wp:cNvGraphicFramePr>
                   <a:graphicFrameLocks xmlns:a="http://schemas.openxmlformats.org/drawingml/2006/main" noChangeAspect="1"/>
                 </wp:cNvGraphicFramePr>
@@ -25402,7 +25767,7 @@
                   <a:graphicData uri="http://schemas.openxmlformats.org/drawingml/2006/picture">
                     <pic:pic xmlns:pic="http://schemas.openxmlformats.org/drawingml/2006/picture">
                       <pic:nvPicPr>
-                        <pic:cNvPr id="0" name="doc-super-admin.png"/>
+                        <pic:cNvPr id="754253302" name=""/>
                         <pic:cNvPicPr>
                           <a:picLocks noChangeAspect="1"/>
                         </pic:cNvPicPr>
@@ -25413,9 +25778,9 @@
                         <a:stretch/>
                       </pic:blipFill>
                       <pic:spPr bwMode="auto">
-                        <a:xfrm>
+                        <a:xfrm flipH="0" flipV="0">
                           <a:off x="0" y="0"/>
-                          <a:ext cx="5040000" cy="3500000"/>
+                          <a:ext cx="3518289" cy="4239990"/>
                         </a:xfrm>
                         <a:prstGeom prst="rect">
                           <a:avLst/>
@@ -25448,7 +25813,7 @@
                 <v:path o:extrusionok="f" gradientshapeok="t" o:connecttype="rect"/>
                 <o:lock v:ext="edit" aspectratio="t"/>
               </v:shapetype>
-              <v:shape id="_x0000_i15" o:spid="_x0000_s15" type="#_x0000_t75" style="width:396.85pt;height:275.59pt;mso-wrap-distance-left:0.00pt;mso-wrap-distance-top:0.00pt;mso-wrap-distance-right:0.00pt;mso-wrap-distance-bottom:0.00pt;z-index:1;" stroked="false">
+              <v:shape id="_x0000_i15" o:spid="_x0000_s15" type="#_x0000_t75" style="width:277.03pt;height:333.86pt;mso-wrap-distance-left:0.00pt;mso-wrap-distance-top:0.00pt;mso-wrap-distance-right:0.00pt;mso-wrap-distance-bottom:0.00pt;z-index:1;" stroked="false">
                 <v:imagedata r:id="rId32" o:title=""/>
                 <o:lock v:ext="edit" rotation="t"/>
               </v:shape>
@@ -25466,7 +25831,6 @@
         <w:ind/>
         <w:rPr/>
       </w:pPr>
-      <w:r/>
       <w:r>
         <w:t xml:space="preserve">FIGURA </w:t>
       </w:r>
@@ -25486,9 +25850,8 @@
         <w:fldChar w:fldCharType="end"/>
       </w:r>
       <w:r>
-        <w:t xml:space="preserve"> – Cadastro de contas: perfis disponíveis conforme quem cadastra</w:t>
-      </w:r>
-      <w:r/>
+        <w:t xml:space="preserve"> – Cadastro de contas: município condicionado à unidade da federação e perfis conforme quem cadastra</w:t>
+      </w:r>
       <w:r/>
     </w:p>
     <w:p>
@@ -25512,6 +25875,630 @@
         <w:ind/>
         <w:rPr/>
       </w:pPr>
+      <w:r>
+        <w:t xml:space="preserve">A Figura 16 evidencia as heurísticas “ajuda e documentação” e “correspondência </w:t>
+      </w:r>
+      <w:r>
+        <w:t xml:space="preserve">entre o sistema e o mundo real”: a Central de Ajuda reúne, em linguagem corrente e em formato de pergunta e resposta, as orientações para o registro de uma ocorrência, o esclarecimento sobre o envio anônimo, o caminho para acompanhar o protocolo e o signif</w:t>
+      </w:r>
+      <w:r>
+        <w:t xml:space="preserve">icado de cada estado, de modo que o uso do sistema não pressuponha treinamento prévio; ao lado, o cartão de contato apresenta o endereço de correio eletrônico, o telefone e o endereço da administração, destinados às situações não previstas na ajuda (RF17).</w:t>
+      </w:r>
+      <w:r/>
+    </w:p>
+    <w:p>
+      <w:pPr>
+        <w:pStyle w:val="1846"/>
+        <w:pBdr/>
+        <w:spacing/>
+        <w:ind/>
+        <w:rPr/>
+      </w:pPr>
+      <w:r>
+        <w:rPr>
+          <w:highlight w:val="none"/>
+        </w:rPr>
+      </w:r>
+      <w:r>
+        <w:rPr>
+          <w:highlight w:val="none"/>
+        </w:rPr>
+        <mc:AlternateContent>
+          <mc:Choice Requires="wpg">
+            <w:drawing>
+              <wp:inline xmlns:wp="http://schemas.openxmlformats.org/drawingml/2006/wordprocessingDrawing" distT="0" distB="0" distL="0" distR="0">
+                <wp:extent cx="5760720" cy="2053258"/>
+                <wp:effectExtent l="0" t="0" r="0" b="0"/>
+                <wp:docPr id="17" name=""/>
+                <wp:cNvGraphicFramePr>
+                  <a:graphicFrameLocks xmlns:a="http://schemas.openxmlformats.org/drawingml/2006/main" noChangeAspect="1"/>
+                </wp:cNvGraphicFramePr>
+                <a:graphic xmlns:a="http://schemas.openxmlformats.org/drawingml/2006/main">
+                  <a:graphicData uri="http://schemas.openxmlformats.org/drawingml/2006/picture">
+                    <pic:pic xmlns:pic="http://schemas.openxmlformats.org/drawingml/2006/picture">
+                      <pic:nvPicPr>
+                        <pic:cNvPr id="1372292715" name=""/>
+                        <pic:cNvPicPr>
+                          <a:picLocks noChangeAspect="1"/>
+                        </pic:cNvPicPr>
+                        <pic:nvPr/>
+                      </pic:nvPicPr>
+                      <pic:blipFill rotWithShape="1">
+                        <a:blip r:embed="rId33"/>
+                        <a:stretch/>
+                      </pic:blipFill>
+                      <pic:spPr bwMode="auto">
+                        <a:xfrm>
+                          <a:off x="0" y="0"/>
+                          <a:ext cx="5760719" cy="2053258"/>
+                        </a:xfrm>
+                        <a:prstGeom prst="rect">
+                          <a:avLst/>
+                        </a:prstGeom>
+                      </pic:spPr>
+                    </pic:pic>
+                  </a:graphicData>
+                </a:graphic>
+              </wp:inline>
+            </w:drawing>
+          </mc:Choice>
+          <mc:Fallback>
+            <w:pict>
+              <v:shapetype id="_x0000_t75" coordsize="21600,21600" o:spt="75" o:preferrelative="t" path="m@4@5l@4@11@9@11@9@5xe" filled="f" stroked="f">
+                <v:stroke joinstyle="miter"/>
+                <v:formulas>
+                  <v:f eqn="if lineDrawn pixelLineWidth 0"/>
+                  <v:f eqn="sum @0 1 0"/>
+                  <v:f eqn="sum 0 0 @1"/>
+                  <v:f eqn="prod @2 1 2"/>
+                  <v:f eqn="prod @3 21600 pixelWidth"/>
+                  <v:f eqn="prod @3 21600 pixelHeight"/>
+                  <v:f eqn="sum @0 0 1"/>
+                  <v:f eqn="prod @6 1 2"/>
+                  <v:f eqn="prod @7 21600 pixelWidth"/>
+                  <v:f eqn="sum @8 21600 0"/>
+                  <v:f eqn="prod @7 21600 pixelHeight"/>
+                  <v:f eqn="sum @10 21600 0"/>
+                </v:formulas>
+                <v:path o:extrusionok="f" gradientshapeok="t" o:connecttype="rect"/>
+                <o:lock v:ext="edit" aspectratio="t"/>
+              </v:shapetype>
+              <v:shape id="_x0000_i16" o:spid="_x0000_s16" type="#_x0000_t75" style="width:453.60pt;height:161.67pt;mso-wrap-distance-left:0.00pt;mso-wrap-distance-top:0.00pt;mso-wrap-distance-right:0.00pt;mso-wrap-distance-bottom:0.00pt;z-index:1;" stroked="false">
+                <v:imagedata r:id="rId33" o:title=""/>
+                <o:lock v:ext="edit" rotation="t"/>
+              </v:shape>
+            </w:pict>
+          </mc:Fallback>
+        </mc:AlternateContent>
+      </w:r>
+      <w:r>
+        <w:rPr>
+          <w:highlight w:val="none"/>
+        </w:rPr>
+      </w:r>
+      <w:r/>
+    </w:p>
+    <w:p>
+      <w:pPr>
+        <w:pStyle w:val="1846"/>
+        <w:pBdr/>
+        <w:spacing/>
+        <w:ind/>
+        <w:rPr>
+          <w:highlight w:val="none"/>
+        </w:rPr>
+      </w:pPr>
+      <w:r>
+        <w:t xml:space="preserve">FIGURA </w:t>
+      </w:r>
+      <w:r>
+        <w:fldChar w:fldCharType="begin"/>
+      </w:r>
+      <w:r>
+        <w:instrText xml:space="preserve">SEQ FIGURA \* Arabic </w:instrText>
+      </w:r>
+      <w:r>
+        <w:fldChar w:fldCharType="separate"/>
+      </w:r>
+      <w:r>
+        <w:t xml:space="preserve">16</w:t>
+      </w:r>
+      <w:r>
+        <w:fldChar w:fldCharType="end"/>
+      </w:r>
+      <w:r>
+        <w:t xml:space="preserve"> – Central de Ajuda: perguntas frequentes e canal de contato com a administração</w:t>
+      </w:r>
+      <w:r>
+        <w:rPr>
+          <w:highlight w:val="none"/>
+        </w:rPr>
+      </w:r>
+    </w:p>
+    <w:p>
+      <w:pPr>
+        <w:pStyle w:val="1846"/>
+        <w:pBdr/>
+        <w:spacing/>
+        <w:ind w:firstLine="0"/>
+        <w:jc w:val="center"/>
+        <w:rPr/>
+      </w:pPr>
+      <w:r>
+        <w:t xml:space="preserve">Fonte: elaborada pelos autores (2026).</w:t>
+      </w:r>
+      <w:r/>
+    </w:p>
+    <w:p>
+      <w:pPr>
+        <w:pBdr/>
+        <w:spacing/>
+        <w:ind/>
+        <w:rPr>
+          <w:highlight w:val="none"/>
+        </w:rPr>
+      </w:pPr>
+      <w:r>
+        <w:t xml:space="preserve">A Figura 17 evidencia as heurísticas “auxílio no reconhecimento, diagnóstico e recuperação d</w:t>
+      </w:r>
+      <w:r>
+        <w:t xml:space="preserve">e erros” e “controle e liberdade do usuário” na recuperação de senha, saída para o erro mais frequente do usuário, que é o esquecimento da própria credencial: a tela informa, antes do preenchimento, o que será feito com o endereço fornecido; oferece o reto</w:t>
+      </w:r>
+      <w:r>
+        <w:t xml:space="preserve">rno à tela de entrada e o atalho para quem já recebeu o código, sem obrigar a repetir o envio; e o código é expedido ao correio eletrônico, e não exibido na tela, de modo que a verificação permaneça fora do alcance de quem tenha acesso apenas ao navegador.</w:t>
+      </w:r>
+      <w:r>
+        <w:rPr>
+          <w:highlight w:val="none"/>
+        </w:rPr>
+      </w:r>
+    </w:p>
+    <w:p>
+      <w:pPr>
+        <w:pBdr/>
+        <w:spacing/>
+        <w:ind/>
+        <w:rPr/>
+      </w:pPr>
+      <w:r>
+        <w:rPr>
+          <w:highlight w:val="none"/>
+        </w:rPr>
+        <mc:AlternateContent>
+          <mc:Choice Requires="wpg">
+            <w:drawing>
+              <wp:inline xmlns:wp="http://schemas.openxmlformats.org/drawingml/2006/wordprocessingDrawing" distT="0" distB="0" distL="0" distR="0">
+                <wp:extent cx="3667956" cy="3244491"/>
+                <wp:effectExtent l="0" t="0" r="0" b="0"/>
+                <wp:docPr id="18" name=""/>
+                <wp:cNvGraphicFramePr>
+                  <a:graphicFrameLocks xmlns:a="http://schemas.openxmlformats.org/drawingml/2006/main" noChangeAspect="1"/>
+                </wp:cNvGraphicFramePr>
+                <a:graphic xmlns:a="http://schemas.openxmlformats.org/drawingml/2006/main">
+                  <a:graphicData uri="http://schemas.openxmlformats.org/drawingml/2006/picture">
+                    <pic:pic xmlns:pic="http://schemas.openxmlformats.org/drawingml/2006/picture">
+                      <pic:nvPicPr>
+                        <pic:cNvPr id="1720123218" name=""/>
+                        <pic:cNvPicPr>
+                          <a:picLocks noChangeAspect="1"/>
+                        </pic:cNvPicPr>
+                        <pic:nvPr/>
+                      </pic:nvPicPr>
+                      <pic:blipFill rotWithShape="1">
+                        <a:blip r:embed="rId34"/>
+                        <a:stretch/>
+                      </pic:blipFill>
+                      <pic:spPr bwMode="auto">
+                        <a:xfrm flipH="0" flipV="0">
+                          <a:off x="0" y="0"/>
+                          <a:ext cx="3667956" cy="3244491"/>
+                        </a:xfrm>
+                        <a:prstGeom prst="rect">
+                          <a:avLst/>
+                        </a:prstGeom>
+                      </pic:spPr>
+                    </pic:pic>
+                  </a:graphicData>
+                </a:graphic>
+              </wp:inline>
+            </w:drawing>
+          </mc:Choice>
+          <mc:Fallback>
+            <w:pict>
+              <v:shapetype id="_x0000_t75" coordsize="21600,21600" o:spt="75" o:preferrelative="t" path="m@4@5l@4@11@9@11@9@5xe" filled="f" stroked="f">
+                <v:stroke joinstyle="miter"/>
+                <v:formulas>
+                  <v:f eqn="if lineDrawn pixelLineWidth 0"/>
+                  <v:f eqn="sum @0 1 0"/>
+                  <v:f eqn="sum 0 0 @1"/>
+                  <v:f eqn="prod @2 1 2"/>
+                  <v:f eqn="prod @3 21600 pixelWidth"/>
+                  <v:f eqn="prod @3 21600 pixelHeight"/>
+                  <v:f eqn="sum @0 0 1"/>
+                  <v:f eqn="prod @6 1 2"/>
+                  <v:f eqn="prod @7 21600 pixelWidth"/>
+                  <v:f eqn="sum @8 21600 0"/>
+                  <v:f eqn="prod @7 21600 pixelHeight"/>
+                  <v:f eqn="sum @10 21600 0"/>
+                </v:formulas>
+                <v:path o:extrusionok="f" gradientshapeok="t" o:connecttype="rect"/>
+                <o:lock v:ext="edit" aspectratio="t"/>
+              </v:shapetype>
+              <v:shape id="_x0000_i17" o:spid="_x0000_s17" type="#_x0000_t75" style="width:288.82pt;height:255.47pt;mso-wrap-distance-left:0.00pt;mso-wrap-distance-top:0.00pt;mso-wrap-distance-right:0.00pt;mso-wrap-distance-bottom:0.00pt;z-index:1;" stroked="false">
+                <v:imagedata r:id="rId34" o:title=""/>
+                <o:lock v:ext="edit" rotation="t"/>
+              </v:shape>
+            </w:pict>
+          </mc:Fallback>
+        </mc:AlternateContent>
+      </w:r>
+      <w:r>
+        <w:rPr>
+          <w:highlight w:val="none"/>
+        </w:rPr>
+      </w:r>
+      <w:r/>
+    </w:p>
+    <w:p>
+      <w:pPr>
+        <w:pStyle w:val="1846"/>
+        <w:pBdr/>
+        <w:spacing/>
+        <w:ind/>
+        <w:rPr/>
+      </w:pPr>
+      <w:r>
+        <w:t xml:space="preserve">FIGURA </w:t>
+      </w:r>
+      <w:r>
+        <w:fldChar w:fldCharType="begin"/>
+      </w:r>
+      <w:r>
+        <w:instrText xml:space="preserve">SEQ FIGURA \* Arabic </w:instrText>
+      </w:r>
+      <w:r>
+        <w:fldChar w:fldCharType="separate"/>
+      </w:r>
+      <w:r>
+        <w:t xml:space="preserve">17</w:t>
+      </w:r>
+      <w:r>
+        <w:fldChar w:fldCharType="end"/>
+      </w:r>
+      <w:r>
+        <w:t xml:space="preserve"> – Recuperar senha: envio do código por correio eletrônico e retorno à tela de entrada</w:t>
+      </w:r>
+      <w:r/>
+    </w:p>
+    <w:p>
+      <w:pPr>
+        <w:pStyle w:val="1846"/>
+        <w:pBdr/>
+        <w:spacing/>
+        <w:ind w:firstLine="0"/>
+        <w:jc w:val="center"/>
+        <w:rPr/>
+      </w:pPr>
+      <w:r>
+        <w:t xml:space="preserve">Fonte: elaborada pelos autores (2026).</w:t>
+      </w:r>
+      <w:r/>
+    </w:p>
+    <w:p>
+      <w:pPr>
+        <w:pBdr/>
+        <w:spacing/>
+        <w:ind/>
+        <w:rPr>
+          <w:highlight w:val="none"/>
+        </w:rPr>
+      </w:pPr>
+      <w:r>
+        <w:t xml:space="preserve">A Figura 18 evidencia as heurísticas “estética e design minimalista” e “visibilidade do status do</w:t>
+      </w:r>
+      <w:r>
+        <w:t xml:space="preserve"> sistema” no painel de estatísticas: a carga do período é apresentada em uma única faixa proporcional, com os valores imediatamente abaixo, em lugar de repetir os mesmos números em cartões, barras e gráfico de setores; a hierarquia da informação decorre do</w:t>
+      </w:r>
+      <w:r>
+        <w:t xml:space="preserve"> peso tipográfico e do tom, sem elemento decorativo; e o realce visual é reservado ao único dado que exige decisão do servidor público, o número de ocorrências em aberto há mais de quinze dias, acompanhado da identificação daquela que espera há mais tempo.</w:t>
+      </w:r>
+      <w:r>
+        <w:rPr>
+          <w:highlight w:val="none"/>
+        </w:rPr>
+      </w:r>
+    </w:p>
+    <w:p>
+      <w:pPr>
+        <w:pBdr/>
+        <w:spacing/>
+        <w:ind/>
+        <w:rPr/>
+      </w:pPr>
+      <w:r>
+        <mc:AlternateContent>
+          <mc:Choice Requires="wpg">
+            <w:drawing>
+              <wp:inline xmlns:wp="http://schemas.openxmlformats.org/drawingml/2006/wordprocessingDrawing" distT="0" distB="0" distL="0" distR="0">
+                <wp:extent cx="5760720" cy="4737400"/>
+                <wp:effectExtent l="0" t="0" r="0" b="0"/>
+                <wp:docPr id="19" name=""/>
+                <wp:cNvGraphicFramePr>
+                  <a:graphicFrameLocks xmlns:a="http://schemas.openxmlformats.org/drawingml/2006/main" noChangeAspect="1"/>
+                </wp:cNvGraphicFramePr>
+                <a:graphic xmlns:a="http://schemas.openxmlformats.org/drawingml/2006/main">
+                  <a:graphicData uri="http://schemas.openxmlformats.org/drawingml/2006/picture">
+                    <pic:pic xmlns:pic="http://schemas.openxmlformats.org/drawingml/2006/picture">
+                      <pic:nvPicPr>
+                        <pic:cNvPr id="879104941" name=""/>
+                        <pic:cNvPicPr>
+                          <a:picLocks noChangeAspect="1"/>
+                        </pic:cNvPicPr>
+                        <pic:nvPr/>
+                      </pic:nvPicPr>
+                      <pic:blipFill rotWithShape="1">
+                        <a:blip r:embed="rId35"/>
+                        <a:stretch/>
+                      </pic:blipFill>
+                      <pic:spPr bwMode="auto">
+                        <a:xfrm>
+                          <a:off x="0" y="0"/>
+                          <a:ext cx="5760719" cy="4737399"/>
+                        </a:xfrm>
+                        <a:prstGeom prst="rect">
+                          <a:avLst/>
+                        </a:prstGeom>
+                      </pic:spPr>
+                    </pic:pic>
+                  </a:graphicData>
+                </a:graphic>
+              </wp:inline>
+            </w:drawing>
+          </mc:Choice>
+          <mc:Fallback>
+            <w:pict>
+              <v:shapetype id="_x0000_t75" coordsize="21600,21600" o:spt="75" o:preferrelative="t" path="m@4@5l@4@11@9@11@9@5xe" filled="f" stroked="f">
+                <v:stroke joinstyle="miter"/>
+                <v:formulas>
+                  <v:f eqn="if lineDrawn pixelLineWidth 0"/>
+                  <v:f eqn="sum @0 1 0"/>
+                  <v:f eqn="sum 0 0 @1"/>
+                  <v:f eqn="prod @2 1 2"/>
+                  <v:f eqn="prod @3 21600 pixelWidth"/>
+                  <v:f eqn="prod @3 21600 pixelHeight"/>
+                  <v:f eqn="sum @0 0 1"/>
+                  <v:f eqn="prod @6 1 2"/>
+                  <v:f eqn="prod @7 21600 pixelWidth"/>
+                  <v:f eqn="sum @8 21600 0"/>
+                  <v:f eqn="prod @7 21600 pixelHeight"/>
+                  <v:f eqn="sum @10 21600 0"/>
+                </v:formulas>
+                <v:path o:extrusionok="f" gradientshapeok="t" o:connecttype="rect"/>
+                <o:lock v:ext="edit" aspectratio="t"/>
+              </v:shapetype>
+              <v:shape id="_x0000_i18" o:spid="_x0000_s18" type="#_x0000_t75" style="width:453.60pt;height:373.02pt;mso-wrap-distance-left:0.00pt;mso-wrap-distance-top:0.00pt;mso-wrap-distance-right:0.00pt;mso-wrap-distance-bottom:0.00pt;z-index:1;" stroked="false">
+                <v:imagedata r:id="rId35" o:title=""/>
+                <o:lock v:ext="edit" rotation="t"/>
+              </v:shape>
+            </w:pict>
+          </mc:Fallback>
+        </mc:AlternateContent>
+      </w:r>
+      <w:r>
+        <w:rPr>
+          <w:highlight w:val="none"/>
+        </w:rPr>
+      </w:r>
+      <w:r/>
+    </w:p>
+    <w:p>
+      <w:pPr>
+        <w:pStyle w:val="1846"/>
+        <w:pBdr/>
+        <w:spacing/>
+        <w:ind/>
+        <w:rPr/>
+      </w:pPr>
+      <w:r>
+        <w:t xml:space="preserve">FIGURA </w:t>
+      </w:r>
+      <w:r>
+        <w:fldChar w:fldCharType="begin"/>
+      </w:r>
+      <w:r>
+        <w:instrText xml:space="preserve">SEQ FIGURA \* Arabic </w:instrText>
+      </w:r>
+      <w:r>
+        <w:fldChar w:fldCharType="separate"/>
+      </w:r>
+      <w:r>
+        <w:t xml:space="preserve">18</w:t>
+      </w:r>
+      <w:r>
+        <w:fldChar w:fldCharType="end"/>
+      </w:r>
+      <w:r>
+        <w:t xml:space="preserve"> – Estatísticas: carga do período, fila de espera e hierarquia sem ornamento</w:t>
+      </w:r>
+      <w:r/>
+    </w:p>
+    <w:p>
+      <w:pPr>
+        <w:pStyle w:val="1846"/>
+        <w:pBdr/>
+        <w:spacing/>
+        <w:ind w:firstLine="0"/>
+        <w:jc w:val="center"/>
+        <w:rPr/>
+      </w:pPr>
+      <w:r>
+        <w:t xml:space="preserve">Fonte: elaborada pelos autores (2026).</w:t>
+      </w:r>
+      <w:r/>
+    </w:p>
+    <w:p>
+      <w:pPr>
+        <w:pBdr/>
+        <w:spacing/>
+        <w:ind/>
+        <w:rPr>
+          <w:highlight w:val="none"/>
+        </w:rPr>
+      </w:pPr>
+      <w:r>
+        <w:t xml:space="preserve">A Figura 19 evidencia as heurísticas “controle e liberdade do usuário” e “prevenção de erro</w:t>
+      </w:r>
+      <w:r>
+        <w:t xml:space="preserve">s” na tela “Minha Conta”, que reúne em um só lugar tudo o que o usuário decide a respeito da própria conta: a edição dos dados pessoais (RF04), a troca da senha mediante a informação da senha atual, a ativação da verificação em duas etapas por correio elet</w:t>
+      </w:r>
+      <w:r>
+        <w:t xml:space="preserve">rônico ou por aplicativo autenticador e a exclusão da conta (RF06). Cada bloco é independente e possui o seu próprio botão de gravação, de modo que uma alteração não arraste as demais. A exclusão ocupa área destacada ao final da tela, é precedida de caixa </w:t>
+      </w:r>
+      <w:r>
+        <w:t xml:space="preserve">de diálogo de confirmação e, nas contas com segundo fator ativo, exige ainda o código de verificação; o texto informa, antes da decisão, que as ocorrências já registradas permanecem no acervo sem o nome do autor, e não que serão apagadas junto com a conta.</w:t>
+      </w:r>
+      <w:r>
+        <w:rPr>
+          <w:highlight w:val="none"/>
+        </w:rPr>
+      </w:r>
+    </w:p>
+    <w:p>
+      <w:pPr>
+        <w:pStyle w:val="1846"/>
+        <w:pBdr/>
+        <w:spacing/>
+        <w:ind w:firstLine="0"/>
+        <w:jc w:val="center"/>
+        <w:rPr/>
+      </w:pPr>
+      <w:r>
+        <mc:AlternateContent>
+          <mc:Choice Requires="wpg">
+            <w:drawing>
+              <wp:inline xmlns:wp="http://schemas.openxmlformats.org/drawingml/2006/wordprocessingDrawing" distT="0" distB="0" distL="0" distR="0">
+                <wp:extent cx="5760720" cy="3333195"/>
+                <wp:effectExtent l="0" t="0" r="0" b="0"/>
+                <wp:docPr id="20" name=""/>
+                <wp:cNvGraphicFramePr>
+                  <a:graphicFrameLocks xmlns:a="http://schemas.openxmlformats.org/drawingml/2006/main" noChangeAspect="1"/>
+                </wp:cNvGraphicFramePr>
+                <a:graphic xmlns:a="http://schemas.openxmlformats.org/drawingml/2006/main">
+                  <a:graphicData uri="http://schemas.openxmlformats.org/drawingml/2006/picture">
+                    <pic:pic xmlns:pic="http://schemas.openxmlformats.org/drawingml/2006/picture">
+                      <pic:nvPicPr>
+                        <pic:cNvPr id="183258000" name=""/>
+                        <pic:cNvPicPr>
+                          <a:picLocks noChangeAspect="1"/>
+                        </pic:cNvPicPr>
+                        <pic:nvPr/>
+                      </pic:nvPicPr>
+                      <pic:blipFill rotWithShape="1">
+                        <a:blip r:embed="rId36"/>
+                        <a:stretch/>
+                      </pic:blipFill>
+                      <pic:spPr bwMode="auto">
+                        <a:xfrm>
+                          <a:off x="0" y="0"/>
+                          <a:ext cx="5760719" cy="3333194"/>
+                        </a:xfrm>
+                        <a:prstGeom prst="rect">
+                          <a:avLst/>
+                        </a:prstGeom>
+                      </pic:spPr>
+                    </pic:pic>
+                  </a:graphicData>
+                </a:graphic>
+              </wp:inline>
+            </w:drawing>
+          </mc:Choice>
+          <mc:Fallback>
+            <w:pict>
+              <v:shapetype id="_x0000_t75" coordsize="21600,21600" o:spt="75" o:preferrelative="t" path="m@4@5l@4@11@9@11@9@5xe" filled="f" stroked="f">
+                <v:stroke joinstyle="miter"/>
+                <v:formulas>
+                  <v:f eqn="if lineDrawn pixelLineWidth 0"/>
+                  <v:f eqn="sum @0 1 0"/>
+                  <v:f eqn="sum 0 0 @1"/>
+                  <v:f eqn="prod @2 1 2"/>
+                  <v:f eqn="prod @3 21600 pixelWidth"/>
+                  <v:f eqn="prod @3 21600 pixelHeight"/>
+                  <v:f eqn="sum @0 0 1"/>
+                  <v:f eqn="prod @6 1 2"/>
+                  <v:f eqn="prod @7 21600 pixelWidth"/>
+                  <v:f eqn="sum @8 21600 0"/>
+                  <v:f eqn="prod @7 21600 pixelHeight"/>
+                  <v:f eqn="sum @10 21600 0"/>
+                </v:formulas>
+                <v:path o:extrusionok="f" gradientshapeok="t" o:connecttype="rect"/>
+                <o:lock v:ext="edit" aspectratio="t"/>
+              </v:shapetype>
+              <v:shape id="_x0000_i19" o:spid="_x0000_s19" type="#_x0000_t75" style="width:453.60pt;height:262.46pt;mso-wrap-distance-left:0.00pt;mso-wrap-distance-top:0.00pt;mso-wrap-distance-right:0.00pt;mso-wrap-distance-bottom:0.00pt;z-index:1;" stroked="false">
+                <v:imagedata r:id="rId36" o:title=""/>
+                <o:lock v:ext="edit" rotation="t"/>
+              </v:shape>
+            </w:pict>
+          </mc:Fallback>
+        </mc:AlternateContent>
+      </w:r>
+      <w:r/>
+    </w:p>
+    <w:p>
+      <w:pPr>
+        <w:pStyle w:val="1846"/>
+        <w:pBdr/>
+        <w:spacing/>
+        <w:ind/>
+        <w:rPr/>
+      </w:pPr>
+      <w:r/>
+      <w:bookmarkStart w:id="900" w:name="_TocFig19"/>
+      <w:r>
+        <w:t xml:space="preserve">FIGURA </w:t>
+      </w:r>
+      <w:r>
+        <w:fldChar w:fldCharType="begin"/>
+      </w:r>
+      <w:r>
+        <w:instrText xml:space="preserve">SEQ FIGURA \* Arabic </w:instrText>
+      </w:r>
+      <w:r>
+        <w:fldChar w:fldCharType="separate"/>
+      </w:r>
+      <w:r>
+        <w:t xml:space="preserve">19</w:t>
+      </w:r>
+      <w:r>
+        <w:fldChar w:fldCharType="end"/>
+      </w:r>
+      <w:r>
+        <w:t xml:space="preserve"> – Minha Conta: dados pessoais, troca de senha, verificação em duas etapas e exclusão da conta</w:t>
+      </w:r>
+      <w:bookmarkEnd w:id="900"/>
+      <w:r/>
+      <w:r/>
+    </w:p>
+    <w:p>
+      <w:pPr>
+        <w:pStyle w:val="1846"/>
+        <w:pBdr/>
+        <w:spacing/>
+        <w:ind w:firstLine="0"/>
+        <w:jc w:val="center"/>
+        <w:rPr/>
+      </w:pPr>
+      <w:r>
+        <w:t xml:space="preserve">Fonte: elaborada pelos autores (2026).</w:t>
+      </w:r>
+      <w:r/>
+    </w:p>
+    <w:p>
+      <w:pPr>
+        <w:pBdr/>
+        <w:spacing/>
+        <w:ind/>
+        <w:rPr/>
+      </w:pPr>
       <w:r/>
       <w:r/>
     </w:p>
@@ -25732,33 +26719,18 @@
         <w:t xml:space="preserve">ração do sistema. A terceira é a execução assíncrona das operações de maior latência — o envio de mídias e a expedição de mensagens de correio eletrônico —, em conjuntos de linhas de execução dedicados, que preserva o tempo de resposta às requisições HTTP.</w:t>
       </w:r>
       <w:r/>
-    </w:p>
-    <w:p>
-      <w:pPr>
-        <w:pBdr/>
-        <w:spacing/>
-        <w:ind/>
-        <w:rPr/>
-      </w:pPr>
-      <w:r/>
-      <w:r/>
-    </w:p>
-    <w:p>
-      <w:pPr>
-        <w:pBdr/>
-        <w:spacing/>
-        <w:ind/>
+      <w:r>
         <w:rPr>
           <w:sz w:val="20"/>
           <w:szCs w:val="20"/>
         </w:rPr>
-      </w:pPr>
+      </w:r>
       <w:r>
         <w:rPr>
           <w:sz w:val="20"/>
           <w:szCs w:val="20"/>
         </w:rPr>
-        <w:t xml:space="preserve"> </w:t>
+        <w:br w:type="page" w:clear="all"/>
       </w:r>
       <w:r>
         <w:rPr>
@@ -25772,37 +26744,13 @@
           <w:szCs w:val="20"/>
         </w:rPr>
       </w:r>
-    </w:p>
-    <w:p>
-      <w:pPr>
-        <w:pBdr/>
-        <w:spacing w:after="0" w:line="240" w:lineRule="auto"/>
-        <w:ind/>
-        <w:jc w:val="left"/>
+      <w:r>
         <w:rPr>
           <w:sz w:val="20"/>
           <w:szCs w:val="20"/>
         </w:rPr>
-      </w:pPr>
-      <w:r>
-        <w:rPr>
-          <w:sz w:val="20"/>
-          <w:szCs w:val="20"/>
-        </w:rPr>
-        <w:br w:type="page" w:clear="all"/>
-      </w:r>
-      <w:r>
-        <w:rPr>
-          <w:sz w:val="20"/>
-          <w:szCs w:val="20"/>
-        </w:rPr>
-      </w:r>
-      <w:r>
-        <w:rPr>
-          <w:sz w:val="20"/>
-          <w:szCs w:val="20"/>
-        </w:rPr>
-      </w:r>
+      </w:r>
+      <w:r/>
     </w:p>
     <w:p>
       <w:pPr>

</xml_diff>

<commit_message>
docs(monografia): atualiza a numeracao do sumario e das listas
As quebras de pagina acrescentadas nas secoes 1, 3, 8, 9 e 10 deslocaram o corpo
do texto em uma folha. Os campos foram atualizados no Word, de modo que o
sumario, a lista de figuras e a lista de quadros voltam a apontar para as paginas
certas.

Somente a numeracao mudou: as 27297 palavras e as 19 figuras seguem as mesmas, e
as 222 linhas alteradas sao todas de referencia de pagina.
</commit_message>
<xml_diff>
--- a/FAI-SI-PFC-II-FalaCidade-2026-v1.15.docx
+++ b/FAI-SI-PFC-II-FalaCidade-2026-v1.15.docx
@@ -3799,6 +3799,7 @@
         </w:rPr>
         <w:fldChar w:fldCharType="separate"/>
       </w:r>
+      <w:r/>
       <w:hyperlink w:tooltip="#_Toc1" w:anchor="_Toc1" w:history="1">
         <w:r>
           <w:rPr>
@@ -3841,12 +3842,11 @@
           <w:fldChar w:fldCharType="begin"/>
           <w:instrText xml:space="preserve">PAGEREF _Toc1 \h</w:instrText>
           <w:fldChar w:fldCharType="separate"/>
-          <w:t xml:space="preserve">23</w:t>
+          <w:t xml:space="preserve">24</w:t>
           <w:fldChar w:fldCharType="end"/>
         </w:r>
       </w:hyperlink>
       <w:r/>
-      <w:r/>
     </w:p>
     <w:p>
       <w:pPr>
@@ -3859,7 +3859,6 @@
         <w:ind/>
         <w:rPr/>
       </w:pPr>
-      <w:r/>
       <w:hyperlink w:tooltip="#_Toc2" w:anchor="_Toc2" w:history="1">
         <w:r>
           <w:rPr>
@@ -3915,12 +3914,11 @@
           <w:fldChar w:fldCharType="begin"/>
           <w:instrText xml:space="preserve">PAGEREF _Toc2 \h</w:instrText>
           <w:fldChar w:fldCharType="separate"/>
-          <w:t xml:space="preserve">23</w:t>
+          <w:t xml:space="preserve">24</w:t>
           <w:fldChar w:fldCharType="end"/>
         </w:r>
       </w:hyperlink>
       <w:r/>
-      <w:r/>
     </w:p>
     <w:p>
       <w:pPr>
@@ -3933,7 +3931,6 @@
         <w:ind/>
         <w:rPr/>
       </w:pPr>
-      <w:r/>
       <w:hyperlink w:tooltip="#_Toc3" w:anchor="_Toc3" w:history="1">
         <w:r>
           <w:rPr>
@@ -3970,12 +3967,11 @@
           <w:fldChar w:fldCharType="begin"/>
           <w:instrText xml:space="preserve">PAGEREF _Toc3 \h</w:instrText>
           <w:fldChar w:fldCharType="separate"/>
-          <w:t xml:space="preserve">24</w:t>
+          <w:t xml:space="preserve">25</w:t>
           <w:fldChar w:fldCharType="end"/>
         </w:r>
       </w:hyperlink>
       <w:r/>
-      <w:r/>
     </w:p>
     <w:p>
       <w:pPr>
@@ -3988,7 +3984,6 @@
         <w:ind/>
         <w:rPr/>
       </w:pPr>
-      <w:r/>
       <w:hyperlink w:tooltip="#_Toc4" w:anchor="_Toc4" w:history="1">
         <w:r>
           <w:rPr>
@@ -4025,12 +4020,11 @@
           <w:fldChar w:fldCharType="begin"/>
           <w:instrText xml:space="preserve">PAGEREF _Toc4 \h</w:instrText>
           <w:fldChar w:fldCharType="separate"/>
-          <w:t xml:space="preserve">25</w:t>
+          <w:t xml:space="preserve">26</w:t>
           <w:fldChar w:fldCharType="end"/>
         </w:r>
       </w:hyperlink>
       <w:r/>
-      <w:r/>
     </w:p>
     <w:p>
       <w:pPr>
@@ -4043,7 +4037,6 @@
         <w:ind/>
         <w:rPr/>
       </w:pPr>
-      <w:r/>
       <w:hyperlink w:tooltip="#_Toc5" w:anchor="_Toc5" w:history="1">
         <w:r>
           <w:rPr>
@@ -4080,12 +4073,11 @@
           <w:fldChar w:fldCharType="begin"/>
           <w:instrText xml:space="preserve">PAGEREF _Toc5 \h</w:instrText>
           <w:fldChar w:fldCharType="separate"/>
-          <w:t xml:space="preserve">43</w:t>
+          <w:t xml:space="preserve">44</w:t>
           <w:fldChar w:fldCharType="end"/>
         </w:r>
       </w:hyperlink>
       <w:r/>
-      <w:r/>
     </w:p>
     <w:p>
       <w:pPr>
@@ -4098,7 +4090,6 @@
         <w:ind/>
         <w:rPr/>
       </w:pPr>
-      <w:r/>
       <w:hyperlink w:tooltip="#_Toc6" w:anchor="_Toc6" w:history="1">
         <w:r>
           <w:rPr>
@@ -4147,12 +4138,11 @@
           <w:fldChar w:fldCharType="begin"/>
           <w:instrText xml:space="preserve">PAGEREF _Toc6 \h</w:instrText>
           <w:fldChar w:fldCharType="separate"/>
-          <w:t xml:space="preserve">68</w:t>
+          <w:t xml:space="preserve">69</w:t>
           <w:fldChar w:fldCharType="end"/>
         </w:r>
       </w:hyperlink>
       <w:r/>
-      <w:r/>
     </w:p>
     <w:p>
       <w:pPr>
@@ -4165,7 +4155,6 @@
         <w:ind/>
         <w:rPr/>
       </w:pPr>
-      <w:r/>
       <w:hyperlink w:tooltip="#_Toc7" w:anchor="_Toc7" w:history="1">
         <w:r>
           <w:rPr>
@@ -4214,12 +4203,11 @@
           <w:fldChar w:fldCharType="begin"/>
           <w:instrText xml:space="preserve">PAGEREF _Toc7 \h</w:instrText>
           <w:fldChar w:fldCharType="separate"/>
-          <w:t xml:space="preserve">69</w:t>
+          <w:t xml:space="preserve">70</w:t>
           <w:fldChar w:fldCharType="end"/>
         </w:r>
       </w:hyperlink>
       <w:r/>
-      <w:r/>
     </w:p>
     <w:p>
       <w:pPr>
@@ -4232,7 +4220,6 @@
         <w:ind/>
         <w:rPr/>
       </w:pPr>
-      <w:r/>
       <w:hyperlink w:tooltip="#_Toc8" w:anchor="_Toc8" w:history="1">
         <w:r>
           <w:rPr>
@@ -4269,12 +4256,11 @@
           <w:fldChar w:fldCharType="begin"/>
           <w:instrText xml:space="preserve">PAGEREF _Toc8 \h</w:instrText>
           <w:fldChar w:fldCharType="separate"/>
-          <w:t xml:space="preserve">70</w:t>
+          <w:t xml:space="preserve">71</w:t>
           <w:fldChar w:fldCharType="end"/>
         </w:r>
       </w:hyperlink>
       <w:r/>
-      <w:r/>
     </w:p>
     <w:p>
       <w:pPr>
@@ -4287,7 +4273,6 @@
         <w:ind/>
         <w:rPr/>
       </w:pPr>
-      <w:r/>
       <w:hyperlink w:tooltip="#_Toc9" w:anchor="_Toc9" w:history="1">
         <w:r>
           <w:rPr>
@@ -4324,12 +4309,11 @@
           <w:fldChar w:fldCharType="begin"/>
           <w:instrText xml:space="preserve">PAGEREF _Toc9 \h</w:instrText>
           <w:fldChar w:fldCharType="separate"/>
-          <w:t xml:space="preserve">74</w:t>
+          <w:t xml:space="preserve">75</w:t>
           <w:fldChar w:fldCharType="end"/>
         </w:r>
       </w:hyperlink>
       <w:r/>
-      <w:r/>
     </w:p>
     <w:p>
       <w:pPr>
@@ -4342,7 +4326,6 @@
         <w:ind/>
         <w:rPr/>
       </w:pPr>
-      <w:r/>
       <w:hyperlink w:tooltip="#_Toc10" w:anchor="_Toc10" w:history="1">
         <w:r>
           <w:rPr>
@@ -4379,12 +4362,11 @@
           <w:fldChar w:fldCharType="begin"/>
           <w:instrText xml:space="preserve">PAGEREF _Toc10 \h</w:instrText>
           <w:fldChar w:fldCharType="separate"/>
-          <w:t xml:space="preserve">75</w:t>
+          <w:t xml:space="preserve">76</w:t>
           <w:fldChar w:fldCharType="end"/>
         </w:r>
       </w:hyperlink>
       <w:r/>
-      <w:r/>
     </w:p>
     <w:p>
       <w:pPr>
@@ -4397,7 +4379,6 @@
         <w:ind/>
         <w:rPr/>
       </w:pPr>
-      <w:r/>
       <w:hyperlink w:tooltip="#_Toc11" w:anchor="_Toc11" w:history="1">
         <w:r>
           <w:rPr>
@@ -4434,12 +4415,11 @@
           <w:fldChar w:fldCharType="begin"/>
           <w:instrText xml:space="preserve">PAGEREF _Toc11 \h</w:instrText>
           <w:fldChar w:fldCharType="separate"/>
-          <w:t xml:space="preserve">76</w:t>
+          <w:t xml:space="preserve">77</w:t>
           <w:fldChar w:fldCharType="end"/>
         </w:r>
       </w:hyperlink>
       <w:r/>
-      <w:r/>
     </w:p>
     <w:p>
       <w:pPr>
@@ -4452,7 +4432,6 @@
         <w:ind/>
         <w:rPr/>
       </w:pPr>
-      <w:r/>
       <w:hyperlink w:tooltip="#_Toc12" w:anchor="_Toc12" w:history="1">
         <w:r>
           <w:rPr>
@@ -4489,12 +4468,11 @@
           <w:fldChar w:fldCharType="begin"/>
           <w:instrText xml:space="preserve">PAGEREF _Toc12 \h</w:instrText>
           <w:fldChar w:fldCharType="separate"/>
-          <w:t xml:space="preserve">76</w:t>
+          <w:t xml:space="preserve">78</w:t>
           <w:fldChar w:fldCharType="end"/>
         </w:r>
       </w:hyperlink>
       <w:r/>
-      <w:r/>
     </w:p>
     <w:p>
       <w:pPr>
@@ -4507,7 +4485,6 @@
         <w:ind/>
         <w:rPr/>
       </w:pPr>
-      <w:r/>
       <w:hyperlink w:tooltip="#_Toc13" w:anchor="_Toc13" w:history="1">
         <w:r>
           <w:rPr>
@@ -4544,12 +4521,11 @@
           <w:fldChar w:fldCharType="begin"/>
           <w:instrText xml:space="preserve">PAGEREF _Toc13 \h</w:instrText>
           <w:fldChar w:fldCharType="separate"/>
-          <w:t xml:space="preserve">77</w:t>
+          <w:t xml:space="preserve">79</w:t>
           <w:fldChar w:fldCharType="end"/>
         </w:r>
       </w:hyperlink>
       <w:r/>
-      <w:r/>
     </w:p>
     <w:p>
       <w:pPr>
@@ -4562,7 +4538,6 @@
         <w:ind/>
         <w:rPr/>
       </w:pPr>
-      <w:r/>
       <w:hyperlink w:tooltip="#_Toc14" w:anchor="_Toc14" w:history="1">
         <w:r>
           <w:rPr>
@@ -4599,12 +4574,11 @@
           <w:fldChar w:fldCharType="begin"/>
           <w:instrText xml:space="preserve">PAGEREF _Toc14 \h</w:instrText>
           <w:fldChar w:fldCharType="separate"/>
-          <w:t xml:space="preserve">78</w:t>
+          <w:t xml:space="preserve">80</w:t>
           <w:fldChar w:fldCharType="end"/>
         </w:r>
       </w:hyperlink>
       <w:r/>
-      <w:r/>
     </w:p>
     <w:p>
       <w:pPr>
@@ -4617,7 +4591,6 @@
         <w:ind/>
         <w:rPr/>
       </w:pPr>
-      <w:r/>
       <w:hyperlink w:tooltip="#_Toc15" w:anchor="_Toc15" w:history="1">
         <w:r>
           <w:rPr>
@@ -4654,12 +4627,11 @@
           <w:fldChar w:fldCharType="begin"/>
           <w:instrText xml:space="preserve">PAGEREF _Toc15 \h</w:instrText>
           <w:fldChar w:fldCharType="separate"/>
-          <w:t xml:space="preserve">79</w:t>
+          <w:t xml:space="preserve">81</w:t>
           <w:fldChar w:fldCharType="end"/>
         </w:r>
       </w:hyperlink>
       <w:r/>
-      <w:r/>
     </w:p>
     <w:p>
       <w:pPr>
@@ -4670,9 +4642,10 @@
         </w:tabs>
         <w:spacing/>
         <w:ind/>
-        <w:rPr/>
-      </w:pPr>
-      <w:r/>
+        <w:rPr>
+          <w:highlight w:val="none"/>
+        </w:rPr>
+      </w:pPr>
       <w:hyperlink w:tooltip="#_Toc16" w:anchor="_Toc16" w:history="1">
         <w:r>
           <w:rPr>
@@ -4700,6 +4673,7 @@
         <w:r>
           <w:rPr>
             <w:rStyle w:val="1828"/>
+            <w:highlight w:val="none"/>
           </w:rPr>
         </w:r>
         <w:r>
@@ -4709,12 +4683,15 @@
           <w:fldChar w:fldCharType="begin"/>
           <w:instrText xml:space="preserve">PAGEREF _Toc16 \h</w:instrText>
           <w:fldChar w:fldCharType="separate"/>
-          <w:t xml:space="preserve">80</w:t>
+          <w:t xml:space="preserve">82</w:t>
           <w:fldChar w:fldCharType="end"/>
         </w:r>
       </w:hyperlink>
-      <w:r/>
-      <w:r/>
+      <w:r>
+        <w:rPr>
+          <w:highlight w:val="none"/>
+        </w:rPr>
+      </w:r>
     </w:p>
     <w:p>
       <w:pPr>
@@ -4727,7 +4704,6 @@
         <w:ind/>
         <w:rPr/>
       </w:pPr>
-      <w:r/>
       <w:hyperlink w:tooltip="#_Toc17" w:anchor="_Toc17" w:history="1">
         <w:r>
           <w:rPr>
@@ -4764,12 +4740,11 @@
           <w:fldChar w:fldCharType="begin"/>
           <w:instrText xml:space="preserve">PAGEREF _Toc17 \h</w:instrText>
           <w:fldChar w:fldCharType="separate"/>
-          <w:t xml:space="preserve">80</w:t>
+          <w:t xml:space="preserve">82</w:t>
           <w:fldChar w:fldCharType="end"/>
         </w:r>
       </w:hyperlink>
       <w:r/>
-      <w:r/>
     </w:p>
     <w:p>
       <w:pPr>
@@ -4782,7 +4757,6 @@
         <w:ind/>
         <w:rPr/>
       </w:pPr>
-      <w:r/>
       <w:hyperlink w:tooltip="#_Toc18" w:anchor="_Toc18" w:history="1">
         <w:r>
           <w:rPr>
@@ -4819,13 +4793,10 @@
           <w:fldChar w:fldCharType="begin"/>
           <w:instrText xml:space="preserve">PAGEREF _Toc18 \h</w:instrText>
           <w:fldChar w:fldCharType="separate"/>
-          <w:t xml:space="preserve">81</w:t>
+          <w:t xml:space="preserve">83</w:t>
           <w:fldChar w:fldCharType="end"/>
         </w:r>
       </w:hyperlink>
-      <w:r>
-        <w:fldChar w:fldCharType="end"/>
-      </w:r>
       <w:r/>
     </w:p>
     <w:p>
@@ -4839,8 +4810,7 @@
         <w:ind/>
         <w:rPr/>
       </w:pPr>
-      <w:r/>
-      <w:hyperlink w:tooltip="#_TocFig19" w:anchor="_TocFig19" w:history="1">
+      <w:hyperlink w:tooltip="#_Toc19" w:anchor="_Toc19" w:history="1">
         <w:r>
           <w:rPr>
             <w:rStyle w:val="1828"/>
@@ -4874,25 +4844,33 @@
         </w:r>
         <w:r>
           <w:fldChar w:fldCharType="begin"/>
-          <w:instrText xml:space="preserve">PAGEREF _TocFig19 \h</w:instrText>
+          <w:instrText xml:space="preserve">PAGEREF _Toc19 \h</w:instrText>
           <w:fldChar w:fldCharType="separate"/>
-          <w:t xml:space="preserve">81</w:t>
+          <w:t xml:space="preserve">84</w:t>
           <w:fldChar w:fldCharType="end"/>
         </w:r>
       </w:hyperlink>
+      <w:r/>
+    </w:p>
+    <w:p>
+      <w:pPr>
+        <w:pStyle w:val="1847"/>
+        <w:pBdr/>
+        <w:tabs>
+          <w:tab w:val="right" w:leader="dot" w:pos="9072"/>
+        </w:tabs>
+        <w:spacing/>
+        <w:ind/>
+        <w:rPr/>
+      </w:pPr>
+      <w:r>
+        <w:rPr>
+          <w:caps w:val="0"/>
+        </w:rPr>
+      </w:r>
       <w:r>
         <w:fldChar w:fldCharType="end"/>
       </w:r>
-      <w:r/>
-    </w:p>
-    <w:p>
-      <w:pPr>
-        <w:pStyle w:val="1830"/>
-        <w:pBdr/>
-        <w:spacing/>
-        <w:ind/>
-        <w:rPr/>
-      </w:pPr>
       <w:r/>
       <w:r/>
     </w:p>
@@ -4933,6 +4911,7 @@
       <w:r>
         <w:fldChar w:fldCharType="separate"/>
       </w:r>
+      <w:r/>
       <w:hyperlink w:tooltip="#_Toc1" w:anchor="_Toc1" w:history="1">
         <w:r>
           <w:rPr>
@@ -4969,12 +4948,11 @@
           <w:fldChar w:fldCharType="begin"/>
           <w:instrText xml:space="preserve">PAGEREF _Toc1 \h</w:instrText>
           <w:fldChar w:fldCharType="separate"/>
-          <w:t xml:space="preserve">96</w:t>
+          <w:t xml:space="preserve">100</w:t>
           <w:fldChar w:fldCharType="end"/>
         </w:r>
       </w:hyperlink>
       <w:r/>
-      <w:r/>
     </w:p>
     <w:p>
       <w:pPr>
@@ -4987,7 +4965,6 @@
         <w:ind/>
         <w:rPr/>
       </w:pPr>
-      <w:r/>
       <w:hyperlink w:tooltip="#_Toc2" w:anchor="_Toc2" w:history="1">
         <w:r>
           <w:rPr>
@@ -5024,12 +5001,11 @@
           <w:fldChar w:fldCharType="begin"/>
           <w:instrText xml:space="preserve">PAGEREF _Toc2 \h</w:instrText>
           <w:fldChar w:fldCharType="separate"/>
-          <w:t xml:space="preserve">96</w:t>
+          <w:t xml:space="preserve">100</w:t>
           <w:fldChar w:fldCharType="end"/>
         </w:r>
       </w:hyperlink>
       <w:r/>
-      <w:r/>
     </w:p>
     <w:p>
       <w:pPr>
@@ -5042,7 +5018,6 @@
         <w:ind/>
         <w:rPr/>
       </w:pPr>
-      <w:r/>
       <w:hyperlink w:tooltip="#_Toc3" w:anchor="_Toc3" w:history="1">
         <w:r>
           <w:rPr>
@@ -5079,12 +5054,11 @@
           <w:fldChar w:fldCharType="begin"/>
           <w:instrText xml:space="preserve">PAGEREF _Toc3 \h</w:instrText>
           <w:fldChar w:fldCharType="separate"/>
-          <w:t xml:space="preserve">97</w:t>
+          <w:t xml:space="preserve">101</w:t>
           <w:fldChar w:fldCharType="end"/>
         </w:r>
       </w:hyperlink>
       <w:r/>
-      <w:r/>
     </w:p>
     <w:p>
       <w:pPr>
@@ -5097,9 +5071,11 @@
         <w:ind/>
         <w:rPr/>
       </w:pPr>
+      <w:r/>
       <w:r>
         <w:fldChar w:fldCharType="end"/>
       </w:r>
+      <w:r/>
       <w:r/>
     </w:p>
     <w:p>
@@ -9541,6 +9517,7 @@
         </w:rPr>
         <w:fldChar w:fldCharType="separate"/>
       </w:r>
+      <w:r/>
       <w:hyperlink w:tooltip="#_Toc1" w:anchor="_Toc1" w:history="1">
         <w:r>
           <w:rPr>
@@ -9565,12 +9542,11 @@
           <w:fldChar w:fldCharType="begin"/>
           <w:instrText xml:space="preserve">PAGEREF _Toc1 \h</w:instrText>
           <w:fldChar w:fldCharType="separate"/>
-          <w:t xml:space="preserve">18</w:t>
+          <w:t xml:space="preserve">0</w:t>
           <w:fldChar w:fldCharType="end"/>
         </w:r>
       </w:hyperlink>
       <w:r/>
-      <w:r/>
     </w:p>
     <w:p>
       <w:pPr>
@@ -9583,7 +9559,6 @@
         <w:ind/>
         <w:rPr/>
       </w:pPr>
-      <w:r/>
       <w:hyperlink w:tooltip="#_Toc2" w:anchor="_Toc2" w:history="1">
         <w:r>
           <w:rPr>
@@ -9608,12 +9583,11 @@
           <w:fldChar w:fldCharType="begin"/>
           <w:instrText xml:space="preserve">PAGEREF _Toc2 \h</w:instrText>
           <w:fldChar w:fldCharType="separate"/>
-          <w:t xml:space="preserve">20</w:t>
+          <w:t xml:space="preserve">0</w:t>
           <w:fldChar w:fldCharType="end"/>
         </w:r>
       </w:hyperlink>
       <w:r/>
-      <w:r/>
     </w:p>
     <w:p>
       <w:pPr>
@@ -9626,7 +9600,6 @@
         <w:ind/>
         <w:rPr/>
       </w:pPr>
-      <w:r/>
       <w:hyperlink w:tooltip="#_Toc3" w:anchor="_Toc3" w:history="1">
         <w:r>
           <w:rPr>
@@ -9651,12 +9624,11 @@
           <w:fldChar w:fldCharType="begin"/>
           <w:instrText xml:space="preserve">PAGEREF _Toc3 \h</w:instrText>
           <w:fldChar w:fldCharType="separate"/>
-          <w:t xml:space="preserve">20</w:t>
+          <w:t xml:space="preserve">0</w:t>
           <w:fldChar w:fldCharType="end"/>
         </w:r>
       </w:hyperlink>
       <w:r/>
-      <w:r/>
     </w:p>
     <w:p>
       <w:pPr>
@@ -9669,7 +9641,6 @@
         <w:ind/>
         <w:rPr/>
       </w:pPr>
-      <w:r/>
       <w:hyperlink w:tooltip="#_Toc4" w:anchor="_Toc4" w:history="1">
         <w:r>
           <w:rPr>
@@ -9694,12 +9665,11 @@
           <w:fldChar w:fldCharType="begin"/>
           <w:instrText xml:space="preserve">PAGEREF _Toc4 \h</w:instrText>
           <w:fldChar w:fldCharType="separate"/>
-          <w:t xml:space="preserve">21</w:t>
+          <w:t xml:space="preserve">0</w:t>
           <w:fldChar w:fldCharType="end"/>
         </w:r>
       </w:hyperlink>
       <w:r/>
-      <w:r/>
     </w:p>
     <w:p>
       <w:pPr>
@@ -9712,7 +9682,6 @@
         <w:ind/>
         <w:rPr/>
       </w:pPr>
-      <w:r/>
       <w:hyperlink w:tooltip="#_Toc5" w:anchor="_Toc5" w:history="1">
         <w:r>
           <w:rPr>
@@ -9737,12 +9706,11 @@
           <w:fldChar w:fldCharType="begin"/>
           <w:instrText xml:space="preserve">PAGEREF _Toc5 \h</w:instrText>
           <w:fldChar w:fldCharType="separate"/>
-          <w:t xml:space="preserve">21</w:t>
+          <w:t xml:space="preserve">0</w:t>
           <w:fldChar w:fldCharType="end"/>
         </w:r>
       </w:hyperlink>
       <w:r/>
-      <w:r/>
     </w:p>
     <w:p>
       <w:pPr>
@@ -9755,7 +9723,6 @@
         <w:ind/>
         <w:rPr/>
       </w:pPr>
-      <w:r/>
       <w:hyperlink w:tooltip="#_Toc6" w:anchor="_Toc6" w:history="1">
         <w:r>
           <w:rPr>
@@ -9780,12 +9747,11 @@
           <w:fldChar w:fldCharType="begin"/>
           <w:instrText xml:space="preserve">PAGEREF _Toc6 \h</w:instrText>
           <w:fldChar w:fldCharType="separate"/>
-          <w:t xml:space="preserve">21</w:t>
+          <w:t xml:space="preserve">0</w:t>
           <w:fldChar w:fldCharType="end"/>
         </w:r>
       </w:hyperlink>
       <w:r/>
-      <w:r/>
     </w:p>
     <w:p>
       <w:pPr>
@@ -9798,7 +9764,6 @@
         <w:ind/>
         <w:rPr/>
       </w:pPr>
-      <w:r/>
       <w:hyperlink w:tooltip="#_Toc7" w:anchor="_Toc7" w:history="1">
         <w:r>
           <w:rPr>
@@ -9824,12 +9789,11 @@
           <w:fldChar w:fldCharType="begin"/>
           <w:instrText xml:space="preserve">PAGEREF _Toc7 \h</w:instrText>
           <w:fldChar w:fldCharType="separate"/>
-          <w:t xml:space="preserve">22</w:t>
+          <w:t xml:space="preserve">0</w:t>
           <w:fldChar w:fldCharType="end"/>
         </w:r>
       </w:hyperlink>
       <w:r/>
-      <w:r/>
     </w:p>
     <w:p>
       <w:pPr>
@@ -9842,7 +9806,6 @@
         <w:ind/>
         <w:rPr/>
       </w:pPr>
-      <w:r/>
       <w:hyperlink w:tooltip="#_Toc8" w:anchor="_Toc8" w:history="1">
         <w:r>
           <w:rPr>
@@ -9867,12 +9830,11 @@
           <w:fldChar w:fldCharType="begin"/>
           <w:instrText xml:space="preserve">PAGEREF _Toc8 \h</w:instrText>
           <w:fldChar w:fldCharType="separate"/>
-          <w:t xml:space="preserve">26</w:t>
+          <w:t xml:space="preserve">0</w:t>
           <w:fldChar w:fldCharType="end"/>
         </w:r>
       </w:hyperlink>
       <w:r/>
-      <w:r/>
     </w:p>
     <w:p>
       <w:pPr>
@@ -9885,7 +9847,6 @@
         <w:ind/>
         <w:rPr/>
       </w:pPr>
-      <w:r/>
       <w:hyperlink w:tooltip="#_Toc9" w:anchor="_Toc9" w:history="1">
         <w:r>
           <w:rPr>
@@ -9910,12 +9871,11 @@
           <w:fldChar w:fldCharType="begin"/>
           <w:instrText xml:space="preserve">PAGEREF _Toc9 \h</w:instrText>
           <w:fldChar w:fldCharType="separate"/>
-          <w:t xml:space="preserve">26</w:t>
+          <w:t xml:space="preserve">0</w:t>
           <w:fldChar w:fldCharType="end"/>
         </w:r>
       </w:hyperlink>
       <w:r/>
-      <w:r/>
     </w:p>
     <w:p>
       <w:pPr>
@@ -9928,7 +9888,6 @@
         <w:ind/>
         <w:rPr/>
       </w:pPr>
-      <w:r/>
       <w:hyperlink w:tooltip="#_Toc10" w:anchor="_Toc10" w:history="1">
         <w:r>
           <w:rPr>
@@ -9953,12 +9912,11 @@
           <w:fldChar w:fldCharType="begin"/>
           <w:instrText xml:space="preserve">PAGEREF _Toc10 \h</w:instrText>
           <w:fldChar w:fldCharType="separate"/>
-          <w:t xml:space="preserve">27</w:t>
+          <w:t xml:space="preserve">0</w:t>
           <w:fldChar w:fldCharType="end"/>
         </w:r>
       </w:hyperlink>
       <w:r/>
-      <w:r/>
     </w:p>
     <w:p>
       <w:pPr>
@@ -9971,7 +9929,6 @@
         <w:ind/>
         <w:rPr/>
       </w:pPr>
-      <w:r/>
       <w:hyperlink w:tooltip="#_Toc11" w:anchor="_Toc11" w:history="1">
         <w:r>
           <w:rPr>
@@ -9996,12 +9953,11 @@
           <w:fldChar w:fldCharType="begin"/>
           <w:instrText xml:space="preserve">PAGEREF _Toc11 \h</w:instrText>
           <w:fldChar w:fldCharType="separate"/>
-          <w:t xml:space="preserve">27</w:t>
+          <w:t xml:space="preserve">0</w:t>
           <w:fldChar w:fldCharType="end"/>
         </w:r>
       </w:hyperlink>
       <w:r/>
-      <w:r/>
     </w:p>
     <w:p>
       <w:pPr>
@@ -10014,7 +9970,6 @@
         <w:ind/>
         <w:rPr/>
       </w:pPr>
-      <w:r/>
       <w:hyperlink w:tooltip="#_Toc12" w:anchor="_Toc12" w:history="1">
         <w:r>
           <w:rPr>
@@ -10039,12 +9994,11 @@
           <w:fldChar w:fldCharType="begin"/>
           <w:instrText xml:space="preserve">PAGEREF _Toc12 \h</w:instrText>
           <w:fldChar w:fldCharType="separate"/>
-          <w:t xml:space="preserve">27</w:t>
+          <w:t xml:space="preserve">0</w:t>
           <w:fldChar w:fldCharType="end"/>
         </w:r>
       </w:hyperlink>
       <w:r/>
-      <w:r/>
     </w:p>
     <w:p>
       <w:pPr>
@@ -10057,7 +10011,6 @@
         <w:ind/>
         <w:rPr/>
       </w:pPr>
-      <w:r/>
       <w:hyperlink w:tooltip="#_Toc13" w:anchor="_Toc13" w:history="1">
         <w:r>
           <w:rPr>
@@ -10082,12 +10035,11 @@
           <w:fldChar w:fldCharType="begin"/>
           <w:instrText xml:space="preserve">PAGEREF _Toc13 \h</w:instrText>
           <w:fldChar w:fldCharType="separate"/>
-          <w:t xml:space="preserve">28</w:t>
+          <w:t xml:space="preserve">0</w:t>
           <w:fldChar w:fldCharType="end"/>
         </w:r>
       </w:hyperlink>
       <w:r/>
-      <w:r/>
     </w:p>
     <w:p>
       <w:pPr>
@@ -10100,7 +10052,6 @@
         <w:ind/>
         <w:rPr/>
       </w:pPr>
-      <w:r/>
       <w:hyperlink w:tooltip="#_Toc14" w:anchor="_Toc14" w:history="1">
         <w:r>
           <w:rPr>
@@ -10125,12 +10076,11 @@
           <w:fldChar w:fldCharType="begin"/>
           <w:instrText xml:space="preserve">PAGEREF _Toc14 \h</w:instrText>
           <w:fldChar w:fldCharType="separate"/>
-          <w:t xml:space="preserve">30</w:t>
+          <w:t xml:space="preserve">0</w:t>
           <w:fldChar w:fldCharType="end"/>
         </w:r>
       </w:hyperlink>
       <w:r/>
-      <w:r/>
     </w:p>
     <w:p>
       <w:pPr>
@@ -10143,7 +10093,6 @@
         <w:ind/>
         <w:rPr/>
       </w:pPr>
-      <w:r/>
       <w:hyperlink w:tooltip="#_Toc15" w:anchor="_Toc15" w:history="1">
         <w:r>
           <w:rPr>
@@ -10168,12 +10117,11 @@
           <w:fldChar w:fldCharType="begin"/>
           <w:instrText xml:space="preserve">PAGEREF _Toc15 \h</w:instrText>
           <w:fldChar w:fldCharType="separate"/>
-          <w:t xml:space="preserve">33</w:t>
+          <w:t xml:space="preserve">0</w:t>
           <w:fldChar w:fldCharType="end"/>
         </w:r>
       </w:hyperlink>
       <w:r/>
-      <w:r/>
     </w:p>
     <w:p>
       <w:pPr>
@@ -10186,7 +10134,6 @@
         <w:ind/>
         <w:rPr/>
       </w:pPr>
-      <w:r/>
       <w:hyperlink w:tooltip="#_Toc16" w:anchor="_Toc16" w:history="1">
         <w:r>
           <w:rPr>
@@ -10211,12 +10158,11 @@
           <w:fldChar w:fldCharType="begin"/>
           <w:instrText xml:space="preserve">PAGEREF _Toc16 \h</w:instrText>
           <w:fldChar w:fldCharType="separate"/>
-          <w:t xml:space="preserve">33</w:t>
+          <w:t xml:space="preserve">0</w:t>
           <w:fldChar w:fldCharType="end"/>
         </w:r>
       </w:hyperlink>
       <w:r/>
-      <w:r/>
     </w:p>
     <w:p>
       <w:pPr>
@@ -10229,7 +10175,6 @@
         <w:ind/>
         <w:rPr/>
       </w:pPr>
-      <w:r/>
       <w:hyperlink w:tooltip="#_Toc17" w:anchor="_Toc17" w:history="1">
         <w:r>
           <w:rPr>
@@ -10254,12 +10199,11 @@
           <w:fldChar w:fldCharType="begin"/>
           <w:instrText xml:space="preserve">PAGEREF _Toc17 \h</w:instrText>
           <w:fldChar w:fldCharType="separate"/>
-          <w:t xml:space="preserve">35</w:t>
+          <w:t xml:space="preserve">0</w:t>
           <w:fldChar w:fldCharType="end"/>
         </w:r>
       </w:hyperlink>
       <w:r/>
-      <w:r/>
     </w:p>
     <w:p>
       <w:pPr>
@@ -10272,7 +10216,6 @@
         <w:ind/>
         <w:rPr/>
       </w:pPr>
-      <w:r/>
       <w:hyperlink w:tooltip="#_Toc18" w:anchor="_Toc18" w:history="1">
         <w:r>
           <w:rPr>
@@ -10297,12 +10240,11 @@
           <w:fldChar w:fldCharType="begin"/>
           <w:instrText xml:space="preserve">PAGEREF _Toc18 \h</w:instrText>
           <w:fldChar w:fldCharType="separate"/>
-          <w:t xml:space="preserve">35</w:t>
+          <w:t xml:space="preserve">0</w:t>
           <w:fldChar w:fldCharType="end"/>
         </w:r>
       </w:hyperlink>
       <w:r/>
-      <w:r/>
     </w:p>
     <w:p>
       <w:pPr>
@@ -10315,7 +10257,6 @@
         <w:ind/>
         <w:rPr/>
       </w:pPr>
-      <w:r/>
       <w:hyperlink w:tooltip="#_Toc19" w:anchor="_Toc19" w:history="1">
         <w:r>
           <w:rPr>
@@ -10340,12 +10281,11 @@
           <w:fldChar w:fldCharType="begin"/>
           <w:instrText xml:space="preserve">PAGEREF _Toc19 \h</w:instrText>
           <w:fldChar w:fldCharType="separate"/>
-          <w:t xml:space="preserve">35</w:t>
+          <w:t xml:space="preserve">0</w:t>
           <w:fldChar w:fldCharType="end"/>
         </w:r>
       </w:hyperlink>
       <w:r/>
-      <w:r/>
     </w:p>
     <w:p>
       <w:pPr>
@@ -10358,7 +10298,6 @@
         <w:ind/>
         <w:rPr/>
       </w:pPr>
-      <w:r/>
       <w:hyperlink w:tooltip="#_Toc20" w:anchor="_Toc20" w:history="1">
         <w:r>
           <w:rPr>
@@ -10383,12 +10322,11 @@
           <w:fldChar w:fldCharType="begin"/>
           <w:instrText xml:space="preserve">PAGEREF _Toc20 \h</w:instrText>
           <w:fldChar w:fldCharType="separate"/>
-          <w:t xml:space="preserve">36</w:t>
+          <w:t xml:space="preserve">0</w:t>
           <w:fldChar w:fldCharType="end"/>
         </w:r>
       </w:hyperlink>
       <w:r/>
-      <w:r/>
     </w:p>
     <w:p>
       <w:pPr>
@@ -10401,7 +10339,6 @@
         <w:ind/>
         <w:rPr/>
       </w:pPr>
-      <w:r/>
       <w:hyperlink w:tooltip="#_Toc21" w:anchor="_Toc21" w:history="1">
         <w:r>
           <w:rPr>
@@ -10426,12 +10363,11 @@
           <w:fldChar w:fldCharType="begin"/>
           <w:instrText xml:space="preserve">PAGEREF _Toc21 \h</w:instrText>
           <w:fldChar w:fldCharType="separate"/>
-          <w:t xml:space="preserve">36</w:t>
+          <w:t xml:space="preserve">0</w:t>
           <w:fldChar w:fldCharType="end"/>
         </w:r>
       </w:hyperlink>
       <w:r/>
-      <w:r/>
     </w:p>
     <w:p>
       <w:pPr>
@@ -10444,7 +10380,6 @@
         <w:ind/>
         <w:rPr/>
       </w:pPr>
-      <w:r/>
       <w:hyperlink w:tooltip="#_Toc22" w:anchor="_Toc22" w:history="1">
         <w:r>
           <w:rPr>
@@ -10469,12 +10404,11 @@
           <w:fldChar w:fldCharType="begin"/>
           <w:instrText xml:space="preserve">PAGEREF _Toc22 \h</w:instrText>
           <w:fldChar w:fldCharType="separate"/>
-          <w:t xml:space="preserve">38</w:t>
+          <w:t xml:space="preserve">0</w:t>
           <w:fldChar w:fldCharType="end"/>
         </w:r>
       </w:hyperlink>
       <w:r/>
-      <w:r/>
     </w:p>
     <w:p>
       <w:pPr>
@@ -10487,7 +10421,6 @@
         <w:ind/>
         <w:rPr/>
       </w:pPr>
-      <w:r/>
       <w:hyperlink w:tooltip="#_Toc23" w:anchor="_Toc23" w:history="1">
         <w:r>
           <w:rPr>
@@ -10512,12 +10445,11 @@
           <w:fldChar w:fldCharType="begin"/>
           <w:instrText xml:space="preserve">PAGEREF _Toc23 \h</w:instrText>
           <w:fldChar w:fldCharType="separate"/>
-          <w:t xml:space="preserve">39</w:t>
+          <w:t xml:space="preserve">0</w:t>
           <w:fldChar w:fldCharType="end"/>
         </w:r>
       </w:hyperlink>
       <w:r/>
-      <w:r/>
     </w:p>
     <w:p>
       <w:pPr>
@@ -10530,7 +10462,6 @@
         <w:ind/>
         <w:rPr/>
       </w:pPr>
-      <w:r/>
       <w:hyperlink w:tooltip="#_Toc24" w:anchor="_Toc24" w:history="1">
         <w:r>
           <w:rPr>
@@ -10555,11 +10486,10 @@
           <w:fldChar w:fldCharType="begin"/>
           <w:instrText xml:space="preserve">PAGEREF _Toc24 \h</w:instrText>
           <w:fldChar w:fldCharType="separate"/>
-          <w:t xml:space="preserve">40</w:t>
+          <w:t xml:space="preserve">0</w:t>
           <w:fldChar w:fldCharType="end"/>
         </w:r>
       </w:hyperlink>
-      <w:r/>
       <w:r/>
     </w:p>
     <w:p>
@@ -10574,7 +10504,6 @@
         <w:ind/>
         <w:rPr/>
       </w:pPr>
-      <w:r/>
       <w:hyperlink w:tooltip="#_Toc25" w:anchor="_Toc25" w:history="1">
         <w:r>
           <w:rPr>
@@ -10605,12 +10534,11 @@
           <w:fldChar w:fldCharType="begin"/>
           <w:instrText xml:space="preserve">PAGEREF _Toc25 \h</w:instrText>
           <w:fldChar w:fldCharType="separate"/>
-          <w:t xml:space="preserve">40</w:t>
+          <w:t xml:space="preserve">0</w:t>
           <w:fldChar w:fldCharType="end"/>
         </w:r>
       </w:hyperlink>
       <w:r/>
-      <w:r/>
     </w:p>
     <w:p>
       <w:pPr>
@@ -10623,7 +10551,6 @@
         <w:ind/>
         <w:rPr/>
       </w:pPr>
-      <w:r/>
       <w:hyperlink w:tooltip="#_Toc26" w:anchor="_Toc26" w:history="1">
         <w:r>
           <w:rPr>
@@ -10648,12 +10575,11 @@
           <w:fldChar w:fldCharType="begin"/>
           <w:instrText xml:space="preserve">PAGEREF _Toc26 \h</w:instrText>
           <w:fldChar w:fldCharType="separate"/>
-          <w:t xml:space="preserve">41</w:t>
+          <w:t xml:space="preserve">0</w:t>
           <w:fldChar w:fldCharType="end"/>
         </w:r>
       </w:hyperlink>
       <w:r/>
-      <w:r/>
     </w:p>
     <w:p>
       <w:pPr>
@@ -10666,7 +10592,6 @@
         <w:ind/>
         <w:rPr/>
       </w:pPr>
-      <w:r/>
       <w:hyperlink w:tooltip="#_Toc27" w:anchor="_Toc27" w:history="1">
         <w:r>
           <w:rPr>
@@ -10691,12 +10616,11 @@
           <w:fldChar w:fldCharType="begin"/>
           <w:instrText xml:space="preserve">PAGEREF _Toc27 \h</w:instrText>
           <w:fldChar w:fldCharType="separate"/>
-          <w:t xml:space="preserve">42</w:t>
+          <w:t xml:space="preserve">0</w:t>
           <w:fldChar w:fldCharType="end"/>
         </w:r>
       </w:hyperlink>
       <w:r/>
-      <w:r/>
     </w:p>
     <w:p>
       <w:pPr>
@@ -10709,7 +10633,6 @@
         <w:ind/>
         <w:rPr/>
       </w:pPr>
-      <w:r/>
       <w:hyperlink w:tooltip="#_Toc28" w:anchor="_Toc28" w:history="1">
         <w:r>
           <w:rPr>
@@ -10734,12 +10657,11 @@
           <w:fldChar w:fldCharType="begin"/>
           <w:instrText xml:space="preserve">PAGEREF _Toc28 \h</w:instrText>
           <w:fldChar w:fldCharType="separate"/>
-          <w:t xml:space="preserve">44</w:t>
+          <w:t xml:space="preserve">0</w:t>
           <w:fldChar w:fldCharType="end"/>
         </w:r>
       </w:hyperlink>
       <w:r/>
-      <w:r/>
     </w:p>
     <w:p>
       <w:pPr>
@@ -10752,7 +10674,6 @@
         <w:ind/>
         <w:rPr/>
       </w:pPr>
-      <w:r/>
       <w:hyperlink w:tooltip="#_Toc29" w:anchor="_Toc29" w:history="1">
         <w:r>
           <w:rPr>
@@ -10777,12 +10698,11 @@
           <w:fldChar w:fldCharType="begin"/>
           <w:instrText xml:space="preserve">PAGEREF _Toc29 \h</w:instrText>
           <w:fldChar w:fldCharType="separate"/>
-          <w:t xml:space="preserve">44</w:t>
+          <w:t xml:space="preserve">0</w:t>
           <w:fldChar w:fldCharType="end"/>
         </w:r>
       </w:hyperlink>
       <w:r/>
-      <w:r/>
     </w:p>
     <w:p>
       <w:pPr>
@@ -10795,7 +10715,6 @@
         <w:ind/>
         <w:rPr/>
       </w:pPr>
-      <w:r/>
       <w:hyperlink w:tooltip="#_Toc30" w:anchor="_Toc30" w:history="1">
         <w:r>
           <w:rPr>
@@ -10820,12 +10739,11 @@
           <w:fldChar w:fldCharType="begin"/>
           <w:instrText xml:space="preserve">PAGEREF _Toc30 \h</w:instrText>
           <w:fldChar w:fldCharType="separate"/>
-          <w:t xml:space="preserve">44</w:t>
+          <w:t xml:space="preserve">0</w:t>
           <w:fldChar w:fldCharType="end"/>
         </w:r>
       </w:hyperlink>
       <w:r/>
-      <w:r/>
     </w:p>
     <w:p>
       <w:pPr>
@@ -10838,7 +10756,6 @@
         <w:ind/>
         <w:rPr/>
       </w:pPr>
-      <w:r/>
       <w:hyperlink w:tooltip="#_Toc31" w:anchor="_Toc31" w:history="1">
         <w:r>
           <w:rPr>
@@ -10869,12 +10786,11 @@
           <w:fldChar w:fldCharType="begin"/>
           <w:instrText xml:space="preserve">PAGEREF _Toc31 \h</w:instrText>
           <w:fldChar w:fldCharType="separate"/>
-          <w:t xml:space="preserve">52</w:t>
+          <w:t xml:space="preserve">0</w:t>
           <w:fldChar w:fldCharType="end"/>
         </w:r>
       </w:hyperlink>
       <w:r/>
-      <w:r/>
     </w:p>
     <w:p>
       <w:pPr>
@@ -10887,7 +10803,6 @@
         <w:ind/>
         <w:rPr/>
       </w:pPr>
-      <w:r/>
       <w:hyperlink w:tooltip="#_Toc32" w:anchor="_Toc32" w:history="1">
         <w:r>
           <w:rPr>
@@ -10912,12 +10827,11 @@
           <w:fldChar w:fldCharType="begin"/>
           <w:instrText xml:space="preserve">PAGEREF _Toc32 \h</w:instrText>
           <w:fldChar w:fldCharType="separate"/>
-          <w:t xml:space="preserve">57</w:t>
+          <w:t xml:space="preserve">0</w:t>
           <w:fldChar w:fldCharType="end"/>
         </w:r>
       </w:hyperlink>
       <w:r/>
-      <w:r/>
     </w:p>
     <w:p>
       <w:pPr>
@@ -10930,7 +10844,6 @@
         <w:ind/>
         <w:rPr/>
       </w:pPr>
-      <w:r/>
       <w:hyperlink w:tooltip="#_Toc33" w:anchor="_Toc33" w:history="1">
         <w:r>
           <w:rPr>
@@ -10955,12 +10868,11 @@
           <w:fldChar w:fldCharType="begin"/>
           <w:instrText xml:space="preserve">PAGEREF _Toc33 \h</w:instrText>
           <w:fldChar w:fldCharType="separate"/>
-          <w:t xml:space="preserve">60</w:t>
+          <w:t xml:space="preserve">0</w:t>
           <w:fldChar w:fldCharType="end"/>
         </w:r>
       </w:hyperlink>
       <w:r/>
-      <w:r/>
     </w:p>
     <w:p>
       <w:pPr>
@@ -10973,7 +10885,6 @@
         <w:ind/>
         <w:rPr/>
       </w:pPr>
-      <w:r/>
       <w:hyperlink w:tooltip="#_Toc34" w:anchor="_Toc34" w:history="1">
         <w:r>
           <w:rPr>
@@ -10998,12 +10909,11 @@
           <w:fldChar w:fldCharType="begin"/>
           <w:instrText xml:space="preserve">PAGEREF _Toc34 \h</w:instrText>
           <w:fldChar w:fldCharType="separate"/>
-          <w:t xml:space="preserve">60</w:t>
+          <w:t xml:space="preserve">0</w:t>
           <w:fldChar w:fldCharType="end"/>
         </w:r>
       </w:hyperlink>
       <w:r/>
-      <w:r/>
     </w:p>
     <w:p>
       <w:pPr>
@@ -11016,7 +10926,6 @@
         <w:ind/>
         <w:rPr/>
       </w:pPr>
-      <w:r/>
       <w:hyperlink w:tooltip="#_Toc35" w:anchor="_Toc35" w:history="1">
         <w:r>
           <w:rPr>
@@ -11041,12 +10950,11 @@
           <w:fldChar w:fldCharType="begin"/>
           <w:instrText xml:space="preserve">PAGEREF _Toc35 \h</w:instrText>
           <w:fldChar w:fldCharType="separate"/>
-          <w:t xml:space="preserve">60</w:t>
+          <w:t xml:space="preserve">0</w:t>
           <w:fldChar w:fldCharType="end"/>
         </w:r>
       </w:hyperlink>
       <w:r/>
-      <w:r/>
     </w:p>
     <w:p>
       <w:pPr>
@@ -11059,7 +10967,6 @@
         <w:ind/>
         <w:rPr/>
       </w:pPr>
-      <w:r/>
       <w:hyperlink w:tooltip="#_Toc36" w:anchor="_Toc36" w:history="1">
         <w:r>
           <w:rPr>
@@ -11084,12 +10991,11 @@
           <w:fldChar w:fldCharType="begin"/>
           <w:instrText xml:space="preserve">PAGEREF _Toc36 \h</w:instrText>
           <w:fldChar w:fldCharType="separate"/>
-          <w:t xml:space="preserve">61</w:t>
+          <w:t xml:space="preserve">0</w:t>
           <w:fldChar w:fldCharType="end"/>
         </w:r>
       </w:hyperlink>
       <w:r/>
-      <w:r/>
     </w:p>
     <w:p>
       <w:pPr>
@@ -11102,7 +11008,6 @@
         <w:ind/>
         <w:rPr/>
       </w:pPr>
-      <w:r/>
       <w:hyperlink w:tooltip="#_Toc37" w:anchor="_Toc37" w:history="1">
         <w:r>
           <w:rPr>
@@ -11127,12 +11032,11 @@
           <w:fldChar w:fldCharType="begin"/>
           <w:instrText xml:space="preserve">PAGEREF _Toc37 \h</w:instrText>
           <w:fldChar w:fldCharType="separate"/>
-          <w:t xml:space="preserve">63</w:t>
+          <w:t xml:space="preserve">0</w:t>
           <w:fldChar w:fldCharType="end"/>
         </w:r>
       </w:hyperlink>
       <w:r/>
-      <w:r/>
     </w:p>
     <w:p>
       <w:pPr>
@@ -11145,7 +11049,6 @@
         <w:ind/>
         <w:rPr/>
       </w:pPr>
-      <w:r/>
       <w:hyperlink w:tooltip="#_Toc38" w:anchor="_Toc38" w:history="1">
         <w:r>
           <w:rPr>
@@ -11170,12 +11073,11 @@
           <w:fldChar w:fldCharType="begin"/>
           <w:instrText xml:space="preserve">PAGEREF _Toc38 \h</w:instrText>
           <w:fldChar w:fldCharType="separate"/>
-          <w:t xml:space="preserve">63</w:t>
+          <w:t xml:space="preserve">0</w:t>
           <w:fldChar w:fldCharType="end"/>
         </w:r>
       </w:hyperlink>
       <w:r/>
-      <w:r/>
     </w:p>
     <w:p>
       <w:pPr>
@@ -11188,7 +11090,6 @@
         <w:ind/>
         <w:rPr/>
       </w:pPr>
-      <w:r/>
       <w:hyperlink w:tooltip="#_Toc39" w:anchor="_Toc39" w:history="1">
         <w:r>
           <w:rPr>
@@ -11213,12 +11114,11 @@
           <w:fldChar w:fldCharType="begin"/>
           <w:instrText xml:space="preserve">PAGEREF _Toc39 \h</w:instrText>
           <w:fldChar w:fldCharType="separate"/>
-          <w:t xml:space="preserve">63</w:t>
+          <w:t xml:space="preserve">0</w:t>
           <w:fldChar w:fldCharType="end"/>
         </w:r>
       </w:hyperlink>
       <w:r/>
-      <w:r/>
     </w:p>
     <w:p>
       <w:pPr>
@@ -11231,7 +11131,6 @@
         <w:ind/>
         <w:rPr/>
       </w:pPr>
-      <w:r/>
       <w:hyperlink w:tooltip="#_Toc40" w:anchor="_Toc40" w:history="1">
         <w:r>
           <w:rPr>
@@ -11256,12 +11155,11 @@
           <w:fldChar w:fldCharType="begin"/>
           <w:instrText xml:space="preserve">PAGEREF _Toc40 \h</w:instrText>
           <w:fldChar w:fldCharType="separate"/>
-          <w:t xml:space="preserve">64</w:t>
+          <w:t xml:space="preserve">0</w:t>
           <w:fldChar w:fldCharType="end"/>
         </w:r>
       </w:hyperlink>
       <w:r/>
-      <w:r/>
     </w:p>
     <w:p>
       <w:pPr>
@@ -11274,7 +11172,6 @@
         <w:ind/>
         <w:rPr/>
       </w:pPr>
-      <w:r/>
       <w:hyperlink w:tooltip="#_Toc41" w:anchor="_Toc41" w:history="1">
         <w:r>
           <w:rPr>
@@ -11299,12 +11196,11 @@
           <w:fldChar w:fldCharType="begin"/>
           <w:instrText xml:space="preserve">PAGEREF _Toc41 \h</w:instrText>
           <w:fldChar w:fldCharType="separate"/>
-          <w:t xml:space="preserve">65</w:t>
+          <w:t xml:space="preserve">0</w:t>
           <w:fldChar w:fldCharType="end"/>
         </w:r>
       </w:hyperlink>
       <w:r/>
-      <w:r/>
     </w:p>
     <w:p>
       <w:pPr>
@@ -11317,7 +11213,6 @@
         <w:ind/>
         <w:rPr/>
       </w:pPr>
-      <w:r/>
       <w:hyperlink w:tooltip="#_Toc42" w:anchor="_Toc42" w:history="1">
         <w:r>
           <w:rPr>
@@ -11342,12 +11237,11 @@
           <w:fldChar w:fldCharType="begin"/>
           <w:instrText xml:space="preserve">PAGEREF _Toc42 \h</w:instrText>
           <w:fldChar w:fldCharType="separate"/>
-          <w:t xml:space="preserve">65</w:t>
+          <w:t xml:space="preserve">0</w:t>
           <w:fldChar w:fldCharType="end"/>
         </w:r>
       </w:hyperlink>
       <w:r/>
-      <w:r/>
     </w:p>
     <w:p>
       <w:pPr>
@@ -11360,7 +11254,6 @@
         <w:ind/>
         <w:rPr/>
       </w:pPr>
-      <w:r/>
       <w:hyperlink w:tooltip="#_Toc43" w:anchor="_Toc43" w:history="1">
         <w:r>
           <w:rPr>
@@ -11385,12 +11278,11 @@
           <w:fldChar w:fldCharType="begin"/>
           <w:instrText xml:space="preserve">PAGEREF _Toc43 \h</w:instrText>
           <w:fldChar w:fldCharType="separate"/>
-          <w:t xml:space="preserve">65</w:t>
+          <w:t xml:space="preserve">0</w:t>
           <w:fldChar w:fldCharType="end"/>
         </w:r>
       </w:hyperlink>
       <w:r/>
-      <w:r/>
     </w:p>
     <w:p>
       <w:pPr>
@@ -11403,7 +11295,6 @@
         <w:ind/>
         <w:rPr/>
       </w:pPr>
-      <w:r/>
       <w:hyperlink w:tooltip="#_Toc44" w:anchor="_Toc44" w:history="1">
         <w:r>
           <w:rPr>
@@ -11428,12 +11319,11 @@
           <w:fldChar w:fldCharType="begin"/>
           <w:instrText xml:space="preserve">PAGEREF _Toc44 \h</w:instrText>
           <w:fldChar w:fldCharType="separate"/>
-          <w:t xml:space="preserve">65</w:t>
+          <w:t xml:space="preserve">0</w:t>
           <w:fldChar w:fldCharType="end"/>
         </w:r>
       </w:hyperlink>
       <w:r/>
-      <w:r/>
     </w:p>
     <w:p>
       <w:pPr>
@@ -11446,7 +11336,6 @@
         <w:ind/>
         <w:rPr/>
       </w:pPr>
-      <w:r/>
       <w:hyperlink w:tooltip="#_Toc45" w:anchor="_Toc45" w:history="1">
         <w:r>
           <w:rPr>
@@ -11471,12 +11360,11 @@
           <w:fldChar w:fldCharType="begin"/>
           <w:instrText xml:space="preserve">PAGEREF _Toc45 \h</w:instrText>
           <w:fldChar w:fldCharType="separate"/>
-          <w:t xml:space="preserve">66</w:t>
+          <w:t xml:space="preserve">0</w:t>
           <w:fldChar w:fldCharType="end"/>
         </w:r>
       </w:hyperlink>
       <w:r/>
-      <w:r/>
     </w:p>
     <w:p>
       <w:pPr>
@@ -11489,7 +11377,6 @@
         <w:ind/>
         <w:rPr/>
       </w:pPr>
-      <w:r/>
       <w:hyperlink w:tooltip="#_Toc46" w:anchor="_Toc46" w:history="1">
         <w:r>
           <w:rPr>
@@ -11514,12 +11401,11 @@
           <w:fldChar w:fldCharType="begin"/>
           <w:instrText xml:space="preserve">PAGEREF _Toc46 \h</w:instrText>
           <w:fldChar w:fldCharType="separate"/>
-          <w:t xml:space="preserve">67</w:t>
+          <w:t xml:space="preserve">0</w:t>
           <w:fldChar w:fldCharType="end"/>
         </w:r>
       </w:hyperlink>
       <w:r/>
-      <w:r/>
     </w:p>
     <w:p>
       <w:pPr>
@@ -11532,7 +11418,6 @@
         <w:ind/>
         <w:rPr/>
       </w:pPr>
-      <w:r/>
       <w:hyperlink w:tooltip="#_Toc47" w:anchor="_Toc47" w:history="1">
         <w:r>
           <w:rPr>
@@ -11557,12 +11442,11 @@
           <w:fldChar w:fldCharType="begin"/>
           <w:instrText xml:space="preserve">PAGEREF _Toc47 \h</w:instrText>
           <w:fldChar w:fldCharType="separate"/>
-          <w:t xml:space="preserve">67</w:t>
+          <w:t xml:space="preserve">0</w:t>
           <w:fldChar w:fldCharType="end"/>
         </w:r>
       </w:hyperlink>
       <w:r/>
-      <w:r/>
     </w:p>
     <w:p>
       <w:pPr>
@@ -11575,7 +11459,6 @@
         <w:ind/>
         <w:rPr/>
       </w:pPr>
-      <w:r/>
       <w:hyperlink w:tooltip="#_Toc48" w:anchor="_Toc48" w:history="1">
         <w:r>
           <w:rPr>
@@ -11600,12 +11483,11 @@
           <w:fldChar w:fldCharType="begin"/>
           <w:instrText xml:space="preserve">PAGEREF _Toc48 \h</w:instrText>
           <w:fldChar w:fldCharType="separate"/>
-          <w:t xml:space="preserve">70</w:t>
+          <w:t xml:space="preserve">0</w:t>
           <w:fldChar w:fldCharType="end"/>
         </w:r>
       </w:hyperlink>
       <w:r/>
-      <w:r/>
     </w:p>
     <w:p>
       <w:pPr>
@@ -11618,7 +11500,6 @@
         <w:ind/>
         <w:rPr/>
       </w:pPr>
-      <w:r/>
       <w:hyperlink w:tooltip="#_Toc49" w:anchor="_Toc49" w:history="1">
         <w:r>
           <w:rPr>
@@ -11643,12 +11524,11 @@
           <w:fldChar w:fldCharType="begin"/>
           <w:instrText xml:space="preserve">PAGEREF _Toc49 \h</w:instrText>
           <w:fldChar w:fldCharType="separate"/>
-          <w:t xml:space="preserve">72</w:t>
+          <w:t xml:space="preserve">0</w:t>
           <w:fldChar w:fldCharType="end"/>
         </w:r>
       </w:hyperlink>
       <w:r/>
-      <w:r/>
     </w:p>
     <w:p>
       <w:pPr>
@@ -11661,7 +11541,6 @@
         <w:ind/>
         <w:rPr/>
       </w:pPr>
-      <w:r/>
       <w:hyperlink w:tooltip="#_Toc50" w:anchor="_Toc50" w:history="1">
         <w:r>
           <w:rPr>
@@ -11686,12 +11565,11 @@
           <w:fldChar w:fldCharType="begin"/>
           <w:instrText xml:space="preserve">PAGEREF _Toc50 \h</w:instrText>
           <w:fldChar w:fldCharType="separate"/>
-          <w:t xml:space="preserve">81</w:t>
+          <w:t xml:space="preserve">0</w:t>
           <w:fldChar w:fldCharType="end"/>
         </w:r>
       </w:hyperlink>
       <w:r/>
-      <w:r/>
     </w:p>
     <w:p>
       <w:pPr>
@@ -11704,7 +11582,6 @@
         <w:ind/>
         <w:rPr/>
       </w:pPr>
-      <w:r/>
       <w:hyperlink w:tooltip="#_Toc51" w:anchor="_Toc51" w:history="1">
         <w:r>
           <w:rPr>
@@ -11729,12 +11606,11 @@
           <w:fldChar w:fldCharType="begin"/>
           <w:instrText xml:space="preserve">PAGEREF _Toc51 \h</w:instrText>
           <w:fldChar w:fldCharType="separate"/>
-          <w:t xml:space="preserve">82</w:t>
+          <w:t xml:space="preserve">0</w:t>
           <w:fldChar w:fldCharType="end"/>
         </w:r>
       </w:hyperlink>
       <w:r/>
-      <w:r/>
     </w:p>
     <w:p>
       <w:pPr>
@@ -11747,7 +11623,6 @@
         <w:ind/>
         <w:rPr/>
       </w:pPr>
-      <w:r/>
       <w:hyperlink w:tooltip="#_Toc52" w:anchor="_Toc52" w:history="1">
         <w:r>
           <w:rPr>
@@ -11772,12 +11647,11 @@
           <w:fldChar w:fldCharType="begin"/>
           <w:instrText xml:space="preserve">PAGEREF _Toc52 \h</w:instrText>
           <w:fldChar w:fldCharType="separate"/>
-          <w:t xml:space="preserve">84</w:t>
+          <w:t xml:space="preserve">0</w:t>
           <w:fldChar w:fldCharType="end"/>
         </w:r>
       </w:hyperlink>
       <w:r/>
-      <w:r/>
     </w:p>
     <w:p>
       <w:pPr>
@@ -11790,7 +11664,6 @@
         <w:ind/>
         <w:rPr/>
       </w:pPr>
-      <w:r/>
       <w:hyperlink w:tooltip="#_Toc53" w:anchor="_Toc53" w:history="1">
         <w:r>
           <w:rPr>
@@ -11815,12 +11688,11 @@
           <w:fldChar w:fldCharType="begin"/>
           <w:instrText xml:space="preserve">PAGEREF _Toc53 \h</w:instrText>
           <w:fldChar w:fldCharType="separate"/>
-          <w:t xml:space="preserve">84</w:t>
+          <w:t xml:space="preserve">0</w:t>
           <w:fldChar w:fldCharType="end"/>
         </w:r>
       </w:hyperlink>
       <w:r/>
-      <w:r/>
     </w:p>
     <w:p>
       <w:pPr>
@@ -11833,7 +11705,6 @@
         <w:ind/>
         <w:rPr/>
       </w:pPr>
-      <w:r/>
       <w:hyperlink w:tooltip="#_Toc54" w:anchor="_Toc54" w:history="1">
         <w:r>
           <w:rPr>
@@ -11858,12 +11729,11 @@
           <w:fldChar w:fldCharType="begin"/>
           <w:instrText xml:space="preserve">PAGEREF _Toc54 \h</w:instrText>
           <w:fldChar w:fldCharType="separate"/>
-          <w:t xml:space="preserve">85</w:t>
+          <w:t xml:space="preserve">0</w:t>
           <w:fldChar w:fldCharType="end"/>
         </w:r>
       </w:hyperlink>
       <w:r/>
-      <w:r/>
     </w:p>
     <w:p>
       <w:pPr>
@@ -11876,7 +11746,6 @@
         <w:ind/>
         <w:rPr/>
       </w:pPr>
-      <w:r/>
       <w:hyperlink w:tooltip="#_Toc55" w:anchor="_Toc55" w:history="1">
         <w:r>
           <w:rPr>
@@ -11901,12 +11770,11 @@
           <w:fldChar w:fldCharType="begin"/>
           <w:instrText xml:space="preserve">PAGEREF _Toc55 \h</w:instrText>
           <w:fldChar w:fldCharType="separate"/>
-          <w:t xml:space="preserve">85</w:t>
+          <w:t xml:space="preserve">0</w:t>
           <w:fldChar w:fldCharType="end"/>
         </w:r>
       </w:hyperlink>
       <w:r/>
-      <w:r/>
     </w:p>
     <w:p>
       <w:pPr>
@@ -11919,7 +11787,6 @@
         <w:ind/>
         <w:rPr/>
       </w:pPr>
-      <w:r/>
       <w:hyperlink w:tooltip="#_Toc56" w:anchor="_Toc56" w:history="1">
         <w:r>
           <w:rPr>
@@ -11944,12 +11811,11 @@
           <w:fldChar w:fldCharType="begin"/>
           <w:instrText xml:space="preserve">PAGEREF _Toc56 \h</w:instrText>
           <w:fldChar w:fldCharType="separate"/>
-          <w:t xml:space="preserve">86</w:t>
+          <w:t xml:space="preserve">0</w:t>
           <w:fldChar w:fldCharType="end"/>
         </w:r>
       </w:hyperlink>
       <w:r/>
-      <w:r/>
     </w:p>
     <w:p>
       <w:pPr>
@@ -11962,7 +11828,6 @@
         <w:ind/>
         <w:rPr/>
       </w:pPr>
-      <w:r/>
       <w:hyperlink w:tooltip="#_Toc57" w:anchor="_Toc57" w:history="1">
         <w:r>
           <w:rPr>
@@ -11987,12 +11852,11 @@
           <w:fldChar w:fldCharType="begin"/>
           <w:instrText xml:space="preserve">PAGEREF _Toc57 \h</w:instrText>
           <w:fldChar w:fldCharType="separate"/>
-          <w:t xml:space="preserve">89</w:t>
+          <w:t xml:space="preserve">0</w:t>
           <w:fldChar w:fldCharType="end"/>
         </w:r>
       </w:hyperlink>
       <w:r/>
-      <w:r/>
     </w:p>
     <w:p>
       <w:pPr>
@@ -12005,7 +11869,6 @@
         <w:ind/>
         <w:rPr/>
       </w:pPr>
-      <w:r/>
       <w:hyperlink w:tooltip="#_Toc58" w:anchor="_Toc58" w:history="1">
         <w:r>
           <w:rPr>
@@ -12030,12 +11893,11 @@
           <w:fldChar w:fldCharType="begin"/>
           <w:instrText xml:space="preserve">PAGEREF _Toc58 \h</w:instrText>
           <w:fldChar w:fldCharType="separate"/>
-          <w:t xml:space="preserve">90</w:t>
+          <w:t xml:space="preserve">0</w:t>
           <w:fldChar w:fldCharType="end"/>
         </w:r>
       </w:hyperlink>
       <w:r/>
-      <w:r/>
     </w:p>
     <w:p>
       <w:pPr>
@@ -12048,7 +11910,6 @@
         <w:ind/>
         <w:rPr/>
       </w:pPr>
-      <w:r/>
       <w:hyperlink w:tooltip="#_Toc59" w:anchor="_Toc59" w:history="1">
         <w:r>
           <w:rPr>
@@ -12073,12 +11934,11 @@
           <w:fldChar w:fldCharType="begin"/>
           <w:instrText xml:space="preserve">PAGEREF _Toc59 \h</w:instrText>
           <w:fldChar w:fldCharType="separate"/>
-          <w:t xml:space="preserve">91</w:t>
+          <w:t xml:space="preserve">0</w:t>
           <w:fldChar w:fldCharType="end"/>
         </w:r>
       </w:hyperlink>
       <w:r/>
-      <w:r/>
     </w:p>
     <w:p>
       <w:pPr>
@@ -12091,7 +11951,6 @@
         <w:ind/>
         <w:rPr/>
       </w:pPr>
-      <w:r/>
       <w:hyperlink w:tooltip="#_Toc60" w:anchor="_Toc60" w:history="1">
         <w:r>
           <w:rPr>
@@ -12116,12 +11975,11 @@
           <w:fldChar w:fldCharType="begin"/>
           <w:instrText xml:space="preserve">PAGEREF _Toc60 \h</w:instrText>
           <w:fldChar w:fldCharType="separate"/>
-          <w:t xml:space="preserve">94</w:t>
+          <w:t xml:space="preserve">0</w:t>
           <w:fldChar w:fldCharType="end"/>
         </w:r>
       </w:hyperlink>
       <w:r/>
-      <w:r/>
     </w:p>
     <w:p>
       <w:pPr>
@@ -12134,7 +11992,6 @@
         <w:ind/>
         <w:rPr/>
       </w:pPr>
-      <w:r/>
       <w:hyperlink w:tooltip="#_Toc61" w:anchor="_Toc61" w:history="1">
         <w:r>
           <w:rPr>
@@ -12159,12 +12016,11 @@
           <w:fldChar w:fldCharType="begin"/>
           <w:instrText xml:space="preserve">PAGEREF _Toc61 \h</w:instrText>
           <w:fldChar w:fldCharType="separate"/>
-          <w:t xml:space="preserve">94</w:t>
+          <w:t xml:space="preserve">0</w:t>
           <w:fldChar w:fldCharType="end"/>
         </w:r>
       </w:hyperlink>
       <w:r/>
-      <w:r/>
     </w:p>
     <w:p>
       <w:pPr>
@@ -12177,7 +12033,6 @@
         <w:ind/>
         <w:rPr/>
       </w:pPr>
-      <w:r/>
       <w:hyperlink w:tooltip="#_Toc62" w:anchor="_Toc62" w:history="1">
         <w:r>
           <w:rPr>
@@ -12202,12 +12057,11 @@
           <w:fldChar w:fldCharType="begin"/>
           <w:instrText xml:space="preserve">PAGEREF _Toc62 \h</w:instrText>
           <w:fldChar w:fldCharType="separate"/>
-          <w:t xml:space="preserve">95</w:t>
+          <w:t xml:space="preserve">0</w:t>
           <w:fldChar w:fldCharType="end"/>
         </w:r>
       </w:hyperlink>
       <w:r/>
-      <w:r/>
     </w:p>
     <w:p>
       <w:pPr>
@@ -12220,7 +12074,6 @@
         <w:ind/>
         <w:rPr/>
       </w:pPr>
-      <w:r/>
       <w:hyperlink w:tooltip="#_Toc63" w:anchor="_Toc63" w:history="1">
         <w:r>
           <w:rPr>
@@ -12245,12 +12098,11 @@
           <w:fldChar w:fldCharType="begin"/>
           <w:instrText xml:space="preserve">PAGEREF _Toc63 \h</w:instrText>
           <w:fldChar w:fldCharType="separate"/>
-          <w:t xml:space="preserve">95</w:t>
+          <w:t xml:space="preserve">0</w:t>
           <w:fldChar w:fldCharType="end"/>
         </w:r>
       </w:hyperlink>
       <w:r/>
-      <w:r/>
     </w:p>
     <w:p>
       <w:pPr>
@@ -12263,7 +12115,6 @@
         <w:ind/>
         <w:rPr/>
       </w:pPr>
-      <w:r/>
       <w:hyperlink w:tooltip="#_Toc64" w:anchor="_Toc64" w:history="1">
         <w:r>
           <w:rPr>
@@ -12288,12 +12139,11 @@
           <w:fldChar w:fldCharType="begin"/>
           <w:instrText xml:space="preserve">PAGEREF _Toc64 \h</w:instrText>
           <w:fldChar w:fldCharType="separate"/>
-          <w:t xml:space="preserve">96</w:t>
+          <w:t xml:space="preserve">0</w:t>
           <w:fldChar w:fldCharType="end"/>
         </w:r>
       </w:hyperlink>
       <w:r/>
-      <w:r/>
     </w:p>
     <w:p>
       <w:pPr>
@@ -12306,7 +12156,6 @@
         <w:ind/>
         <w:rPr/>
       </w:pPr>
-      <w:r/>
       <w:hyperlink w:tooltip="#_Toc65" w:anchor="_Toc65" w:history="1">
         <w:r>
           <w:rPr>
@@ -12331,12 +12180,11 @@
           <w:fldChar w:fldCharType="begin"/>
           <w:instrText xml:space="preserve">PAGEREF _Toc65 \h</w:instrText>
           <w:fldChar w:fldCharType="separate"/>
-          <w:t xml:space="preserve">98</w:t>
+          <w:t xml:space="preserve">0</w:t>
           <w:fldChar w:fldCharType="end"/>
         </w:r>
       </w:hyperlink>
       <w:r/>
-      <w:r/>
     </w:p>
     <w:p>
       <w:pPr>
@@ -12349,7 +12197,6 @@
         <w:ind/>
         <w:rPr/>
       </w:pPr>
-      <w:r/>
       <w:hyperlink w:tooltip="#_Toc66" w:anchor="_Toc66" w:history="1">
         <w:r>
           <w:rPr>
@@ -12374,12 +12221,11 @@
           <w:fldChar w:fldCharType="begin"/>
           <w:instrText xml:space="preserve">PAGEREF _Toc66 \h</w:instrText>
           <w:fldChar w:fldCharType="separate"/>
-          <w:t xml:space="preserve">99</w:t>
+          <w:t xml:space="preserve">0</w:t>
           <w:fldChar w:fldCharType="end"/>
         </w:r>
       </w:hyperlink>
       <w:r/>
-      <w:r/>
     </w:p>
     <w:p>
       <w:pPr>
@@ -12392,7 +12238,6 @@
         <w:ind/>
         <w:rPr/>
       </w:pPr>
-      <w:r/>
       <w:hyperlink w:tooltip="#_Toc67" w:anchor="_Toc67" w:history="1">
         <w:r>
           <w:rPr>
@@ -12417,12 +12262,11 @@
           <w:fldChar w:fldCharType="begin"/>
           <w:instrText xml:space="preserve">PAGEREF _Toc67 \h</w:instrText>
           <w:fldChar w:fldCharType="separate"/>
-          <w:t xml:space="preserve">100</w:t>
+          <w:t xml:space="preserve">0</w:t>
           <w:fldChar w:fldCharType="end"/>
         </w:r>
       </w:hyperlink>
       <w:r/>
-      <w:r/>
     </w:p>
     <w:p>
       <w:pPr>
@@ -12435,7 +12279,6 @@
         <w:ind/>
         <w:rPr/>
       </w:pPr>
-      <w:r/>
       <w:hyperlink w:tooltip="#_Toc68" w:anchor="_Toc68" w:history="1">
         <w:r>
           <w:rPr>
@@ -12460,12 +12303,11 @@
           <w:fldChar w:fldCharType="begin"/>
           <w:instrText xml:space="preserve">PAGEREF _Toc68 \h</w:instrText>
           <w:fldChar w:fldCharType="separate"/>
-          <w:t xml:space="preserve">101</w:t>
+          <w:t xml:space="preserve">0</w:t>
           <w:fldChar w:fldCharType="end"/>
         </w:r>
       </w:hyperlink>
       <w:r/>
-      <w:r/>
     </w:p>
     <w:p>
       <w:pPr>
@@ -12478,7 +12320,6 @@
         <w:ind/>
         <w:rPr/>
       </w:pPr>
-      <w:r/>
       <w:hyperlink w:tooltip="#_Toc69" w:anchor="_Toc69" w:history="1">
         <w:r>
           <w:rPr>
@@ -12503,12 +12344,11 @@
           <w:fldChar w:fldCharType="begin"/>
           <w:instrText xml:space="preserve">PAGEREF _Toc69 \h</w:instrText>
           <w:fldChar w:fldCharType="separate"/>
-          <w:t xml:space="preserve">101</w:t>
+          <w:t xml:space="preserve">0</w:t>
           <w:fldChar w:fldCharType="end"/>
         </w:r>
       </w:hyperlink>
       <w:r/>
-      <w:r/>
     </w:p>
     <w:p>
       <w:pPr>
@@ -12521,7 +12361,6 @@
         <w:ind/>
         <w:rPr/>
       </w:pPr>
-      <w:r/>
       <w:hyperlink w:tooltip="#_Toc70" w:anchor="_Toc70" w:history="1">
         <w:r>
           <w:rPr>
@@ -12546,12 +12385,11 @@
           <w:fldChar w:fldCharType="begin"/>
           <w:instrText xml:space="preserve">PAGEREF _Toc70 \h</w:instrText>
           <w:fldChar w:fldCharType="separate"/>
-          <w:t xml:space="preserve">101</w:t>
+          <w:t xml:space="preserve">0</w:t>
           <w:fldChar w:fldCharType="end"/>
         </w:r>
       </w:hyperlink>
       <w:r/>
-      <w:r/>
     </w:p>
     <w:p>
       <w:pPr>
@@ -12564,7 +12402,6 @@
         <w:ind/>
         <w:rPr/>
       </w:pPr>
-      <w:r/>
       <w:hyperlink w:tooltip="#_Toc71" w:anchor="_Toc71" w:history="1">
         <w:r>
           <w:rPr>
@@ -12589,12 +12426,11 @@
           <w:fldChar w:fldCharType="begin"/>
           <w:instrText xml:space="preserve">PAGEREF _Toc71 \h</w:instrText>
           <w:fldChar w:fldCharType="separate"/>
-          <w:t xml:space="preserve">101</w:t>
+          <w:t xml:space="preserve">0</w:t>
           <w:fldChar w:fldCharType="end"/>
         </w:r>
       </w:hyperlink>
       <w:r/>
-      <w:r/>
     </w:p>
     <w:p>
       <w:pPr>
@@ -12607,7 +12443,6 @@
         <w:ind/>
         <w:rPr/>
       </w:pPr>
-      <w:r/>
       <w:hyperlink w:tooltip="#_Toc72" w:anchor="_Toc72" w:history="1">
         <w:r>
           <w:rPr>
@@ -12632,12 +12467,11 @@
           <w:fldChar w:fldCharType="begin"/>
           <w:instrText xml:space="preserve">PAGEREF _Toc72 \h</w:instrText>
           <w:fldChar w:fldCharType="separate"/>
-          <w:t xml:space="preserve">101</w:t>
+          <w:t xml:space="preserve">0</w:t>
           <w:fldChar w:fldCharType="end"/>
         </w:r>
       </w:hyperlink>
       <w:r/>
-      <w:r/>
     </w:p>
     <w:p>
       <w:pPr>
@@ -12650,7 +12484,6 @@
         <w:ind/>
         <w:rPr/>
       </w:pPr>
-      <w:r/>
       <w:hyperlink w:tooltip="#_Toc73" w:anchor="_Toc73" w:history="1">
         <w:r>
           <w:rPr>
@@ -12675,12 +12508,11 @@
           <w:fldChar w:fldCharType="begin"/>
           <w:instrText xml:space="preserve">PAGEREF _Toc73 \h</w:instrText>
           <w:fldChar w:fldCharType="separate"/>
-          <w:t xml:space="preserve">101</w:t>
+          <w:t xml:space="preserve">0</w:t>
           <w:fldChar w:fldCharType="end"/>
         </w:r>
       </w:hyperlink>
       <w:r/>
-      <w:r/>
     </w:p>
     <w:p>
       <w:pPr>
@@ -12693,7 +12525,6 @@
         <w:ind/>
         <w:rPr/>
       </w:pPr>
-      <w:r/>
       <w:hyperlink w:tooltip="#_Toc74" w:anchor="_Toc74" w:history="1">
         <w:r>
           <w:rPr>
@@ -12718,12 +12549,11 @@
           <w:fldChar w:fldCharType="begin"/>
           <w:instrText xml:space="preserve">PAGEREF _Toc74 \h</w:instrText>
           <w:fldChar w:fldCharType="separate"/>
-          <w:t xml:space="preserve">101</w:t>
+          <w:t xml:space="preserve">0</w:t>
           <w:fldChar w:fldCharType="end"/>
         </w:r>
       </w:hyperlink>
       <w:r/>
-      <w:r/>
     </w:p>
     <w:p>
       <w:pPr>
@@ -12736,7 +12566,6 @@
         <w:ind/>
         <w:rPr/>
       </w:pPr>
-      <w:r/>
       <w:hyperlink w:tooltip="#_Toc75" w:anchor="_Toc75" w:history="1">
         <w:r>
           <w:rPr>
@@ -12761,12 +12590,11 @@
           <w:fldChar w:fldCharType="begin"/>
           <w:instrText xml:space="preserve">PAGEREF _Toc75 \h</w:instrText>
           <w:fldChar w:fldCharType="separate"/>
-          <w:t xml:space="preserve">101</w:t>
+          <w:t xml:space="preserve">0</w:t>
           <w:fldChar w:fldCharType="end"/>
         </w:r>
       </w:hyperlink>
       <w:r/>
-      <w:r/>
     </w:p>
     <w:p>
       <w:pPr>
@@ -12779,7 +12607,6 @@
         <w:ind/>
         <w:rPr/>
       </w:pPr>
-      <w:r/>
       <w:hyperlink w:tooltip="#_Toc76" w:anchor="_Toc76" w:history="1">
         <w:r>
           <w:rPr>
@@ -12804,12 +12631,11 @@
           <w:fldChar w:fldCharType="begin"/>
           <w:instrText xml:space="preserve">PAGEREF _Toc76 \h</w:instrText>
           <w:fldChar w:fldCharType="separate"/>
-          <w:t xml:space="preserve">104</w:t>
+          <w:t xml:space="preserve">0</w:t>
           <w:fldChar w:fldCharType="end"/>
         </w:r>
       </w:hyperlink>
       <w:r/>
-      <w:r/>
     </w:p>
     <w:p>
       <w:pPr>
@@ -12822,7 +12648,6 @@
         <w:ind/>
         <w:rPr/>
       </w:pPr>
-      <w:r/>
       <w:hyperlink w:tooltip="#_Toc77" w:anchor="_Toc77" w:history="1">
         <w:r>
           <w:rPr>
@@ -12847,12 +12672,11 @@
           <w:fldChar w:fldCharType="begin"/>
           <w:instrText xml:space="preserve">PAGEREF _Toc77 \h</w:instrText>
           <w:fldChar w:fldCharType="separate"/>
-          <w:t xml:space="preserve">107</w:t>
+          <w:t xml:space="preserve">0</w:t>
           <w:fldChar w:fldCharType="end"/>
         </w:r>
       </w:hyperlink>
       <w:r/>
-      <w:r/>
     </w:p>
     <w:p>
       <w:pPr>
@@ -12865,7 +12689,6 @@
         <w:ind/>
         <w:rPr/>
       </w:pPr>
-      <w:r/>
       <w:hyperlink w:tooltip="#_Toc78" w:anchor="_Toc78" w:history="1">
         <w:r>
           <w:rPr>
@@ -12890,12 +12713,11 @@
           <w:fldChar w:fldCharType="begin"/>
           <w:instrText xml:space="preserve">PAGEREF _Toc78 \h</w:instrText>
           <w:fldChar w:fldCharType="separate"/>
-          <w:t xml:space="preserve">108</w:t>
+          <w:t xml:space="preserve">0</w:t>
           <w:fldChar w:fldCharType="end"/>
         </w:r>
       </w:hyperlink>
       <w:r/>
-      <w:r/>
     </w:p>
     <w:p>
       <w:pPr>
@@ -12908,7 +12730,6 @@
         <w:ind/>
         <w:rPr/>
       </w:pPr>
-      <w:r/>
       <w:hyperlink w:tooltip="#_Toc79" w:anchor="_Toc79" w:history="1">
         <w:r>
           <w:rPr>
@@ -12933,12 +12754,11 @@
           <w:fldChar w:fldCharType="begin"/>
           <w:instrText xml:space="preserve">PAGEREF _Toc79 \h</w:instrText>
           <w:fldChar w:fldCharType="separate"/>
-          <w:t xml:space="preserve">109</w:t>
+          <w:t xml:space="preserve">0</w:t>
           <w:fldChar w:fldCharType="end"/>
         </w:r>
       </w:hyperlink>
       <w:r/>
-      <w:r/>
     </w:p>
     <w:p>
       <w:pPr>
@@ -12951,7 +12771,6 @@
         <w:ind/>
         <w:rPr/>
       </w:pPr>
-      <w:r/>
       <w:hyperlink w:tooltip="#_Toc80" w:anchor="_Toc80" w:history="1">
         <w:r>
           <w:rPr>
@@ -12976,12 +12795,11 @@
           <w:fldChar w:fldCharType="begin"/>
           <w:instrText xml:space="preserve">PAGEREF _Toc80 \h</w:instrText>
           <w:fldChar w:fldCharType="separate"/>
-          <w:t xml:space="preserve">110</w:t>
+          <w:t xml:space="preserve">0</w:t>
           <w:fldChar w:fldCharType="end"/>
         </w:r>
       </w:hyperlink>
       <w:r/>
-      <w:r/>
     </w:p>
     <w:p>
       <w:pPr>
@@ -12994,7 +12812,6 @@
         <w:ind/>
         <w:rPr/>
       </w:pPr>
-      <w:r/>
       <w:hyperlink w:tooltip="#_Toc81" w:anchor="_Toc81" w:history="1">
         <w:r>
           <w:rPr>
@@ -13019,12 +12836,11 @@
           <w:fldChar w:fldCharType="begin"/>
           <w:instrText xml:space="preserve">PAGEREF _Toc81 \h</w:instrText>
           <w:fldChar w:fldCharType="separate"/>
-          <w:t xml:space="preserve">111</w:t>
+          <w:t xml:space="preserve">0</w:t>
           <w:fldChar w:fldCharType="end"/>
         </w:r>
       </w:hyperlink>
       <w:r/>
-      <w:r/>
     </w:p>
     <w:p>
       <w:pPr>
@@ -13037,7 +12853,6 @@
         <w:ind/>
         <w:rPr/>
       </w:pPr>
-      <w:r/>
       <w:hyperlink w:tooltip="#_Toc82" w:anchor="_Toc82" w:history="1">
         <w:r>
           <w:rPr>
@@ -13062,12 +12877,11 @@
           <w:fldChar w:fldCharType="begin"/>
           <w:instrText xml:space="preserve">PAGEREF _Toc82 \h</w:instrText>
           <w:fldChar w:fldCharType="separate"/>
-          <w:t xml:space="preserve">112</w:t>
+          <w:t xml:space="preserve">0</w:t>
           <w:fldChar w:fldCharType="end"/>
         </w:r>
       </w:hyperlink>
       <w:r/>
-      <w:r/>
     </w:p>
     <w:p>
       <w:pPr>
@@ -13080,7 +12894,6 @@
         <w:ind/>
         <w:rPr/>
       </w:pPr>
-      <w:r/>
       <w:hyperlink w:tooltip="#_Toc83" w:anchor="_Toc83" w:history="1">
         <w:r>
           <w:rPr>
@@ -13105,12 +12918,11 @@
           <w:fldChar w:fldCharType="begin"/>
           <w:instrText xml:space="preserve">PAGEREF _Toc83 \h</w:instrText>
           <w:fldChar w:fldCharType="separate"/>
-          <w:t xml:space="preserve">113</w:t>
+          <w:t xml:space="preserve">0</w:t>
           <w:fldChar w:fldCharType="end"/>
         </w:r>
       </w:hyperlink>
       <w:r/>
-      <w:r/>
     </w:p>
     <w:p>
       <w:pPr>
@@ -13123,7 +12935,6 @@
         <w:ind/>
         <w:rPr/>
       </w:pPr>
-      <w:r/>
       <w:hyperlink w:tooltip="#_Toc84" w:anchor="_Toc84" w:history="1">
         <w:r>
           <w:rPr>
@@ -13148,12 +12959,11 @@
           <w:fldChar w:fldCharType="begin"/>
           <w:instrText xml:space="preserve">PAGEREF _Toc84 \h</w:instrText>
           <w:fldChar w:fldCharType="separate"/>
-          <w:t xml:space="preserve">114</w:t>
+          <w:t xml:space="preserve">0</w:t>
           <w:fldChar w:fldCharType="end"/>
         </w:r>
       </w:hyperlink>
       <w:r/>
-      <w:r/>
     </w:p>
     <w:p>
       <w:pPr>
@@ -13166,7 +12976,6 @@
         <w:ind/>
         <w:rPr/>
       </w:pPr>
-      <w:r/>
       <w:hyperlink w:tooltip="#_Toc85" w:anchor="_Toc85" w:history="1">
         <w:r>
           <w:rPr>
@@ -13191,12 +13000,11 @@
           <w:fldChar w:fldCharType="begin"/>
           <w:instrText xml:space="preserve">PAGEREF _Toc85 \h</w:instrText>
           <w:fldChar w:fldCharType="separate"/>
-          <w:t xml:space="preserve">115</w:t>
+          <w:t xml:space="preserve">0</w:t>
           <w:fldChar w:fldCharType="end"/>
         </w:r>
       </w:hyperlink>
       <w:r/>
-      <w:r/>
     </w:p>
     <w:p>
       <w:pPr>
@@ -13209,7 +13017,6 @@
         <w:ind/>
         <w:rPr/>
       </w:pPr>
-      <w:r/>
       <w:hyperlink w:tooltip="#_Toc86" w:anchor="_Toc86" w:history="1">
         <w:r>
           <w:rPr>
@@ -13234,12 +13041,11 @@
           <w:fldChar w:fldCharType="begin"/>
           <w:instrText xml:space="preserve">PAGEREF _Toc86 \h</w:instrText>
           <w:fldChar w:fldCharType="separate"/>
-          <w:t xml:space="preserve">116</w:t>
+          <w:t xml:space="preserve">0</w:t>
           <w:fldChar w:fldCharType="end"/>
         </w:r>
       </w:hyperlink>
       <w:r/>
-      <w:r/>
     </w:p>
     <w:p>
       <w:pPr>
@@ -13252,7 +13058,6 @@
         <w:ind/>
         <w:rPr/>
       </w:pPr>
-      <w:r/>
       <w:hyperlink w:tooltip="#_Toc87" w:anchor="_Toc87" w:history="1">
         <w:r>
           <w:rPr>
@@ -13277,12 +13082,11 @@
           <w:fldChar w:fldCharType="begin"/>
           <w:instrText xml:space="preserve">PAGEREF _Toc87 \h</w:instrText>
           <w:fldChar w:fldCharType="separate"/>
-          <w:t xml:space="preserve">117</w:t>
+          <w:t xml:space="preserve">0</w:t>
           <w:fldChar w:fldCharType="end"/>
         </w:r>
       </w:hyperlink>
       <w:r/>
-      <w:r/>
     </w:p>
     <w:p>
       <w:pPr>
@@ -13295,7 +13099,6 @@
         <w:ind/>
         <w:rPr/>
       </w:pPr>
-      <w:r/>
       <w:hyperlink w:tooltip="#_Toc88" w:anchor="_Toc88" w:history="1">
         <w:r>
           <w:rPr>
@@ -13320,12 +13123,11 @@
           <w:fldChar w:fldCharType="begin"/>
           <w:instrText xml:space="preserve">PAGEREF _Toc88 \h</w:instrText>
           <w:fldChar w:fldCharType="separate"/>
-          <w:t xml:space="preserve">118</w:t>
+          <w:t xml:space="preserve">0</w:t>
           <w:fldChar w:fldCharType="end"/>
         </w:r>
       </w:hyperlink>
       <w:r/>
-      <w:r/>
     </w:p>
     <w:p>
       <w:pPr>
@@ -13338,7 +13140,6 @@
         <w:ind/>
         <w:rPr/>
       </w:pPr>
-      <w:r/>
       <w:hyperlink w:tooltip="#_Toc89" w:anchor="_Toc89" w:history="1">
         <w:r>
           <w:rPr>
@@ -13363,11 +13164,10 @@
           <w:fldChar w:fldCharType="begin"/>
           <w:instrText xml:space="preserve">PAGEREF _Toc89 \h</w:instrText>
           <w:fldChar w:fldCharType="separate"/>
-          <w:t xml:space="preserve">119</w:t>
+          <w:t xml:space="preserve">0</w:t>
           <w:fldChar w:fldCharType="end"/>
         </w:r>
       </w:hyperlink>
-      <w:r/>
       <w:r/>
     </w:p>
     <w:p>
@@ -13399,6 +13199,7 @@
         <w:fldChar w:fldCharType="end"/>
       </w:r>
       <w:r/>
+      <w:r/>
     </w:p>
     <w:p>
       <w:pPr>
@@ -13410,11 +13211,10 @@
         <w:rPr/>
       </w:pPr>
       <w:r/>
-      <w:bookmarkStart w:id="1" w:name="_Toc1"/>
       <w:r>
         <w:t xml:space="preserve">1 INTRODUÇÃO</w:t>
       </w:r>
-      <w:bookmarkEnd w:id="1"/>
+      <w:r/>
       <w:r/>
       <w:r/>
     </w:p>
@@ -13619,11 +13419,10 @@
         <w:rPr/>
       </w:pPr>
       <w:r/>
-      <w:bookmarkStart w:id="2" w:name="_Toc2"/>
       <w:r>
         <w:t xml:space="preserve">2 REVISÃO BIBLIOGRÁFICA</w:t>
       </w:r>
-      <w:bookmarkEnd w:id="2"/>
+      <w:r/>
       <w:r/>
       <w:r/>
     </w:p>
@@ -13672,11 +13471,10 @@
         <w:rPr/>
       </w:pPr>
       <w:r/>
-      <w:bookmarkStart w:id="3" w:name="_Toc3"/>
       <w:r>
         <w:t xml:space="preserve">2.1 CIDADES INTELIGENTES E RESILIENTES </w:t>
       </w:r>
-      <w:bookmarkEnd w:id="3"/>
+      <w:r/>
       <w:r/>
       <w:r/>
     </w:p>
@@ -13795,11 +13593,10 @@
         <w:rPr/>
       </w:pPr>
       <w:r/>
-      <w:bookmarkStart w:id="4" w:name="_Toc4"/>
       <w:r>
         <w:t xml:space="preserve">2.1.1 Fundamentos de Cidade Resiliente</w:t>
       </w:r>
-      <w:bookmarkEnd w:id="4"/>
+      <w:r/>
       <w:r/>
       <w:r/>
     </w:p>
@@ -13889,11 +13686,10 @@
         <w:rPr/>
       </w:pPr>
       <w:r/>
-      <w:bookmarkStart w:id="5" w:name="_Toc5"/>
       <w:r>
         <w:t xml:space="preserve">2.1.2 Zeladoria Pública e Gestão de Serviços</w:t>
       </w:r>
-      <w:bookmarkEnd w:id="5"/>
+      <w:r/>
       <w:r/>
       <w:r/>
     </w:p>
@@ -13950,11 +13746,10 @@
         <w:rPr/>
       </w:pPr>
       <w:r/>
-      <w:bookmarkStart w:id="6" w:name="_Toc6"/>
       <w:r>
         <w:t xml:space="preserve">2.1.3 Participação Cidadã por meio de Sistemas de Informação Automatizados</w:t>
       </w:r>
-      <w:bookmarkEnd w:id="6"/>
+      <w:r/>
       <w:r/>
       <w:r/>
     </w:p>
@@ -14142,14 +13937,13 @@
         <w:rPr/>
       </w:pPr>
       <w:r/>
-      <w:bookmarkStart w:id="7" w:name="_Toc7"/>
       <w:r>
         <w:rPr>
           <w:caps w:val="0"/>
         </w:rPr>
         <w:t xml:space="preserve">2.2 TRABALHOS RELACIONADOS</w:t>
       </w:r>
-      <w:bookmarkEnd w:id="7"/>
+      <w:r/>
       <w:r/>
       <w:r/>
     </w:p>
@@ -14333,6 +14127,7 @@
         <w:ind/>
         <w:rPr/>
       </w:pPr>
+      <w:r/>
       <w:r>
         <w:t xml:space="preserve">FIGURA </w:t>
       </w:r>
@@ -14357,6 +14152,8 @@
       <w:r>
         <w:t xml:space="preserve">Colab</w:t>
       </w:r>
+      <w:r/>
+      <w:r/>
       <w:r/>
     </w:p>
     <w:p>
@@ -14491,6 +14288,7 @@
         <w:ind/>
         <w:rPr/>
       </w:pPr>
+      <w:r/>
       <w:r>
         <w:t xml:space="preserve">FIGURA </w:t>
       </w:r>
@@ -14524,6 +14322,8 @@
       <w:r>
         <w:t xml:space="preserve">Colab</w:t>
       </w:r>
+      <w:r/>
+      <w:r/>
       <w:r/>
     </w:p>
     <w:p>
@@ -14744,6 +14544,7 @@
         <w:ind/>
         <w:rPr/>
       </w:pPr>
+      <w:r/>
       <w:r>
         <w:t xml:space="preserve">FIGURA </w:t>
       </w:r>
@@ -14765,6 +14566,8 @@
       <w:r>
         <w:t xml:space="preserve"> - Seleção da unidade da federação na plataforma e-Ouve </w:t>
       </w:r>
+      <w:r/>
+      <w:r/>
       <w:r/>
     </w:p>
     <w:p>
@@ -14897,6 +14700,7 @@
         <w:ind/>
         <w:rPr/>
       </w:pPr>
+      <w:r/>
       <w:r>
         <w:t xml:space="preserve">FIGURA </w:t>
       </w:r>
@@ -14918,6 +14722,8 @@
       <w:r>
         <w:t xml:space="preserve"> - Seleção de serviços na plataforma e-Ouve</w:t>
       </w:r>
+      <w:r/>
+      <w:r/>
       <w:r/>
     </w:p>
     <w:p>
@@ -15030,11 +14836,10 @@
         <w:rPr/>
       </w:pPr>
       <w:r/>
-      <w:bookmarkStart w:id="8" w:name="_Toc8"/>
       <w:r>
         <w:t xml:space="preserve">3 OBJETIVO DO PROJETO</w:t>
       </w:r>
-      <w:bookmarkEnd w:id="8"/>
+      <w:r/>
       <w:r/>
       <w:r/>
     </w:p>
@@ -15069,11 +14874,10 @@
         <w:rPr/>
       </w:pPr>
       <w:r/>
-      <w:bookmarkStart w:id="9" w:name="_Toc9"/>
       <w:r>
         <w:t xml:space="preserve">3.1 FORMULAÇÃO DO PROBLEMA</w:t>
       </w:r>
-      <w:bookmarkEnd w:id="9"/>
+      <w:r/>
       <w:r/>
       <w:r/>
     </w:p>
@@ -15160,11 +14964,10 @@
         <w:rPr/>
       </w:pPr>
       <w:r/>
-      <w:bookmarkStart w:id="10" w:name="_Toc10"/>
       <w:r>
         <w:t xml:space="preserve">3.2 OBJETIVOS </w:t>
       </w:r>
-      <w:bookmarkEnd w:id="10"/>
+      <w:r/>
       <w:r/>
       <w:r/>
     </w:p>
@@ -15300,11 +15103,10 @@
         <w:rPr/>
       </w:pPr>
       <w:r/>
-      <w:bookmarkStart w:id="11" w:name="_Toc11"/>
       <w:r>
         <w:t xml:space="preserve">3.3 JUSTIFICATIVA </w:t>
       </w:r>
-      <w:bookmarkEnd w:id="11"/>
+      <w:r/>
       <w:r/>
       <w:r/>
     </w:p>
@@ -15367,11 +15169,10 @@
         <w:rPr/>
       </w:pPr>
       <w:r/>
-      <w:bookmarkStart w:id="12" w:name="_Toc12"/>
       <w:r>
         <w:t xml:space="preserve">3.4 NÍVEIS DE DECISÃO E GRUPOS FUNCIONAIS ATENDIDOS</w:t>
       </w:r>
-      <w:bookmarkEnd w:id="12"/>
+      <w:r/>
       <w:r/>
       <w:r/>
     </w:p>
@@ -15441,11 +15242,10 @@
         <w:rPr/>
       </w:pPr>
       <w:r/>
-      <w:bookmarkStart w:id="13" w:name="_Toc13"/>
       <w:r>
         <w:t xml:space="preserve">3.5 ADERÊNCIA AOS OBJETIVOS DO DESENVOLVIMENTO SUSTENTÁVEL (ODS)</w:t>
       </w:r>
-      <w:bookmarkEnd w:id="13"/>
+      <w:r/>
       <w:r/>
       <w:r/>
     </w:p>
@@ -15630,11 +15430,10 @@
         <w:rPr/>
       </w:pPr>
       <w:r/>
-      <w:bookmarkStart w:id="14" w:name="_Toc14"/>
       <w:r>
         <w:t xml:space="preserve">3.6 MODELO DE NEGÓCIO PROPOSTO</w:t>
       </w:r>
-      <w:bookmarkEnd w:id="14"/>
+      <w:r/>
       <w:r/>
       <w:r/>
     </w:p>
@@ -15844,11 +15643,10 @@
         <w:rPr/>
       </w:pPr>
       <w:r/>
-      <w:bookmarkStart w:id="15" w:name="_Toc15"/>
       <w:r>
         <w:t xml:space="preserve">4 MÉTODOS GERENCIAIS</w:t>
       </w:r>
-      <w:bookmarkEnd w:id="15"/>
+      <w:r/>
       <w:r/>
       <w:r/>
     </w:p>
@@ -15883,11 +15681,10 @@
         <w:rPr/>
       </w:pPr>
       <w:r/>
-      <w:bookmarkStart w:id="16" w:name="_Toc16"/>
       <w:r>
         <w:t xml:space="preserve">4.1 GERENCIAMENTO DO PROJETO</w:t>
       </w:r>
-      <w:bookmarkEnd w:id="16"/>
+      <w:r/>
       <w:r/>
       <w:r/>
     </w:p>
@@ -16396,11 +16193,10 @@
         <w:rPr/>
       </w:pPr>
       <w:r/>
-      <w:bookmarkStart w:id="17" w:name="_Toc17"/>
       <w:r>
         <w:t xml:space="preserve">4.2 MODELO DE CICLO DE VIDA </w:t>
       </w:r>
-      <w:bookmarkEnd w:id="17"/>
+      <w:r/>
       <w:r/>
       <w:r/>
     </w:p>
@@ -16510,11 +16306,10 @@
         <w:rPr/>
       </w:pPr>
       <w:r/>
-      <w:bookmarkStart w:id="18" w:name="_Toc18"/>
       <w:r>
         <w:t xml:space="preserve">4.3 RECURSOS NECESSÁRIOS</w:t>
       </w:r>
-      <w:bookmarkEnd w:id="18"/>
+      <w:r/>
       <w:r/>
       <w:r/>
     </w:p>
@@ -16544,11 +16339,10 @@
         <w:rPr/>
       </w:pPr>
       <w:r/>
-      <w:bookmarkStart w:id="19" w:name="_Toc19"/>
       <w:r>
         <w:t xml:space="preserve">4.3.1 Recursos Humanos</w:t>
       </w:r>
-      <w:bookmarkEnd w:id="19"/>
+      <w:r/>
       <w:r/>
       <w:r/>
     </w:p>
@@ -16842,11 +16636,10 @@
         <w:rPr/>
       </w:pPr>
       <w:r/>
-      <w:bookmarkStart w:id="20" w:name="_Toc20"/>
       <w:r>
         <w:t xml:space="preserve">4.3.2 Recursos de Hardware</w:t>
       </w:r>
-      <w:bookmarkEnd w:id="20"/>
+      <w:r/>
       <w:r/>
       <w:r/>
     </w:p>
@@ -16953,11 +16746,10 @@
         <w:rPr/>
       </w:pPr>
       <w:r/>
-      <w:bookmarkStart w:id="21" w:name="_Toc21"/>
       <w:r>
         <w:t xml:space="preserve">4.3.3 Recursos de Software</w:t>
       </w:r>
-      <w:bookmarkEnd w:id="21"/>
+      <w:r/>
       <w:r/>
       <w:r/>
     </w:p>
@@ -17272,11 +17064,10 @@
         <w:rPr/>
       </w:pPr>
       <w:r/>
-      <w:bookmarkStart w:id="22" w:name="_Toc22"/>
       <w:r>
         <w:t xml:space="preserve">4.3.4 Outros Recursos</w:t>
       </w:r>
-      <w:bookmarkEnd w:id="22"/>
+      <w:r/>
       <w:r/>
       <w:r/>
     </w:p>
@@ -17345,11 +17136,10 @@
         <w:rPr/>
       </w:pPr>
       <w:r/>
-      <w:bookmarkStart w:id="23" w:name="_Toc23"/>
       <w:r>
         <w:t xml:space="preserve">4.4 RELATÓRIO DE DESEMPENHO </w:t>
       </w:r>
-      <w:bookmarkEnd w:id="23"/>
+      <w:r/>
       <w:r/>
       <w:r/>
     </w:p>
@@ -17681,11 +17471,10 @@
         <w:rPr/>
       </w:pPr>
       <w:r/>
-      <w:bookmarkStart w:id="24" w:name="_Toc24"/>
       <w:r>
         <w:t xml:space="preserve">4.5 GERENCIAMENTO DE CONFIGURAÇÃO</w:t>
       </w:r>
-      <w:bookmarkEnd w:id="24"/>
+      <w:r/>
       <w:r/>
       <w:r/>
     </w:p>
@@ -17721,14 +17510,13 @@
         <w:rPr/>
       </w:pPr>
       <w:r/>
-      <w:bookmarkStart w:id="25" w:name="_Toc25"/>
       <w:r>
         <w:t xml:space="preserve">4.5.1 Papéis e Responsabilidades</w:t>
       </w:r>
       <w:r>
         <w:tab/>
       </w:r>
-      <w:bookmarkEnd w:id="25"/>
+      <w:r/>
       <w:r/>
       <w:r/>
     </w:p>
@@ -17895,11 +17683,10 @@
         <w:rPr/>
       </w:pPr>
       <w:r/>
-      <w:bookmarkStart w:id="26" w:name="_Toc26"/>
       <w:r>
         <w:t xml:space="preserve">4.5.2 Identificação e Versionamento de Artefatos</w:t>
       </w:r>
-      <w:bookmarkEnd w:id="26"/>
+      <w:r/>
       <w:r/>
       <w:r/>
     </w:p>
@@ -17979,11 +17766,10 @@
         <w:rPr/>
       </w:pPr>
       <w:r/>
-      <w:bookmarkStart w:id="27" w:name="_Toc27"/>
       <w:r>
         <w:t xml:space="preserve">4.5.3 Organização do Repositório e Ferramentas</w:t>
       </w:r>
-      <w:bookmarkEnd w:id="27"/>
+      <w:r/>
       <w:r/>
       <w:r/>
     </w:p>
@@ -18238,6 +18024,7 @@
         <w:ind/>
         <w:rPr/>
       </w:pPr>
+      <w:r/>
       <w:r>
         <w:t xml:space="preserve">FIGURA </w:t>
       </w:r>
@@ -18260,6 +18047,8 @@
         <w:t xml:space="preserve"> - Estrutura do repositório remoto no GitHub</w:t>
       </w:r>
       <w:r/>
+      <w:r/>
+      <w:r/>
     </w:p>
     <w:p>
       <w:pPr>
@@ -18283,11 +18072,10 @@
         <w:rPr/>
       </w:pPr>
       <w:r/>
-      <w:bookmarkStart w:id="28" w:name="_Toc28"/>
       <w:r>
         <w:t xml:space="preserve">5 ESPECIFICAÇÃO E ANÁLISE DOS REQUISITOS</w:t>
       </w:r>
-      <w:bookmarkEnd w:id="28"/>
+      <w:r/>
       <w:r/>
       <w:r/>
     </w:p>
@@ -18325,11 +18113,10 @@
         <w:rPr/>
       </w:pPr>
       <w:r/>
-      <w:bookmarkStart w:id="29" w:name="_Toc29"/>
       <w:r>
         <w:t xml:space="preserve">5.1 REQUISITOS DO SISTEMA DE SOFTWARE</w:t>
       </w:r>
-      <w:bookmarkEnd w:id="29"/>
+      <w:r/>
       <w:r/>
       <w:r/>
     </w:p>
@@ -18367,11 +18154,10 @@
         <w:rPr/>
       </w:pPr>
       <w:r/>
-      <w:bookmarkStart w:id="30" w:name="_Toc30"/>
       <w:r>
         <w:t xml:space="preserve">5.1.1 Requisitos Funcionais</w:t>
       </w:r>
-      <w:bookmarkEnd w:id="30"/>
+      <w:r/>
       <w:r/>
       <w:r/>
     </w:p>
@@ -20094,14 +19880,13 @@
         <w:rPr/>
       </w:pPr>
       <w:r/>
-      <w:bookmarkStart w:id="31" w:name="_Toc31"/>
       <w:r>
         <w:t xml:space="preserve">5.1.2 Requisitos </w:t>
       </w:r>
       <w:r>
         <w:t xml:space="preserve">não Funcionais</w:t>
       </w:r>
-      <w:bookmarkEnd w:id="31"/>
+      <w:r/>
       <w:r/>
       <w:r/>
     </w:p>
@@ -21464,11 +21249,10 @@
         <w:rPr/>
       </w:pPr>
       <w:r/>
-      <w:bookmarkStart w:id="32" w:name="_Toc32"/>
       <w:r>
         <w:t xml:space="preserve">5.1.3 Principais Regras de Negócio</w:t>
       </w:r>
-      <w:bookmarkEnd w:id="32"/>
+      <w:r/>
       <w:r/>
       <w:r/>
     </w:p>
@@ -22050,11 +21834,10 @@
         <w:rPr/>
       </w:pPr>
       <w:r/>
-      <w:bookmarkStart w:id="33" w:name="_Toc33"/>
       <w:r>
         <w:t xml:space="preserve">5.2 ANÁLISE DOS REQUISITOS</w:t>
       </w:r>
-      <w:bookmarkEnd w:id="33"/>
+      <w:r/>
       <w:r/>
       <w:r/>
     </w:p>
@@ -22069,16 +21852,11 @@
         </w:rPr>
       </w:pPr>
       <w:r/>
-      <w:bookmarkStart w:id="34" w:name="_Toc34"/>
       <w:r>
         <w:t xml:space="preserve">5.2.1 Visão Funcional</w:t>
       </w:r>
-      <w:bookmarkEnd w:id="34"/>
-      <w:r>
-        <w:rPr>
-          <w:color w:val="00b050"/>
-        </w:rPr>
-      </w:r>
+      <w:r/>
+      <w:r/>
       <w:r>
         <w:rPr>
           <w:color w:val="00b050"/>
@@ -22143,11 +21921,10 @@
         <w:rPr/>
       </w:pPr>
       <w:r/>
-      <w:bookmarkStart w:id="35" w:name="_Toc35"/>
       <w:r>
         <w:t xml:space="preserve">5.2.2 Modelo Conceitual dos Dados</w:t>
       </w:r>
-      <w:bookmarkEnd w:id="35"/>
+      <w:r/>
       <w:r/>
       <w:r/>
     </w:p>
@@ -22514,11 +22291,10 @@
         <w:rPr/>
       </w:pPr>
       <w:r/>
-      <w:bookmarkStart w:id="36" w:name="_Toc36"/>
       <w:r>
         <w:t xml:space="preserve">5.2.3 Modelo Inicial da Interface de Usuário</w:t>
       </w:r>
-      <w:bookmarkEnd w:id="36"/>
+      <w:r/>
       <w:r/>
       <w:r/>
     </w:p>
@@ -22705,11 +22481,10 @@
         <w:rPr/>
       </w:pPr>
       <w:r/>
-      <w:bookmarkStart w:id="37" w:name="_Toc37"/>
       <w:r>
         <w:t xml:space="preserve">6 ARQUITETURA E PROJETO DO SISTEMA DE SOFTWARE</w:t>
       </w:r>
-      <w:bookmarkEnd w:id="37"/>
+      <w:r/>
       <w:r/>
       <w:r/>
     </w:p>
@@ -22772,11 +22547,10 @@
         <w:rPr/>
       </w:pPr>
       <w:r/>
-      <w:bookmarkStart w:id="38" w:name="_Toc38"/>
       <w:r>
         <w:t xml:space="preserve">6.1 VISÃO ESTRUTURAL</w:t>
       </w:r>
-      <w:bookmarkEnd w:id="38"/>
+      <w:r/>
       <w:r/>
       <w:r/>
     </w:p>
@@ -22836,11 +22610,10 @@
         <w:rPr/>
       </w:pPr>
       <w:r/>
-      <w:bookmarkStart w:id="39" w:name="_Toc39"/>
       <w:r>
         <w:t xml:space="preserve">6.1.1 Diagrama de Pacotes</w:t>
       </w:r>
-      <w:bookmarkEnd w:id="39"/>
+      <w:r/>
       <w:r/>
       <w:r/>
     </w:p>
@@ -23101,11 +22874,10 @@
         <w:rPr/>
       </w:pPr>
       <w:r/>
-      <w:bookmarkStart w:id="40" w:name="_Toc40"/>
       <w:r>
         <w:t xml:space="preserve">6.1.2 Diagramas de Classes</w:t>
       </w:r>
-      <w:bookmarkEnd w:id="40"/>
+      <w:r/>
       <w:r/>
       <w:r/>
     </w:p>
@@ -23198,11 +22970,10 @@
         <w:rPr/>
       </w:pPr>
       <w:r/>
-      <w:bookmarkStart w:id="41" w:name="_Toc41"/>
       <w:r>
         <w:t xml:space="preserve">6.2 VISÃO COMPORTAMENTAL</w:t>
       </w:r>
-      <w:bookmarkEnd w:id="41"/>
+      <w:r/>
       <w:r/>
       <w:r/>
     </w:p>
@@ -23245,11 +23016,10 @@
         <w:rPr/>
       </w:pPr>
       <w:r/>
-      <w:bookmarkStart w:id="42" w:name="_Toc42"/>
       <w:r>
         <w:t xml:space="preserve">6.2.1 Projeto das Interações entre Objetos</w:t>
       </w:r>
-      <w:bookmarkEnd w:id="42"/>
+      <w:r/>
       <w:r/>
       <w:r/>
     </w:p>
@@ -23347,11 +23117,10 @@
         <w:rPr/>
       </w:pPr>
       <w:r/>
-      <w:bookmarkStart w:id="43" w:name="_Toc43"/>
       <w:r>
         <w:t xml:space="preserve">6.3 VISÃO DOS DADOS</w:t>
       </w:r>
-      <w:bookmarkEnd w:id="43"/>
+      <w:r/>
       <w:r/>
       <w:r/>
     </w:p>
@@ -23429,11 +23198,10 @@
         <w:rPr/>
       </w:pPr>
       <w:r/>
-      <w:bookmarkStart w:id="44" w:name="_Toc44"/>
       <w:r>
         <w:t xml:space="preserve">6.3.1 Modelo Lógico</w:t>
       </w:r>
-      <w:bookmarkEnd w:id="44"/>
+      <w:r/>
       <w:r/>
       <w:r/>
     </w:p>
@@ -23670,11 +23438,10 @@
         <w:rPr/>
       </w:pPr>
       <w:r/>
-      <w:bookmarkStart w:id="45" w:name="_Toc45"/>
       <w:r>
         <w:t xml:space="preserve">6.3.2 Dicionário de Dados do Modelo Lógico</w:t>
       </w:r>
-      <w:bookmarkEnd w:id="45"/>
+      <w:r/>
       <w:r/>
       <w:r/>
     </w:p>
@@ -23784,11 +23551,10 @@
         <w:rPr/>
       </w:pPr>
       <w:r/>
-      <w:bookmarkStart w:id="46" w:name="_Toc46"/>
       <w:r>
         <w:t xml:space="preserve">6.4 PROJETO DA INTERAÇÃO HUMANO-COMPUTADOR</w:t>
       </w:r>
-      <w:bookmarkEnd w:id="46"/>
+      <w:r/>
       <w:r/>
       <w:r/>
     </w:p>
@@ -23871,11 +23637,10 @@
         <w:rPr/>
       </w:pPr>
       <w:r/>
-      <w:bookmarkStart w:id="47" w:name="_Toc47"/>
       <w:r>
         <w:t xml:space="preserve">6.4.1 Perfil de Usuário</w:t>
       </w:r>
-      <w:bookmarkEnd w:id="47"/>
+      <w:r/>
       <w:r/>
       <w:r/>
     </w:p>
@@ -24118,6 +23883,7 @@
         <w:ind/>
         <w:rPr/>
       </w:pPr>
+      <w:r/>
       <w:r>
         <w:t xml:space="preserve">FIGURA </w:t>
       </w:r>
@@ -24145,6 +23911,8 @@
       <w:r>
         <w:t xml:space="preserve"> de usuário do respondente</w:t>
       </w:r>
+      <w:r/>
+      <w:r/>
       <w:r/>
     </w:p>
     <w:p>
@@ -24309,6 +24077,7 @@
         <w:ind/>
         <w:rPr/>
       </w:pPr>
+      <w:r/>
       <w:r>
         <w:t xml:space="preserve">FIGURA </w:t>
       </w:r>
@@ -24336,6 +24105,8 @@
       <w:r>
         <w:t xml:space="preserve"> com aplicativos para registro de problemas da cidade</w:t>
       </w:r>
+      <w:r/>
+      <w:r/>
       <w:r/>
     </w:p>
     <w:p>
@@ -24477,6 +24248,7 @@
         <w:ind/>
         <w:rPr/>
       </w:pPr>
+      <w:r/>
       <w:r>
         <w:t xml:space="preserve">FIGURA </w:t>
       </w:r>
@@ -24499,6 +24271,8 @@
         <w:t xml:space="preserve"> – Possibilidade de uso de um aplicativo para registrar ocorrências da cidade.</w:t>
       </w:r>
       <w:r/>
+      <w:r/>
+      <w:r/>
     </w:p>
     <w:p>
       <w:pPr>
@@ -24552,11 +24326,10 @@
         <w:rPr/>
       </w:pPr>
       <w:r/>
-      <w:bookmarkStart w:id="48" w:name="_Toc48"/>
       <w:r>
         <w:t xml:space="preserve">6.4.2 Projeto da Interface de Usuário</w:t>
       </w:r>
-      <w:bookmarkEnd w:id="48"/>
+      <w:r/>
       <w:r/>
       <w:r/>
     </w:p>
@@ -24693,11 +24466,10 @@
         <w:rPr/>
       </w:pPr>
       <w:r/>
-      <w:bookmarkStart w:id="49" w:name="_Toc49"/>
       <w:r>
         <w:t xml:space="preserve">6.4.3 Heurísticas de Usabilidade</w:t>
       </w:r>
-      <w:bookmarkEnd w:id="49"/>
+      <w:r/>
       <w:r/>
       <w:r/>
     </w:p>
@@ -24971,6 +24743,7 @@
         <w:ind/>
         <w:rPr/>
       </w:pPr>
+      <w:r/>
       <w:r>
         <w:t xml:space="preserve">FIGURA </w:t>
       </w:r>
@@ -24992,6 +24765,8 @@
       <w:r>
         <w:t xml:space="preserve"> – Tela inicial: estado das ocorrências em cor e rótulo, protocolo e categorias em linguagem corrente</w:t>
       </w:r>
+      <w:r/>
+      <w:r/>
       <w:r/>
     </w:p>
     <w:p>
@@ -25121,6 +24896,7 @@
         <w:ind/>
         <w:rPr/>
       </w:pPr>
+      <w:r/>
       <w:r>
         <w:t xml:space="preserve">FIGURA </w:t>
       </w:r>
@@ -25142,6 +24918,8 @@
       <w:r>
         <w:t xml:space="preserve"> – Registro de ocorrência: campos obrigatórios, exemplos de preenchimento e marcação do local no mapa</w:t>
       </w:r>
+      <w:r/>
+      <w:r/>
       <w:r/>
     </w:p>
     <w:p>
@@ -25264,6 +25042,7 @@
         <w:ind/>
         <w:rPr/>
       </w:pPr>
+      <w:r/>
       <w:r>
         <w:t xml:space="preserve">FIGURA </w:t>
       </w:r>
@@ -25285,6 +25064,8 @@
       <w:r>
         <w:t xml:space="preserve"> – Administração de contas: busca, filtros combináveis e alteração de perfil na própria linha</w:t>
       </w:r>
+      <w:r/>
+      <w:r/>
       <w:r/>
     </w:p>
     <w:p>
@@ -25407,6 +25188,7 @@
         <w:ind/>
         <w:rPr/>
       </w:pPr>
+      <w:r/>
       <w:r>
         <w:t xml:space="preserve">FIGURA </w:t>
       </w:r>
@@ -25428,6 +25210,8 @@
       <w:r>
         <w:t xml:space="preserve"> – Tela inicial do visitante: seletor de município, mapa e indicadores do território em exibição</w:t>
       </w:r>
+      <w:r/>
+      <w:r/>
       <w:r/>
     </w:p>
     <w:p>
@@ -25550,6 +25334,7 @@
         <w:ind/>
         <w:rPr/>
       </w:pPr>
+      <w:r/>
       <w:r>
         <w:t xml:space="preserve">FIGURA </w:t>
       </w:r>
@@ -25571,6 +25356,8 @@
       <w:r>
         <w:t xml:space="preserve"> – Registro de ocorrência: endereço a partir do mapa, desfoque das fotografias e registro anônimo</w:t>
       </w:r>
+      <w:r/>
+      <w:r/>
       <w:r/>
     </w:p>
     <w:p>
@@ -25693,6 +25480,7 @@
         <w:ind/>
         <w:rPr/>
       </w:pPr>
+      <w:r/>
       <w:r>
         <w:t xml:space="preserve">FIGURA </w:t>
       </w:r>
@@ -25714,6 +25502,8 @@
       <w:r>
         <w:t xml:space="preserve"> – Detalhe da ocorrência: histórico dos trâmites, resposta ao cidadão e ações de tratamento</w:t>
       </w:r>
+      <w:r/>
+      <w:r/>
       <w:r/>
     </w:p>
     <w:p>
@@ -25836,6 +25626,7 @@
         <w:ind/>
         <w:rPr/>
       </w:pPr>
+      <w:r/>
       <w:r>
         <w:t xml:space="preserve">FIGURA </w:t>
       </w:r>
@@ -25857,6 +25648,8 @@
       <w:r>
         <w:t xml:space="preserve"> – Cadastro de contas: município condicionado à unidade da federação e perfis conforme quem cadastra</w:t>
       </w:r>
+      <w:r/>
+      <w:r/>
       <w:r/>
     </w:p>
     <w:p>
@@ -25993,6 +25786,7 @@
           <w:highlight w:val="none"/>
         </w:rPr>
       </w:pPr>
+      <w:r/>
       <w:r>
         <w:t xml:space="preserve">FIGURA </w:t>
       </w:r>
@@ -26014,11 +25808,8 @@
       <w:r>
         <w:t xml:space="preserve"> – Central de Ajuda: perguntas frequentes e canal de contato com a administração</w:t>
       </w:r>
-      <w:r>
-        <w:rPr>
-          <w:highlight w:val="none"/>
-        </w:rPr>
-      </w:r>
+      <w:r/>
+      <w:r/>
       <w:r>
         <w:rPr>
           <w:highlight w:val="none"/>
@@ -26162,6 +25953,7 @@
         <w:ind/>
         <w:rPr/>
       </w:pPr>
+      <w:r/>
       <w:r>
         <w:t xml:space="preserve">FIGURA </w:t>
       </w:r>
@@ -26183,6 +25975,8 @@
       <w:r>
         <w:t xml:space="preserve"> – Recuperar senha: envio do código por correio eletrônico e retorno à tela de entrada</w:t>
       </w:r>
+      <w:r/>
+      <w:r/>
       <w:r/>
     </w:p>
     <w:p>
@@ -26319,6 +26113,7 @@
         <w:ind/>
         <w:rPr/>
       </w:pPr>
+      <w:r/>
       <w:r>
         <w:t xml:space="preserve">FIGURA </w:t>
       </w:r>
@@ -26340,6 +26135,8 @@
       <w:r>
         <w:t xml:space="preserve"> – Estatísticas: carga do período, fila de espera e hierarquia sem ornamento</w:t>
       </w:r>
+      <w:r/>
+      <w:r/>
       <w:r/>
     </w:p>
     <w:p>
@@ -26477,7 +26274,7 @@
         <w:rPr/>
       </w:pPr>
       <w:r/>
-      <w:bookmarkStart w:id="900" w:name="_TocFig19"/>
+      <w:r/>
       <w:r>
         <w:t xml:space="preserve">FIGURA </w:t>
       </w:r>
@@ -26499,7 +26296,7 @@
       <w:r>
         <w:t xml:space="preserve"> – Minha Conta: dados pessoais, troca de senha, verificação em duas etapas e exclusão da conta</w:t>
       </w:r>
-      <w:bookmarkEnd w:id="900"/>
+      <w:r/>
       <w:r/>
       <w:r/>
     </w:p>
@@ -26536,11 +26333,10 @@
         <w:rPr/>
       </w:pPr>
       <w:r/>
-      <w:bookmarkStart w:id="50" w:name="_Toc50"/>
       <w:r>
         <w:t xml:space="preserve">6.4.4 Projeto da Acessibilidade</w:t>
       </w:r>
-      <w:bookmarkEnd w:id="50"/>
+      <w:r/>
       <w:r/>
       <w:r/>
     </w:p>
@@ -26674,11 +26470,10 @@
         <w:rPr/>
       </w:pPr>
       <w:r/>
-      <w:bookmarkStart w:id="51" w:name="_Toc51"/>
       <w:r>
         <w:t xml:space="preserve">6.5 PROJETO DO SISTEMA DISTRIBUÍDO</w:t>
       </w:r>
-      <w:bookmarkEnd w:id="51"/>
+      <w:r/>
       <w:r/>
       <w:r/>
     </w:p>
@@ -26767,11 +26562,10 @@
         <w:rPr/>
       </w:pPr>
       <w:r/>
-      <w:bookmarkStart w:id="52" w:name="_Toc52"/>
       <w:r>
         <w:t xml:space="preserve">7 IMPLEMENTAÇÃO DO SISTEMA DE SOFTWARE</w:t>
       </w:r>
-      <w:bookmarkEnd w:id="52"/>
+      <w:r/>
       <w:r/>
       <w:r/>
     </w:p>
@@ -26809,11 +26603,10 @@
         <w:rPr/>
       </w:pPr>
       <w:r/>
-      <w:bookmarkStart w:id="53" w:name="_Toc53"/>
       <w:r>
         <w:t xml:space="preserve">7.1 COMPONENTES DO SISTEMA DE SOFTWARE</w:t>
       </w:r>
-      <w:bookmarkEnd w:id="53"/>
+      <w:r/>
       <w:r/>
       <w:r/>
     </w:p>
@@ -26917,11 +26710,10 @@
         <w:rPr/>
       </w:pPr>
       <w:r/>
-      <w:bookmarkStart w:id="54" w:name="_Toc54"/>
       <w:r>
         <w:t xml:space="preserve">7.2 TECNOLOGIAS DE IMPLEMENTAÇÃO</w:t>
       </w:r>
-      <w:bookmarkEnd w:id="54"/>
+      <w:r/>
       <w:r/>
       <w:r/>
     </w:p>
@@ -26956,11 +26748,10 @@
         <w:rPr/>
       </w:pPr>
       <w:r/>
-      <w:bookmarkStart w:id="55" w:name="_Toc55"/>
       <w:r>
         <w:t xml:space="preserve">7.2.1 Linguagens de Programação e Frameworks Adotados</w:t>
       </w:r>
-      <w:bookmarkEnd w:id="55"/>
+      <w:r/>
       <w:r/>
       <w:r/>
     </w:p>
@@ -27049,11 +26840,10 @@
         <w:rPr/>
       </w:pPr>
       <w:r/>
-      <w:bookmarkStart w:id="56" w:name="_Toc56"/>
       <w:r>
         <w:t xml:space="preserve">7.2.2 Design Patterns Aplicados</w:t>
       </w:r>
-      <w:bookmarkEnd w:id="56"/>
+      <w:r/>
       <w:r/>
       <w:r/>
     </w:p>
@@ -27292,11 +27082,10 @@
         <w:rPr/>
       </w:pPr>
       <w:r/>
-      <w:bookmarkStart w:id="57" w:name="_Toc57"/>
       <w:r>
         <w:t xml:space="preserve">7.2.3 Convenções e Guias para Codificação</w:t>
       </w:r>
-      <w:bookmarkEnd w:id="57"/>
+      <w:r/>
       <w:r/>
       <w:r/>
     </w:p>
@@ -27388,11 +27177,10 @@
         <w:rPr/>
       </w:pPr>
       <w:r/>
-      <w:bookmarkStart w:id="58" w:name="_Toc58"/>
       <w:r>
         <w:t xml:space="preserve">7.2.4 Estrutura Física do Banco de Dados</w:t>
       </w:r>
-      <w:bookmarkEnd w:id="58"/>
+      <w:r/>
       <w:r/>
       <w:r/>
     </w:p>
@@ -27496,11 +27284,10 @@
         <w:rPr/>
       </w:pPr>
       <w:r/>
-      <w:bookmarkStart w:id="59" w:name="_Toc59"/>
       <w:r>
         <w:t xml:space="preserve">7.3 ANÁLISE DE COMPLEXIDADE ALGORÍTMICA</w:t>
       </w:r>
-      <w:bookmarkEnd w:id="59"/>
+      <w:r/>
       <w:r/>
       <w:r/>
     </w:p>
@@ -27734,11 +27521,10 @@
         <w:rPr/>
       </w:pPr>
       <w:r/>
-      <w:bookmarkStart w:id="60" w:name="_Toc60"/>
       <w:r>
         <w:t xml:space="preserve">8 PLANO DE TESTES</w:t>
       </w:r>
-      <w:bookmarkEnd w:id="60"/>
+      <w:r/>
       <w:r/>
       <w:r/>
     </w:p>
@@ -27779,11 +27565,10 @@
         <w:rPr/>
       </w:pPr>
       <w:r/>
-      <w:bookmarkStart w:id="61" w:name="_Toc61"/>
       <w:r>
         <w:t xml:space="preserve">8.1 FINALIDADE</w:t>
       </w:r>
-      <w:bookmarkEnd w:id="61"/>
+      <w:r/>
       <w:r/>
       <w:r/>
     </w:p>
@@ -27869,11 +27654,10 @@
         <w:rPr/>
       </w:pPr>
       <w:r/>
-      <w:bookmarkStart w:id="62" w:name="_Toc62"/>
       <w:r>
         <w:t xml:space="preserve">8.2 ESCOPO</w:t>
       </w:r>
-      <w:bookmarkEnd w:id="62"/>
+      <w:r/>
       <w:r/>
       <w:r/>
     </w:p>
@@ -27908,11 +27692,10 @@
         <w:rPr/>
       </w:pPr>
       <w:r/>
-      <w:bookmarkStart w:id="63" w:name="_Toc63"/>
       <w:r>
         <w:t xml:space="preserve">8.2.1 Referências aos Documentos Relevantes</w:t>
       </w:r>
-      <w:bookmarkEnd w:id="63"/>
+      <w:r/>
       <w:r/>
       <w:r/>
     </w:p>
@@ -28329,6 +28112,8 @@
         <w:ind/>
         <w:rPr/>
       </w:pPr>
+      <w:r/>
+      <w:bookmarkStart w:id="1" w:name="_Toc1"/>
       <w:r>
         <w:t xml:space="preserve">QUADRO </w:t>
       </w:r>
@@ -28351,6 +28136,9 @@
         <w:t xml:space="preserve"> – Documentos relevantes para testes</w:t>
       </w:r>
       <w:r/>
+      <w:bookmarkEnd w:id="1"/>
+      <w:r/>
+      <w:r/>
     </w:p>
     <w:p>
       <w:pPr>
@@ -28371,11 +28159,10 @@
         <w:rPr/>
       </w:pPr>
       <w:r/>
-      <w:bookmarkStart w:id="64" w:name="_Toc64"/>
       <w:r>
         <w:t xml:space="preserve">8.2.2 Ambiente para a Realização dos Testes</w:t>
       </w:r>
-      <w:bookmarkEnd w:id="64"/>
+      <w:r/>
       <w:r/>
       <w:r/>
     </w:p>
@@ -28808,6 +28595,8 @@
         <w:ind/>
         <w:rPr/>
       </w:pPr>
+      <w:r/>
+      <w:bookmarkStart w:id="2" w:name="_Toc2"/>
       <w:r>
         <w:t xml:space="preserve">QUADRO </w:t>
       </w:r>
@@ -28829,6 +28618,9 @@
       <w:r>
         <w:t xml:space="preserve"> – Equipamentos para a realização dos testes</w:t>
       </w:r>
+      <w:r/>
+      <w:bookmarkEnd w:id="2"/>
+      <w:r/>
       <w:r/>
     </w:p>
     <w:p>
@@ -29495,6 +29287,8 @@
         <w:ind/>
         <w:rPr/>
       </w:pPr>
+      <w:r/>
+      <w:bookmarkStart w:id="3" w:name="_Toc3"/>
       <w:r>
         <w:t xml:space="preserve">QUADRO </w:t>
       </w:r>
@@ -29517,6 +29311,9 @@
         <w:t xml:space="preserve"> – Softwares para a realização dos testes</w:t>
       </w:r>
       <w:r/>
+      <w:bookmarkEnd w:id="3"/>
+      <w:r/>
+      <w:r/>
     </w:p>
     <w:p>
       <w:pPr>
@@ -29537,11 +29334,10 @@
         <w:rPr/>
       </w:pPr>
       <w:r/>
-      <w:bookmarkStart w:id="65" w:name="_Toc65"/>
       <w:r>
         <w:t xml:space="preserve">8.3 ESPECIFICAÇÃO DOS CASOS DE TESTES</w:t>
       </w:r>
-      <w:bookmarkEnd w:id="65"/>
+      <w:r/>
       <w:r/>
       <w:r/>
     </w:p>
@@ -29624,11 +29420,10 @@
         <w:rPr/>
       </w:pPr>
       <w:r/>
-      <w:bookmarkStart w:id="66" w:name="_Toc66"/>
       <w:r>
         <w:t xml:space="preserve">8.4 RESULTADOS DOS TESTES</w:t>
       </w:r>
-      <w:bookmarkEnd w:id="66"/>
+      <w:r/>
       <w:r/>
       <w:r/>
     </w:p>
@@ -29772,11 +29567,10 @@
         <w:rPr/>
       </w:pPr>
       <w:r/>
-      <w:bookmarkStart w:id="67" w:name="_Toc67"/>
       <w:r>
         <w:t xml:space="preserve">9 PLANO PARA IMPLANTAÇÃO</w:t>
       </w:r>
-      <w:bookmarkEnd w:id="67"/>
+      <w:r/>
       <w:r/>
       <w:r/>
     </w:p>
@@ -29811,11 +29605,10 @@
         <w:rPr/>
       </w:pPr>
       <w:r/>
-      <w:bookmarkStart w:id="68" w:name="_Toc68"/>
       <w:r>
         <w:t xml:space="preserve">9.1 METODOLOGIA</w:t>
       </w:r>
-      <w:bookmarkEnd w:id="68"/>
+      <w:r/>
       <w:r/>
       <w:r/>
     </w:p>
@@ -29828,11 +29621,10 @@
         <w:rPr/>
       </w:pPr>
       <w:r/>
-      <w:bookmarkStart w:id="69" w:name="_Toc69"/>
       <w:r>
         <w:t xml:space="preserve">9.1.1 Descrição da Metodologia</w:t>
       </w:r>
-      <w:bookmarkEnd w:id="69"/>
+      <w:r/>
       <w:r/>
       <w:r/>
     </w:p>
@@ -29845,11 +29637,10 @@
         <w:rPr/>
       </w:pPr>
       <w:r/>
-      <w:bookmarkStart w:id="70" w:name="_Toc70"/>
       <w:r>
         <w:t xml:space="preserve">9.1.2 Matriz de Responsabilidade</w:t>
       </w:r>
-      <w:bookmarkEnd w:id="70"/>
+      <w:r/>
       <w:r/>
       <w:r/>
     </w:p>
@@ -29862,11 +29653,10 @@
         <w:rPr/>
       </w:pPr>
       <w:r/>
-      <w:bookmarkStart w:id="71" w:name="_Toc71"/>
       <w:r>
         <w:t xml:space="preserve">9.2 TREINAMENTO PREVISTO</w:t>
       </w:r>
-      <w:bookmarkEnd w:id="71"/>
+      <w:r/>
       <w:r/>
       <w:r/>
     </w:p>
@@ -29879,11 +29669,10 @@
         <w:rPr/>
       </w:pPr>
       <w:r/>
-      <w:bookmarkStart w:id="72" w:name="_Toc72"/>
       <w:r>
         <w:t xml:space="preserve">9.3 CRONOGRAMA DE IMPLANTAÇÃO</w:t>
       </w:r>
-      <w:bookmarkEnd w:id="72"/>
+      <w:r/>
       <w:r/>
       <w:r/>
     </w:p>
@@ -29896,11 +29685,10 @@
         <w:rPr/>
       </w:pPr>
       <w:r/>
-      <w:bookmarkStart w:id="73" w:name="_Toc73"/>
       <w:r>
         <w:t xml:space="preserve">9.4 RECURSOS DE APOIO À IMPLANTAÇÃO</w:t>
       </w:r>
-      <w:bookmarkEnd w:id="73"/>
+      <w:r/>
       <w:r/>
       <w:r/>
     </w:p>
@@ -29913,11 +29701,10 @@
         <w:rPr/>
       </w:pPr>
       <w:r/>
-      <w:bookmarkStart w:id="74" w:name="_Toc74"/>
       <w:r>
         <w:t xml:space="preserve">9.5 VISÃO DA IMPLANTAÇÃO</w:t>
       </w:r>
-      <w:bookmarkEnd w:id="74"/>
+      <w:r/>
       <w:r/>
       <w:r/>
     </w:p>
@@ -29941,11 +29728,10 @@
         <w:rPr/>
       </w:pPr>
       <w:r/>
-      <w:bookmarkStart w:id="75" w:name="_Toc75"/>
       <w:r>
         <w:t xml:space="preserve">10 CONCLUSÃO</w:t>
       </w:r>
-      <w:bookmarkEnd w:id="75"/>
+      <w:r/>
       <w:r/>
       <w:r/>
     </w:p>
@@ -30283,11 +30069,10 @@
         <w:rPr/>
       </w:pPr>
       <w:r/>
-      <w:bookmarkStart w:id="76" w:name="_Toc76"/>
       <w:r>
         <w:t xml:space="preserve">REFERÊNCIAS</w:t>
       </w:r>
-      <w:bookmarkEnd w:id="76"/>
+      <w:r/>
       <w:r/>
       <w:r/>
     </w:p>
@@ -30628,14 +30413,13 @@
         <w:rPr/>
       </w:pPr>
       <w:r/>
-      <w:bookmarkStart w:id="77" w:name="_Toc77"/>
       <w:r>
         <w:br w:type="page" w:clear="all"/>
       </w:r>
       <w:r>
         <w:t xml:space="preserve">OBRAS CONSULTADAS </w:t>
       </w:r>
-      <w:bookmarkEnd w:id="77"/>
+      <w:r/>
       <w:r/>
       <w:r/>
     </w:p>
@@ -30755,11 +30539,10 @@
         <w:rPr/>
       </w:pPr>
       <w:r/>
-      <w:bookmarkStart w:id="78" w:name="_Toc78"/>
       <w:r>
         <w:t xml:space="preserve">APÊNDICE A – GESTÃO DO PROJETO</w:t>
       </w:r>
-      <w:bookmarkEnd w:id="78"/>
+      <w:r/>
       <w:r/>
       <w:r/>
     </w:p>
@@ -30791,11 +30574,10 @@
         <w:rPr/>
       </w:pPr>
       <w:r/>
-      <w:bookmarkStart w:id="79" w:name="_Toc79"/>
       <w:r>
         <w:t xml:space="preserve">APÊNDICE B – RELATÓRIO DE DESEMPENHO</w:t>
       </w:r>
-      <w:bookmarkEnd w:id="79"/>
+      <w:r/>
       <w:r/>
       <w:r/>
     </w:p>
@@ -30827,11 +30609,10 @@
         <w:rPr/>
       </w:pPr>
       <w:r/>
-      <w:bookmarkStart w:id="80" w:name="_Toc80"/>
       <w:r>
         <w:t xml:space="preserve">APÊNDICE C – VISÃO FUNCIONAL</w:t>
       </w:r>
-      <w:bookmarkEnd w:id="80"/>
+      <w:r/>
       <w:r/>
       <w:r/>
     </w:p>
@@ -30863,11 +30644,10 @@
         <w:rPr/>
       </w:pPr>
       <w:r/>
-      <w:bookmarkStart w:id="81" w:name="_Toc81"/>
       <w:r>
         <w:t xml:space="preserve">APÊNDICE D – VISÃO DOS DADOS</w:t>
       </w:r>
-      <w:bookmarkEnd w:id="81"/>
+      <w:r/>
       <w:r/>
       <w:r/>
     </w:p>
@@ -30912,11 +30692,10 @@
         <w:rPr/>
       </w:pPr>
       <w:r/>
-      <w:bookmarkStart w:id="82" w:name="_Toc82"/>
       <w:r>
         <w:t xml:space="preserve">APÊNDICE E – MODELO INICIAL DA INTERFACE DE USUÁRIO</w:t>
       </w:r>
-      <w:bookmarkEnd w:id="82"/>
+      <w:r/>
       <w:r/>
       <w:r/>
     </w:p>
@@ -30970,11 +30749,10 @@
         <w:rPr/>
       </w:pPr>
       <w:r/>
-      <w:bookmarkStart w:id="83" w:name="_Toc83"/>
       <w:r>
         <w:t xml:space="preserve">APÊNDICE F – VISÕES ESTRUTURAL E COMPORTAMENTAL</w:t>
       </w:r>
-      <w:bookmarkEnd w:id="83"/>
+      <w:r/>
       <w:r/>
       <w:r/>
     </w:p>
@@ -31044,11 +30822,10 @@
         <w:rPr/>
       </w:pPr>
       <w:r/>
-      <w:bookmarkStart w:id="84" w:name="_Toc84"/>
       <w:r>
         <w:t xml:space="preserve">APÊNDICE G – ENTREVISTAS COM USUÁRIOS</w:t>
       </w:r>
-      <w:bookmarkEnd w:id="84"/>
+      <w:r/>
       <w:r/>
       <w:r/>
     </w:p>
@@ -31091,11 +30868,10 @@
         <w:rPr/>
       </w:pPr>
       <w:r/>
-      <w:bookmarkStart w:id="85" w:name="_Toc85"/>
       <w:r>
         <w:t xml:space="preserve">APÊNDICE H – MODELO DE NEGÓCIO</w:t>
       </w:r>
-      <w:bookmarkEnd w:id="85"/>
+      <w:r/>
       <w:r/>
       <w:r/>
     </w:p>
@@ -31134,11 +30910,10 @@
         <w:rPr/>
       </w:pPr>
       <w:r/>
-      <w:bookmarkStart w:id="86" w:name="_Toc86"/>
       <w:r>
         <w:t xml:space="preserve">APÊNDICE I – PROJETO DO SISTEMA DISTRIBUÍDO</w:t>
       </w:r>
-      <w:bookmarkEnd w:id="86"/>
+      <w:r/>
       <w:r/>
       <w:r/>
     </w:p>
@@ -31174,11 +30949,10 @@
         <w:rPr/>
       </w:pPr>
       <w:r/>
-      <w:bookmarkStart w:id="87" w:name="_Toc87"/>
       <w:r>
         <w:t xml:space="preserve">APÊNDICE J – CASOS DE TESTES</w:t>
       </w:r>
-      <w:bookmarkEnd w:id="87"/>
+      <w:r/>
       <w:r/>
       <w:r/>
     </w:p>
@@ -31217,11 +30991,10 @@
         <w:rPr/>
       </w:pPr>
       <w:r/>
-      <w:bookmarkStart w:id="88" w:name="_Toc88"/>
       <w:r>
         <w:t xml:space="preserve">APÊNDICE K – RECURSOS DE APOIO À IMPLANTAÇÃO</w:t>
       </w:r>
-      <w:bookmarkEnd w:id="88"/>
+      <w:r/>
       <w:r/>
       <w:r/>
     </w:p>
@@ -31247,11 +31020,10 @@
         <w:rPr/>
       </w:pPr>
       <w:r/>
-      <w:bookmarkStart w:id="89" w:name="_Toc89"/>
       <w:r>
         <w:t xml:space="preserve">APÊNDICE L – EXTENSÃO À COMUNIDADE</w:t>
       </w:r>
-      <w:bookmarkEnd w:id="89"/>
+      <w:r/>
       <w:r/>
       <w:r/>
     </w:p>

</xml_diff>